<commit_message>
Lab 3 Assignment Completion
</commit_message>
<xml_diff>
--- a/Week 3/Measurement of Pi and Density (DROPBOX).docx
+++ b/Week 3/Measurement of Pi and Density (DROPBOX).docx
@@ -172,7 +172,7 @@
     </w:p>
     <w:tbl>
       <w:tblPr>
-        <w:tblW w:w="10340" w:type="dxa"/>
+        <w:tblW w:w="10666" w:type="dxa"/>
         <w:tblLook w:val="04A0" w:firstRow="1" w:lastRow="0" w:firstColumn="1" w:lastColumn="0" w:noHBand="0" w:noVBand="1"/>
       </w:tblPr>
       <w:tblGrid>
@@ -191,7 +191,7 @@
         </w:trPr>
         <w:tc>
           <w:tcPr>
-            <w:tcW w:w="480" w:type="dxa"/>
+            <w:tcW w:w="600" w:type="dxa"/>
             <w:tcBorders>
               <w:top w:val="single" w:sz="4" w:space="0" w:color="auto"/>
               <w:left w:val="single" w:sz="4" w:space="0" w:color="auto"/>
@@ -205,7 +205,7 @@
           </w:tcPr>
           <w:p>
             <w:pPr>
-              <w:spacing w:after="0" w:line="480" w:lineRule="auto"/>
+              <w:spacing w:after="0" w:line="240" w:lineRule="auto"/>
               <w:jc w:val="center"/>
               <w:rPr>
                 <w:rFonts w:ascii="Aptos Narrow" w:eastAsia="Times New Roman" w:hAnsi="Aptos Narrow" w:cs="Times New Roman"/>
@@ -231,7 +231,7 @@
         </w:tc>
         <w:tc>
           <w:tcPr>
-            <w:tcW w:w="1860" w:type="dxa"/>
+            <w:tcW w:w="2008" w:type="dxa"/>
             <w:tcBorders>
               <w:top w:val="single" w:sz="4" w:space="0" w:color="auto"/>
               <w:left w:val="nil"/>
@@ -245,7 +245,7 @@
           </w:tcPr>
           <w:p>
             <w:pPr>
-              <w:spacing w:after="0" w:line="480" w:lineRule="auto"/>
+              <w:spacing w:after="0" w:line="240" w:lineRule="auto"/>
               <w:jc w:val="center"/>
               <w:rPr>
                 <w:rFonts w:ascii="Aptos Narrow" w:eastAsia="Times New Roman" w:hAnsi="Aptos Narrow" w:cs="Times New Roman"/>
@@ -289,7 +289,7 @@
           </w:tcPr>
           <w:p>
             <w:pPr>
-              <w:spacing w:after="0" w:line="480" w:lineRule="auto"/>
+              <w:spacing w:after="0" w:line="240" w:lineRule="auto"/>
               <w:jc w:val="center"/>
               <w:rPr>
                 <w:rFonts w:ascii="Aptos Narrow" w:eastAsia="Times New Roman" w:hAnsi="Aptos Narrow" w:cs="Times New Roman"/>
@@ -333,7 +333,7 @@
           </w:tcPr>
           <w:p>
             <w:pPr>
-              <w:spacing w:after="0" w:line="480" w:lineRule="auto"/>
+              <w:spacing w:after="0" w:line="240" w:lineRule="auto"/>
               <w:jc w:val="center"/>
               <w:rPr>
                 <w:rFonts w:ascii="Aptos Narrow" w:eastAsia="Times New Roman" w:hAnsi="Aptos Narrow" w:cs="Times New Roman"/>
@@ -377,7 +377,7 @@
           </w:tcPr>
           <w:p>
             <w:pPr>
-              <w:spacing w:after="0" w:line="480" w:lineRule="auto"/>
+              <w:spacing w:after="0" w:line="240" w:lineRule="auto"/>
               <w:jc w:val="center"/>
               <w:rPr>
                 <w:rFonts w:ascii="Aptos Narrow" w:eastAsia="Times New Roman" w:hAnsi="Aptos Narrow" w:cs="Times New Roman"/>
@@ -407,7 +407,7 @@
         </w:tc>
         <w:tc>
           <w:tcPr>
-            <w:tcW w:w="1360" w:type="dxa"/>
+            <w:tcW w:w="1389" w:type="dxa"/>
             <w:tcBorders>
               <w:top w:val="single" w:sz="4" w:space="0" w:color="auto"/>
               <w:left w:val="nil"/>
@@ -421,7 +421,7 @@
           </w:tcPr>
           <w:p>
             <w:pPr>
-              <w:spacing w:after="0" w:line="480" w:lineRule="auto"/>
+              <w:spacing w:after="0" w:line="240" w:lineRule="auto"/>
               <w:jc w:val="center"/>
               <w:rPr>
                 <w:rFonts w:ascii="Aptos Narrow" w:eastAsia="Times New Roman" w:hAnsi="Aptos Narrow" w:cs="Times New Roman"/>
@@ -451,7 +451,7 @@
         </w:tc>
         <w:tc>
           <w:tcPr>
-            <w:tcW w:w="1360" w:type="dxa"/>
+            <w:tcW w:w="1389" w:type="dxa"/>
             <w:tcBorders>
               <w:top w:val="single" w:sz="4" w:space="0" w:color="auto"/>
               <w:left w:val="nil"/>
@@ -465,7 +465,7 @@
           </w:tcPr>
           <w:p>
             <w:pPr>
-              <w:spacing w:after="0" w:line="480" w:lineRule="auto"/>
+              <w:spacing w:after="0" w:line="240" w:lineRule="auto"/>
               <w:jc w:val="center"/>
               <w:rPr>
                 <w:rFonts w:ascii="Aptos Narrow" w:eastAsia="Times New Roman" w:hAnsi="Aptos Narrow" w:cs="Times New Roman"/>
@@ -509,7 +509,7 @@
           </w:tcPr>
           <w:p>
             <w:pPr>
-              <w:spacing w:after="0" w:line="480" w:lineRule="auto"/>
+              <w:spacing w:after="0" w:line="240" w:lineRule="auto"/>
               <w:jc w:val="center"/>
               <w:rPr>
                 <w:rFonts w:ascii="Aptos Narrow" w:eastAsia="Times New Roman" w:hAnsi="Aptos Narrow" w:cs="Times New Roman"/>
@@ -531,7 +531,7 @@
         </w:trPr>
         <w:tc>
           <w:tcPr>
-            <w:tcW w:w="480" w:type="dxa"/>
+            <w:tcW w:w="600" w:type="dxa"/>
             <w:tcBorders>
               <w:top w:val="nil"/>
               <w:left w:val="single" w:sz="4" w:space="0" w:color="auto"/>
@@ -545,7 +545,7 @@
           </w:tcPr>
           <w:p>
             <w:pPr>
-              <w:spacing w:after="0" w:line="480" w:lineRule="auto"/>
+              <w:spacing w:after="0" w:line="240" w:lineRule="auto"/>
               <w:jc w:val="center"/>
               <w:rPr>
                 <w:rFonts w:ascii="Aptos Narrow" w:eastAsia="Times New Roman" w:hAnsi="Aptos Narrow" w:cs="Times New Roman"/>
@@ -575,7 +575,7 @@
         </w:tc>
         <w:tc>
           <w:tcPr>
-            <w:tcW w:w="1860" w:type="dxa"/>
+            <w:tcW w:w="2008" w:type="dxa"/>
             <w:tcBorders>
               <w:top w:val="nil"/>
               <w:left w:val="nil"/>
@@ -589,7 +589,7 @@
           </w:tcPr>
           <w:p>
             <w:pPr>
-              <w:spacing w:after="0" w:line="480" w:lineRule="auto"/>
+              <w:spacing w:after="0" w:line="240" w:lineRule="auto"/>
               <w:jc w:val="center"/>
               <w:rPr>
                 <w:rFonts w:ascii="Aptos Narrow" w:eastAsia="Times New Roman" w:hAnsi="Aptos Narrow" w:cs="Times New Roman"/>
@@ -629,7 +629,7 @@
           </w:tcPr>
           <w:p>
             <w:pPr>
-              <w:spacing w:after="0" w:line="480" w:lineRule="auto"/>
+              <w:spacing w:after="0" w:line="240" w:lineRule="auto"/>
               <w:jc w:val="center"/>
               <w:rPr>
                 <w:rFonts w:ascii="Aptos Narrow" w:eastAsia="Times New Roman" w:hAnsi="Aptos Narrow" w:cs="Times New Roman"/>
@@ -669,7 +669,7 @@
           </w:tcPr>
           <w:p>
             <w:pPr>
-              <w:spacing w:after="0" w:line="480" w:lineRule="auto"/>
+              <w:spacing w:after="0" w:line="240" w:lineRule="auto"/>
               <w:jc w:val="center"/>
               <w:rPr>
                 <w:rFonts w:ascii="Aptos Narrow" w:eastAsia="Times New Roman" w:hAnsi="Aptos Narrow" w:cs="Times New Roman"/>
@@ -689,7 +689,7 @@
                 <w:szCs w:val="22"/>
                 <w14:ligatures w14:val="none"/>
               </w:rPr>
-              <w:t>177.7</w:t>
+              <w:t>17.77</w:t>
             </w:r>
           </w:p>
         </w:tc>
@@ -709,7 +709,7 @@
           </w:tcPr>
           <w:p>
             <w:pPr>
-              <w:spacing w:after="0" w:line="480" w:lineRule="auto"/>
+              <w:spacing w:after="0" w:line="240" w:lineRule="auto"/>
               <w:jc w:val="center"/>
               <w:rPr>
                 <w:rFonts w:ascii="Aptos Narrow" w:eastAsia="Times New Roman" w:hAnsi="Aptos Narrow" w:cs="Times New Roman"/>
@@ -735,7 +735,7 @@
         </w:tc>
         <w:tc>
           <w:tcPr>
-            <w:tcW w:w="1360" w:type="dxa"/>
+            <w:tcW w:w="1389" w:type="dxa"/>
             <w:tcBorders>
               <w:top w:val="nil"/>
               <w:left w:val="nil"/>
@@ -749,7 +749,7 @@
           </w:tcPr>
           <w:p>
             <w:pPr>
-              <w:spacing w:after="0" w:line="480" w:lineRule="auto"/>
+              <w:spacing w:after="0" w:line="240" w:lineRule="auto"/>
               <w:jc w:val="center"/>
               <w:rPr>
                 <w:rFonts w:ascii="Aptos Narrow" w:eastAsia="Times New Roman" w:hAnsi="Aptos Narrow" w:cs="Times New Roman"/>
@@ -775,7 +775,7 @@
         </w:tc>
         <w:tc>
           <w:tcPr>
-            <w:tcW w:w="1360" w:type="dxa"/>
+            <w:tcW w:w="1389" w:type="dxa"/>
             <w:tcBorders>
               <w:top w:val="nil"/>
               <w:left w:val="nil"/>
@@ -789,7 +789,7 @@
           </w:tcPr>
           <w:p>
             <w:pPr>
-              <w:spacing w:after="0" w:line="480" w:lineRule="auto"/>
+              <w:spacing w:after="0" w:line="240" w:lineRule="auto"/>
               <w:jc w:val="center"/>
               <w:rPr>
                 <w:rFonts w:ascii="Aptos Narrow" w:eastAsia="Times New Roman" w:hAnsi="Aptos Narrow" w:cs="Times New Roman"/>
@@ -829,7 +829,7 @@
           </w:tcPr>
           <w:p>
             <w:pPr>
-              <w:spacing w:after="0" w:line="480" w:lineRule="auto"/>
+              <w:spacing w:after="0" w:line="240" w:lineRule="auto"/>
               <w:jc w:val="center"/>
               <w:rPr>
                 <w:rFonts w:ascii="Aptos Narrow" w:eastAsia="Times New Roman" w:hAnsi="Aptos Narrow" w:cs="Times New Roman"/>
@@ -849,7 +849,7 @@
         </w:trPr>
         <w:tc>
           <w:tcPr>
-            <w:tcW w:w="480" w:type="dxa"/>
+            <w:tcW w:w="600" w:type="dxa"/>
             <w:tcBorders>
               <w:top w:val="nil"/>
               <w:left w:val="single" w:sz="4" w:space="0" w:color="auto"/>
@@ -863,7 +863,7 @@
           </w:tcPr>
           <w:p>
             <w:pPr>
-              <w:spacing w:after="0" w:line="480" w:lineRule="auto"/>
+              <w:spacing w:after="0" w:line="240" w:lineRule="auto"/>
               <w:jc w:val="center"/>
               <w:rPr>
                 <w:rFonts w:ascii="Aptos Narrow" w:eastAsia="Times New Roman" w:hAnsi="Aptos Narrow" w:cs="Times New Roman"/>
@@ -893,7 +893,7 @@
         </w:tc>
         <w:tc>
           <w:tcPr>
-            <w:tcW w:w="1860" w:type="dxa"/>
+            <w:tcW w:w="2008" w:type="dxa"/>
             <w:tcBorders>
               <w:top w:val="nil"/>
               <w:left w:val="nil"/>
@@ -907,7 +907,7 @@
           </w:tcPr>
           <w:p>
             <w:pPr>
-              <w:spacing w:after="0" w:line="480" w:lineRule="auto"/>
+              <w:spacing w:after="0" w:line="240" w:lineRule="auto"/>
               <w:jc w:val="center"/>
               <w:rPr>
                 <w:rFonts w:ascii="Aptos Narrow" w:eastAsia="Times New Roman" w:hAnsi="Aptos Narrow" w:cs="Times New Roman"/>
@@ -947,7 +947,7 @@
           </w:tcPr>
           <w:p>
             <w:pPr>
-              <w:spacing w:after="0" w:line="480" w:lineRule="auto"/>
+              <w:spacing w:after="0" w:line="240" w:lineRule="auto"/>
               <w:jc w:val="center"/>
               <w:rPr>
                 <w:rFonts w:ascii="Aptos Narrow" w:eastAsia="Times New Roman" w:hAnsi="Aptos Narrow" w:cs="Times New Roman"/>
@@ -987,7 +987,7 @@
           </w:tcPr>
           <w:p>
             <w:pPr>
-              <w:spacing w:after="0" w:line="480" w:lineRule="auto"/>
+              <w:spacing w:after="0" w:line="240" w:lineRule="auto"/>
               <w:jc w:val="center"/>
               <w:rPr>
                 <w:rFonts w:ascii="Aptos Narrow" w:eastAsia="Times New Roman" w:hAnsi="Aptos Narrow" w:cs="Times New Roman"/>
@@ -1007,7 +1007,7 @@
                 <w:szCs w:val="22"/>
                 <w14:ligatures w14:val="none"/>
               </w:rPr>
-              <w:t>177.7</w:t>
+              <w:t>17.77</w:t>
             </w:r>
           </w:p>
         </w:tc>
@@ -1027,7 +1027,7 @@
           </w:tcPr>
           <w:p>
             <w:pPr>
-              <w:spacing w:after="0" w:line="480" w:lineRule="auto"/>
+              <w:spacing w:after="0" w:line="240" w:lineRule="auto"/>
               <w:jc w:val="center"/>
               <w:rPr>
                 <w:rFonts w:ascii="Aptos Narrow" w:eastAsia="Times New Roman" w:hAnsi="Aptos Narrow" w:cs="Times New Roman"/>
@@ -1053,7 +1053,7 @@
         </w:tc>
         <w:tc>
           <w:tcPr>
-            <w:tcW w:w="1360" w:type="dxa"/>
+            <w:tcW w:w="1389" w:type="dxa"/>
             <w:tcBorders>
               <w:top w:val="nil"/>
               <w:left w:val="nil"/>
@@ -1067,7 +1067,7 @@
           </w:tcPr>
           <w:p>
             <w:pPr>
-              <w:spacing w:after="0" w:line="480" w:lineRule="auto"/>
+              <w:spacing w:after="0" w:line="240" w:lineRule="auto"/>
               <w:jc w:val="center"/>
               <w:rPr>
                 <w:rFonts w:ascii="Aptos Narrow" w:eastAsia="Times New Roman" w:hAnsi="Aptos Narrow" w:cs="Times New Roman"/>
@@ -1093,7 +1093,7 @@
         </w:tc>
         <w:tc>
           <w:tcPr>
-            <w:tcW w:w="1360" w:type="dxa"/>
+            <w:tcW w:w="1389" w:type="dxa"/>
             <w:tcBorders>
               <w:top w:val="nil"/>
               <w:left w:val="nil"/>
@@ -1107,7 +1107,7 @@
           </w:tcPr>
           <w:p>
             <w:pPr>
-              <w:spacing w:after="0" w:line="480" w:lineRule="auto"/>
+              <w:spacing w:after="0" w:line="240" w:lineRule="auto"/>
               <w:jc w:val="center"/>
               <w:rPr>
                 <w:rFonts w:ascii="Aptos Narrow" w:eastAsia="Times New Roman" w:hAnsi="Aptos Narrow" w:cs="Times New Roman"/>
@@ -1147,7 +1147,7 @@
           </w:tcPr>
           <w:p>
             <w:pPr>
-              <w:spacing w:after="0" w:line="480" w:lineRule="auto"/>
+              <w:spacing w:after="0" w:line="240" w:lineRule="auto"/>
               <w:jc w:val="center"/>
               <w:rPr>
                 <w:rFonts w:ascii="Aptos Narrow" w:eastAsia="Times New Roman" w:hAnsi="Aptos Narrow" w:cs="Times New Roman"/>
@@ -1167,7 +1167,7 @@
         </w:trPr>
         <w:tc>
           <w:tcPr>
-            <w:tcW w:w="480" w:type="dxa"/>
+            <w:tcW w:w="600" w:type="dxa"/>
             <w:tcBorders>
               <w:top w:val="nil"/>
               <w:left w:val="single" w:sz="4" w:space="0" w:color="auto"/>
@@ -1181,7 +1181,7 @@
           </w:tcPr>
           <w:p>
             <w:pPr>
-              <w:spacing w:after="0" w:line="480" w:lineRule="auto"/>
+              <w:spacing w:after="0" w:line="240" w:lineRule="auto"/>
               <w:jc w:val="center"/>
               <w:rPr>
                 <w:rFonts w:ascii="Aptos Narrow" w:eastAsia="Times New Roman" w:hAnsi="Aptos Narrow" w:cs="Times New Roman"/>
@@ -1211,7 +1211,7 @@
         </w:tc>
         <w:tc>
           <w:tcPr>
-            <w:tcW w:w="1860" w:type="dxa"/>
+            <w:tcW w:w="2008" w:type="dxa"/>
             <w:tcBorders>
               <w:top w:val="nil"/>
               <w:left w:val="nil"/>
@@ -1225,7 +1225,7 @@
           </w:tcPr>
           <w:p>
             <w:pPr>
-              <w:spacing w:after="0" w:line="480" w:lineRule="auto"/>
+              <w:spacing w:after="0" w:line="240" w:lineRule="auto"/>
               <w:jc w:val="center"/>
               <w:rPr>
                 <w:rFonts w:ascii="Aptos Narrow" w:eastAsia="Times New Roman" w:hAnsi="Aptos Narrow" w:cs="Times New Roman"/>
@@ -1265,7 +1265,7 @@
           </w:tcPr>
           <w:p>
             <w:pPr>
-              <w:spacing w:after="0" w:line="480" w:lineRule="auto"/>
+              <w:spacing w:after="0" w:line="240" w:lineRule="auto"/>
               <w:jc w:val="center"/>
               <w:rPr>
                 <w:rFonts w:ascii="Aptos Narrow" w:eastAsia="Times New Roman" w:hAnsi="Aptos Narrow" w:cs="Times New Roman"/>
@@ -1305,7 +1305,7 @@
           </w:tcPr>
           <w:p>
             <w:pPr>
-              <w:spacing w:after="0" w:line="480" w:lineRule="auto"/>
+              <w:spacing w:after="0" w:line="240" w:lineRule="auto"/>
               <w:jc w:val="center"/>
               <w:rPr>
                 <w:rFonts w:ascii="Aptos Narrow" w:eastAsia="Times New Roman" w:hAnsi="Aptos Narrow" w:cs="Times New Roman"/>
@@ -1325,7 +1325,7 @@
                 <w:szCs w:val="22"/>
                 <w14:ligatures w14:val="none"/>
               </w:rPr>
-              <w:t>177.7</w:t>
+              <w:t>17.77</w:t>
             </w:r>
           </w:p>
         </w:tc>
@@ -1345,7 +1345,7 @@
           </w:tcPr>
           <w:p>
             <w:pPr>
-              <w:spacing w:after="0" w:line="480" w:lineRule="auto"/>
+              <w:spacing w:after="0" w:line="240" w:lineRule="auto"/>
               <w:jc w:val="center"/>
               <w:rPr>
                 <w:rFonts w:ascii="Aptos Narrow" w:eastAsia="Times New Roman" w:hAnsi="Aptos Narrow" w:cs="Times New Roman"/>
@@ -1371,7 +1371,7 @@
         </w:tc>
         <w:tc>
           <w:tcPr>
-            <w:tcW w:w="1360" w:type="dxa"/>
+            <w:tcW w:w="1389" w:type="dxa"/>
             <w:tcBorders>
               <w:top w:val="nil"/>
               <w:left w:val="nil"/>
@@ -1385,7 +1385,7 @@
           </w:tcPr>
           <w:p>
             <w:pPr>
-              <w:spacing w:after="0" w:line="480" w:lineRule="auto"/>
+              <w:spacing w:after="0" w:line="240" w:lineRule="auto"/>
               <w:jc w:val="center"/>
               <w:rPr>
                 <w:rFonts w:ascii="Aptos Narrow" w:eastAsia="Times New Roman" w:hAnsi="Aptos Narrow" w:cs="Times New Roman"/>
@@ -1411,7 +1411,7 @@
         </w:tc>
         <w:tc>
           <w:tcPr>
-            <w:tcW w:w="1360" w:type="dxa"/>
+            <w:tcW w:w="1389" w:type="dxa"/>
             <w:tcBorders>
               <w:top w:val="nil"/>
               <w:left w:val="nil"/>
@@ -1425,7 +1425,7 @@
           </w:tcPr>
           <w:p>
             <w:pPr>
-              <w:spacing w:after="0" w:line="480" w:lineRule="auto"/>
+              <w:spacing w:after="0" w:line="240" w:lineRule="auto"/>
               <w:jc w:val="center"/>
               <w:rPr>
                 <w:rFonts w:ascii="Aptos Narrow" w:eastAsia="Times New Roman" w:hAnsi="Aptos Narrow" w:cs="Times New Roman"/>
@@ -1465,7 +1465,7 @@
           </w:tcPr>
           <w:p>
             <w:pPr>
-              <w:spacing w:after="0" w:line="480" w:lineRule="auto"/>
+              <w:spacing w:after="0" w:line="240" w:lineRule="auto"/>
               <w:jc w:val="center"/>
               <w:rPr>
                 <w:rFonts w:ascii="Aptos Narrow" w:eastAsia="Times New Roman" w:hAnsi="Aptos Narrow" w:cs="Times New Roman"/>
@@ -1485,7 +1485,7 @@
         </w:trPr>
         <w:tc>
           <w:tcPr>
-            <w:tcW w:w="480" w:type="dxa"/>
+            <w:tcW w:w="600" w:type="dxa"/>
             <w:tcBorders>
               <w:top w:val="nil"/>
               <w:left w:val="single" w:sz="4" w:space="0" w:color="auto"/>
@@ -1499,7 +1499,7 @@
           </w:tcPr>
           <w:p>
             <w:pPr>
-              <w:spacing w:after="0" w:line="480" w:lineRule="auto"/>
+              <w:spacing w:after="0" w:line="240" w:lineRule="auto"/>
               <w:jc w:val="center"/>
               <w:rPr>
                 <w:rFonts w:ascii="Aptos Narrow" w:eastAsia="Times New Roman" w:hAnsi="Aptos Narrow" w:cs="Times New Roman"/>
@@ -1529,7 +1529,7 @@
         </w:tc>
         <w:tc>
           <w:tcPr>
-            <w:tcW w:w="1860" w:type="dxa"/>
+            <w:tcW w:w="2008" w:type="dxa"/>
             <w:tcBorders>
               <w:top w:val="nil"/>
               <w:left w:val="nil"/>
@@ -1543,7 +1543,7 @@
           </w:tcPr>
           <w:p>
             <w:pPr>
-              <w:spacing w:after="0" w:line="480" w:lineRule="auto"/>
+              <w:spacing w:after="0" w:line="240" w:lineRule="auto"/>
               <w:jc w:val="center"/>
               <w:rPr>
                 <w:rFonts w:ascii="Aptos Narrow" w:eastAsia="Times New Roman" w:hAnsi="Aptos Narrow" w:cs="Times New Roman"/>
@@ -1583,7 +1583,7 @@
           </w:tcPr>
           <w:p>
             <w:pPr>
-              <w:spacing w:after="0" w:line="480" w:lineRule="auto"/>
+              <w:spacing w:after="0" w:line="240" w:lineRule="auto"/>
               <w:jc w:val="center"/>
               <w:rPr>
                 <w:rFonts w:ascii="Aptos Narrow" w:eastAsia="Times New Roman" w:hAnsi="Aptos Narrow" w:cs="Times New Roman"/>
@@ -1623,7 +1623,7 @@
           </w:tcPr>
           <w:p>
             <w:pPr>
-              <w:spacing w:after="0" w:line="480" w:lineRule="auto"/>
+              <w:spacing w:after="0" w:line="240" w:lineRule="auto"/>
               <w:jc w:val="center"/>
               <w:rPr>
                 <w:rFonts w:ascii="Aptos Narrow" w:eastAsia="Times New Roman" w:hAnsi="Aptos Narrow" w:cs="Times New Roman"/>
@@ -1643,7 +1643,7 @@
                 <w:szCs w:val="22"/>
                 <w14:ligatures w14:val="none"/>
               </w:rPr>
-              <w:t>177.7</w:t>
+              <w:t>17.77</w:t>
             </w:r>
           </w:p>
         </w:tc>
@@ -1663,7 +1663,7 @@
           </w:tcPr>
           <w:p>
             <w:pPr>
-              <w:spacing w:after="0" w:line="480" w:lineRule="auto"/>
+              <w:spacing w:after="0" w:line="240" w:lineRule="auto"/>
               <w:jc w:val="center"/>
               <w:rPr>
                 <w:rFonts w:ascii="Aptos Narrow" w:eastAsia="Times New Roman" w:hAnsi="Aptos Narrow" w:cs="Times New Roman"/>
@@ -1689,7 +1689,7 @@
         </w:tc>
         <w:tc>
           <w:tcPr>
-            <w:tcW w:w="1360" w:type="dxa"/>
+            <w:tcW w:w="1389" w:type="dxa"/>
             <w:tcBorders>
               <w:top w:val="nil"/>
               <w:left w:val="nil"/>
@@ -1703,7 +1703,7 @@
           </w:tcPr>
           <w:p>
             <w:pPr>
-              <w:spacing w:after="0" w:line="480" w:lineRule="auto"/>
+              <w:spacing w:after="0" w:line="240" w:lineRule="auto"/>
               <w:jc w:val="center"/>
               <w:rPr>
                 <w:rFonts w:ascii="Aptos Narrow" w:eastAsia="Times New Roman" w:hAnsi="Aptos Narrow" w:cs="Times New Roman"/>
@@ -1729,7 +1729,7 @@
         </w:tc>
         <w:tc>
           <w:tcPr>
-            <w:tcW w:w="1360" w:type="dxa"/>
+            <w:tcW w:w="1389" w:type="dxa"/>
             <w:tcBorders>
               <w:top w:val="nil"/>
               <w:left w:val="nil"/>
@@ -1743,7 +1743,7 @@
           </w:tcPr>
           <w:p>
             <w:pPr>
-              <w:spacing w:after="0" w:line="480" w:lineRule="auto"/>
+              <w:spacing w:after="0" w:line="240" w:lineRule="auto"/>
               <w:jc w:val="center"/>
               <w:rPr>
                 <w:rFonts w:ascii="Aptos Narrow" w:eastAsia="Times New Roman" w:hAnsi="Aptos Narrow" w:cs="Times New Roman"/>
@@ -1783,7 +1783,7 @@
           </w:tcPr>
           <w:p>
             <w:pPr>
-              <w:spacing w:after="0" w:line="480" w:lineRule="auto"/>
+              <w:spacing w:after="0" w:line="240" w:lineRule="auto"/>
               <w:jc w:val="center"/>
               <w:rPr>
                 <w:rFonts w:ascii="Aptos Narrow" w:eastAsia="Times New Roman" w:hAnsi="Aptos Narrow" w:cs="Times New Roman"/>
@@ -1803,7 +1803,7 @@
         </w:trPr>
         <w:tc>
           <w:tcPr>
-            <w:tcW w:w="480" w:type="dxa"/>
+            <w:tcW w:w="600" w:type="dxa"/>
             <w:tcBorders>
               <w:top w:val="nil"/>
               <w:left w:val="single" w:sz="4" w:space="0" w:color="auto"/>
@@ -1817,7 +1817,7 @@
           </w:tcPr>
           <w:p>
             <w:pPr>
-              <w:spacing w:after="0" w:line="480" w:lineRule="auto"/>
+              <w:spacing w:after="0" w:line="240" w:lineRule="auto"/>
               <w:jc w:val="center"/>
               <w:rPr>
                 <w:rFonts w:ascii="Aptos Narrow" w:eastAsia="Times New Roman" w:hAnsi="Aptos Narrow" w:cs="Times New Roman"/>
@@ -1847,7 +1847,7 @@
         </w:tc>
         <w:tc>
           <w:tcPr>
-            <w:tcW w:w="1860" w:type="dxa"/>
+            <w:tcW w:w="2008" w:type="dxa"/>
             <w:tcBorders>
               <w:top w:val="nil"/>
               <w:left w:val="nil"/>
@@ -1861,7 +1861,7 @@
           </w:tcPr>
           <w:p>
             <w:pPr>
-              <w:spacing w:after="0" w:line="480" w:lineRule="auto"/>
+              <w:spacing w:after="0" w:line="240" w:lineRule="auto"/>
               <w:jc w:val="center"/>
               <w:rPr>
                 <w:rFonts w:ascii="Aptos Narrow" w:eastAsia="Times New Roman" w:hAnsi="Aptos Narrow" w:cs="Times New Roman"/>
@@ -1901,7 +1901,7 @@
           </w:tcPr>
           <w:p>
             <w:pPr>
-              <w:spacing w:after="0" w:line="480" w:lineRule="auto"/>
+              <w:spacing w:after="0" w:line="240" w:lineRule="auto"/>
               <w:jc w:val="center"/>
               <w:rPr>
                 <w:rFonts w:ascii="Aptos Narrow" w:eastAsia="Times New Roman" w:hAnsi="Aptos Narrow" w:cs="Times New Roman"/>
@@ -1941,7 +1941,7 @@
           </w:tcPr>
           <w:p>
             <w:pPr>
-              <w:spacing w:after="0" w:line="480" w:lineRule="auto"/>
+              <w:spacing w:after="0" w:line="240" w:lineRule="auto"/>
               <w:jc w:val="center"/>
               <w:rPr>
                 <w:rFonts w:ascii="Aptos Narrow" w:eastAsia="Times New Roman" w:hAnsi="Aptos Narrow" w:cs="Times New Roman"/>
@@ -1961,7 +1961,7 @@
                 <w:szCs w:val="22"/>
                 <w14:ligatures w14:val="none"/>
               </w:rPr>
-              <w:t>177.7</w:t>
+              <w:t>17.77</w:t>
             </w:r>
           </w:p>
         </w:tc>
@@ -1981,7 +1981,7 @@
           </w:tcPr>
           <w:p>
             <w:pPr>
-              <w:spacing w:after="0" w:line="480" w:lineRule="auto"/>
+              <w:spacing w:after="0" w:line="240" w:lineRule="auto"/>
               <w:jc w:val="center"/>
               <w:rPr>
                 <w:rFonts w:ascii="Aptos Narrow" w:eastAsia="Times New Roman" w:hAnsi="Aptos Narrow" w:cs="Times New Roman"/>
@@ -2007,7 +2007,7 @@
         </w:tc>
         <w:tc>
           <w:tcPr>
-            <w:tcW w:w="1360" w:type="dxa"/>
+            <w:tcW w:w="1389" w:type="dxa"/>
             <w:tcBorders>
               <w:top w:val="nil"/>
               <w:left w:val="nil"/>
@@ -2021,7 +2021,7 @@
           </w:tcPr>
           <w:p>
             <w:pPr>
-              <w:spacing w:after="0" w:line="480" w:lineRule="auto"/>
+              <w:spacing w:after="0" w:line="240" w:lineRule="auto"/>
               <w:jc w:val="center"/>
               <w:rPr>
                 <w:rFonts w:ascii="Aptos Narrow" w:eastAsia="Times New Roman" w:hAnsi="Aptos Narrow" w:cs="Times New Roman"/>
@@ -2047,7 +2047,7 @@
         </w:tc>
         <w:tc>
           <w:tcPr>
-            <w:tcW w:w="1360" w:type="dxa"/>
+            <w:tcW w:w="1389" w:type="dxa"/>
             <w:tcBorders>
               <w:top w:val="nil"/>
               <w:left w:val="nil"/>
@@ -2061,7 +2061,7 @@
           </w:tcPr>
           <w:p>
             <w:pPr>
-              <w:spacing w:after="0" w:line="480" w:lineRule="auto"/>
+              <w:spacing w:after="0" w:line="240" w:lineRule="auto"/>
               <w:jc w:val="center"/>
               <w:rPr>
                 <w:rFonts w:ascii="Aptos Narrow" w:eastAsia="Times New Roman" w:hAnsi="Aptos Narrow" w:cs="Times New Roman"/>
@@ -2101,7 +2101,7 @@
           </w:tcPr>
           <w:p>
             <w:pPr>
-              <w:spacing w:after="0" w:line="480" w:lineRule="auto"/>
+              <w:spacing w:after="0" w:line="240" w:lineRule="auto"/>
               <w:jc w:val="center"/>
               <w:rPr>
                 <w:rFonts w:ascii="Aptos Narrow" w:eastAsia="Times New Roman" w:hAnsi="Aptos Narrow" w:cs="Times New Roman"/>
@@ -2121,7 +2121,7 @@
         </w:trPr>
         <w:tc>
           <w:tcPr>
-            <w:tcW w:w="480" w:type="dxa"/>
+            <w:tcW w:w="600" w:type="dxa"/>
             <w:tcBorders>
               <w:top w:val="nil"/>
               <w:left w:val="single" w:sz="4" w:space="0" w:color="auto"/>
@@ -2135,7 +2135,7 @@
           </w:tcPr>
           <w:p>
             <w:pPr>
-              <w:spacing w:after="0" w:line="480" w:lineRule="auto"/>
+              <w:spacing w:after="0" w:line="240" w:lineRule="auto"/>
               <w:jc w:val="center"/>
               <w:rPr>
                 <w:rFonts w:ascii="Aptos Narrow" w:eastAsia="Times New Roman" w:hAnsi="Aptos Narrow" w:cs="Times New Roman"/>
@@ -2161,7 +2161,7 @@
         </w:tc>
         <w:tc>
           <w:tcPr>
-            <w:tcW w:w="1860" w:type="dxa"/>
+            <w:tcW w:w="2008" w:type="dxa"/>
             <w:tcBorders>
               <w:top w:val="nil"/>
               <w:left w:val="nil"/>
@@ -2175,7 +2175,7 @@
           </w:tcPr>
           <w:p>
             <w:pPr>
-              <w:spacing w:after="0" w:line="480" w:lineRule="auto"/>
+              <w:spacing w:after="0" w:line="240" w:lineRule="auto"/>
               <w:jc w:val="center"/>
               <w:rPr>
                 <w:rFonts w:ascii="Aptos Narrow" w:eastAsia="Times New Roman" w:hAnsi="Aptos Narrow" w:cs="Times New Roman"/>
@@ -2219,7 +2219,7 @@
           </w:tcPr>
           <w:p>
             <w:pPr>
-              <w:spacing w:after="0" w:line="480" w:lineRule="auto"/>
+              <w:spacing w:after="0" w:line="240" w:lineRule="auto"/>
               <w:jc w:val="center"/>
               <w:rPr>
                 <w:rFonts w:ascii="Aptos Narrow" w:eastAsia="Times New Roman" w:hAnsi="Aptos Narrow" w:cs="Times New Roman"/>
@@ -2263,7 +2263,7 @@
           </w:tcPr>
           <w:p>
             <w:pPr>
-              <w:spacing w:after="0" w:line="480" w:lineRule="auto"/>
+              <w:spacing w:after="0" w:line="240" w:lineRule="auto"/>
               <w:jc w:val="center"/>
               <w:rPr>
                 <w:rFonts w:ascii="Aptos Narrow" w:eastAsia="Times New Roman" w:hAnsi="Aptos Narrow" w:cs="Times New Roman"/>
@@ -2307,7 +2307,7 @@
           </w:tcPr>
           <w:p>
             <w:pPr>
-              <w:spacing w:after="0" w:line="480" w:lineRule="auto"/>
+              <w:spacing w:after="0" w:line="240" w:lineRule="auto"/>
               <w:jc w:val="center"/>
               <w:rPr>
                 <w:rFonts w:ascii="Aptos Narrow" w:eastAsia="Times New Roman" w:hAnsi="Aptos Narrow" w:cs="Times New Roman"/>
@@ -2337,7 +2337,7 @@
         </w:tc>
         <w:tc>
           <w:tcPr>
-            <w:tcW w:w="1360" w:type="dxa"/>
+            <w:tcW w:w="1389" w:type="dxa"/>
             <w:tcBorders>
               <w:top w:val="nil"/>
               <w:left w:val="nil"/>
@@ -2351,7 +2351,7 @@
           </w:tcPr>
           <w:p>
             <w:pPr>
-              <w:spacing w:after="0" w:line="480" w:lineRule="auto"/>
+              <w:spacing w:after="0" w:line="240" w:lineRule="auto"/>
               <w:jc w:val="center"/>
               <w:rPr>
                 <w:rFonts w:ascii="Aptos Narrow" w:eastAsia="Times New Roman" w:hAnsi="Aptos Narrow" w:cs="Times New Roman"/>
@@ -2381,7 +2381,7 @@
         </w:tc>
         <w:tc>
           <w:tcPr>
-            <w:tcW w:w="1360" w:type="dxa"/>
+            <w:tcW w:w="1389" w:type="dxa"/>
             <w:tcBorders>
               <w:top w:val="nil"/>
               <w:left w:val="nil"/>
@@ -2395,7 +2395,7 @@
           </w:tcPr>
           <w:p>
             <w:pPr>
-              <w:spacing w:after="0" w:line="480" w:lineRule="auto"/>
+              <w:spacing w:after="0" w:line="240" w:lineRule="auto"/>
               <w:jc w:val="center"/>
               <w:rPr>
                 <w:rFonts w:ascii="Aptos Narrow" w:eastAsia="Times New Roman" w:hAnsi="Aptos Narrow" w:cs="Times New Roman"/>
@@ -2439,7 +2439,7 @@
           </w:tcPr>
           <w:p>
             <w:pPr>
-              <w:spacing w:after="0" w:line="480" w:lineRule="auto"/>
+              <w:spacing w:after="0" w:line="240" w:lineRule="auto"/>
               <w:jc w:val="center"/>
               <w:rPr>
                 <w:rFonts w:ascii="Aptos Narrow" w:eastAsia="Times New Roman" w:hAnsi="Aptos Narrow" w:cs="Times New Roman"/>
@@ -2474,7 +2474,7 @@
         </w:trPr>
         <w:tc>
           <w:tcPr>
-            <w:tcW w:w="480" w:type="dxa"/>
+            <w:tcW w:w="600" w:type="dxa"/>
             <w:tcBorders>
               <w:top w:val="nil"/>
               <w:left w:val="single" w:sz="4" w:space="0" w:color="auto"/>
@@ -2488,7 +2488,7 @@
           </w:tcPr>
           <w:p>
             <w:pPr>
-              <w:spacing w:after="0" w:line="480" w:lineRule="auto"/>
+              <w:spacing w:after="0" w:line="240" w:lineRule="auto"/>
               <w:jc w:val="center"/>
               <w:rPr>
                 <w:rFonts w:ascii="Aptos Narrow" w:eastAsia="Times New Roman" w:hAnsi="Aptos Narrow" w:cs="Times New Roman"/>
@@ -2518,7 +2518,7 @@
         </w:tc>
         <w:tc>
           <w:tcPr>
-            <w:tcW w:w="1860" w:type="dxa"/>
+            <w:tcW w:w="2008" w:type="dxa"/>
             <w:tcBorders>
               <w:top w:val="nil"/>
               <w:left w:val="nil"/>
@@ -2532,7 +2532,7 @@
           </w:tcPr>
           <w:p>
             <w:pPr>
-              <w:spacing w:after="0" w:line="480" w:lineRule="auto"/>
+              <w:spacing w:after="0" w:line="240" w:lineRule="auto"/>
               <w:jc w:val="center"/>
               <w:rPr>
                 <w:rFonts w:ascii="Aptos Narrow" w:eastAsia="Times New Roman" w:hAnsi="Aptos Narrow" w:cs="Times New Roman"/>
@@ -2572,7 +2572,7 @@
           </w:tcPr>
           <w:p>
             <w:pPr>
-              <w:spacing w:after="0" w:line="480" w:lineRule="auto"/>
+              <w:spacing w:after="0" w:line="240" w:lineRule="auto"/>
               <w:jc w:val="center"/>
               <w:rPr>
                 <w:rFonts w:ascii="Aptos Narrow" w:eastAsia="Times New Roman" w:hAnsi="Aptos Narrow" w:cs="Times New Roman"/>
@@ -2612,7 +2612,7 @@
           </w:tcPr>
           <w:p>
             <w:pPr>
-              <w:spacing w:after="0" w:line="480" w:lineRule="auto"/>
+              <w:spacing w:after="0" w:line="240" w:lineRule="auto"/>
               <w:jc w:val="center"/>
               <w:rPr>
                 <w:rFonts w:ascii="Aptos Narrow" w:eastAsia="Times New Roman" w:hAnsi="Aptos Narrow" w:cs="Times New Roman"/>
@@ -2632,7 +2632,7 @@
                 <w:szCs w:val="22"/>
                 <w14:ligatures w14:val="none"/>
               </w:rPr>
-              <w:t>0.1777</w:t>
+              <w:t>0.01777</w:t>
             </w:r>
           </w:p>
         </w:tc>
@@ -2652,7 +2652,7 @@
           </w:tcPr>
           <w:p>
             <w:pPr>
-              <w:spacing w:after="0" w:line="480" w:lineRule="auto"/>
+              <w:spacing w:after="0" w:line="240" w:lineRule="auto"/>
               <w:jc w:val="center"/>
               <w:rPr>
                 <w:rFonts w:ascii="Aptos Narrow" w:eastAsia="Times New Roman" w:hAnsi="Aptos Narrow" w:cs="Times New Roman"/>
@@ -2673,6 +2673,84 @@
                 <w14:ligatures w14:val="none"/>
               </w:rPr>
               <w:t>0.0151</w:t>
+            </w:r>
+          </w:p>
+        </w:tc>
+        <w:tc>
+          <w:tcPr>
+            <w:tcW w:w="1389" w:type="dxa"/>
+            <w:tcBorders>
+              <w:top w:val="nil"/>
+              <w:left w:val="nil"/>
+              <w:bottom w:val="single" w:sz="4" w:space="0" w:color="auto"/>
+              <w:right w:val="single" w:sz="4" w:space="0" w:color="auto"/>
+            </w:tcBorders>
+            <w:shd w:val="clear" w:color="auto" w:fill="auto"/>
+            <w:noWrap/>
+            <w:vAlign w:val="bottom"/>
+            <w:hideMark/>
+          </w:tcPr>
+          <w:p>
+            <w:pPr>
+              <w:spacing w:after="0" w:line="240" w:lineRule="auto"/>
+              <w:jc w:val="center"/>
+              <w:rPr>
+                <w:rFonts w:ascii="Aptos Narrow" w:eastAsia="Times New Roman" w:hAnsi="Aptos Narrow" w:cs="Times New Roman"/>
+                <w:color w:val="000000"/>
+                <w:kern w:val="0"/>
+                <w:sz w:val="22"/>
+                <w:szCs w:val="22"/>
+                <w14:ligatures w14:val="none"/>
+              </w:rPr>
+            </w:pPr>
+            <w:r>
+              <w:rPr>
+                <w:rFonts w:ascii="Aptos Narrow" w:eastAsia="Times New Roman" w:hAnsi="Aptos Narrow" w:cs="Times New Roman"/>
+                <w:color w:val="000000"/>
+                <w:kern w:val="0"/>
+                <w:sz w:val="22"/>
+                <w:szCs w:val="22"/>
+                <w14:ligatures w14:val="none"/>
+              </w:rPr>
+              <w:t>3.27</w:t>
+            </w:r>
+          </w:p>
+        </w:tc>
+        <w:tc>
+          <w:tcPr>
+            <w:tcW w:w="1389" w:type="dxa"/>
+            <w:tcBorders>
+              <w:top w:val="nil"/>
+              <w:left w:val="nil"/>
+              <w:bottom w:val="single" w:sz="4" w:space="0" w:color="auto"/>
+              <w:right w:val="single" w:sz="4" w:space="0" w:color="auto"/>
+            </w:tcBorders>
+            <w:shd w:val="clear" w:color="auto" w:fill="auto"/>
+            <w:noWrap/>
+            <w:vAlign w:val="bottom"/>
+            <w:hideMark/>
+          </w:tcPr>
+          <w:p>
+            <w:pPr>
+              <w:spacing w:after="0" w:line="240" w:lineRule="auto"/>
+              <w:jc w:val="center"/>
+              <w:rPr>
+                <w:rFonts w:ascii="Aptos Narrow" w:eastAsia="Times New Roman" w:hAnsi="Aptos Narrow" w:cs="Times New Roman"/>
+                <w:color w:val="000000"/>
+                <w:kern w:val="0"/>
+                <w:sz w:val="22"/>
+                <w:szCs w:val="22"/>
+                <w14:ligatures w14:val="none"/>
+              </w:rPr>
+            </w:pPr>
+            <w:r>
+              <w:rPr>
+                <w:rFonts w:ascii="Aptos Narrow" w:hAnsi="Aptos Narrow"/>
+                <w:color w:val="000000"/>
+                <w:sz w:val="22"/>
+                <w:szCs w:val="22"/>
+              </w:rPr>
+              <w:t>0.000029</w:t>
             </w:r>
           </w:p>
         </w:tc>
@@ -2692,7 +2770,7 @@
           </w:tcPr>
           <w:p>
             <w:pPr>
-              <w:spacing w:after="0" w:line="480" w:lineRule="auto"/>
+              <w:spacing w:after="0" w:line="240" w:lineRule="auto"/>
               <w:jc w:val="center"/>
               <w:rPr>
                 <w:rFonts w:ascii="Aptos Narrow" w:eastAsia="Times New Roman" w:hAnsi="Aptos Narrow" w:cs="Times New Roman"/>
@@ -2705,20 +2783,67 @@
             </w:pPr>
             <w:r>
               <w:rPr>
-                <w:rFonts w:ascii="Aptos Narrow" w:eastAsia="Times New Roman" w:hAnsi="Aptos Narrow" w:cs="Times New Roman"/>
-                <w:color w:val="000000"/>
-                <w:kern w:val="0"/>
-                <w:sz w:val="22"/>
-                <w:szCs w:val="22"/>
-                <w14:ligatures w14:val="none"/>
-              </w:rPr>
-              <w:t>3.27</w:t>
+                <w:rFonts w:ascii="Aptos Narrow" w:hAnsi="Aptos Narrow"/>
+                <w:color w:val="000000"/>
+                <w:sz w:val="22"/>
+                <w:szCs w:val="22"/>
+              </w:rPr>
+              <w:t>520.69</w:t>
+            </w:r>
+          </w:p>
+        </w:tc>
+      </w:tr>
+      <w:tr>
+        <w:trPr>
+          <w:trHeight w:val="288"/>
+        </w:trPr>
+        <w:tc>
+          <w:tcPr>
+            <w:tcW w:w="600" w:type="dxa"/>
+            <w:tcBorders>
+              <w:top w:val="nil"/>
+              <w:left w:val="single" w:sz="4" w:space="0" w:color="auto"/>
+              <w:bottom w:val="single" w:sz="4" w:space="0" w:color="auto"/>
+              <w:right w:val="single" w:sz="4" w:space="0" w:color="auto"/>
+            </w:tcBorders>
+            <w:shd w:val="clear" w:color="auto" w:fill="auto"/>
+            <w:noWrap/>
+            <w:vAlign w:val="bottom"/>
+            <w:hideMark/>
+          </w:tcPr>
+          <w:p>
+            <w:pPr>
+              <w:spacing w:after="0" w:line="240" w:lineRule="auto"/>
+              <w:jc w:val="center"/>
+              <w:rPr>
+                <w:rFonts w:ascii="Aptos Narrow" w:eastAsia="Times New Roman" w:hAnsi="Aptos Narrow" w:cs="Times New Roman"/>
+                <w:b/>
+                <w:bCs/>
+                <w:color w:val="000000"/>
+                <w:kern w:val="0"/>
+                <w:sz w:val="22"/>
+                <w:szCs w:val="22"/>
+                <w14:ligatures w14:val="none"/>
+              </w:rPr>
+            </w:pPr>
+            <w:r>
+              <w:rPr>
+                <w:rFonts w:ascii="Aptos Narrow" w:eastAsia="Times New Roman" w:hAnsi="Aptos Narrow" w:cs="Times New Roman"/>
+                <w:b/>
+                <w:bCs/>
+                <w:color w:val="000000"/>
+                <w:kern w:val="0"/>
+                <w:sz w:val="22"/>
+                <w:szCs w:val="22"/>
+                <w14:ligatures w14:val="none"/>
+              </w:rPr>
+              <w:t>2</w:t>
             </w:r>
           </w:p>
         </w:tc>
         <w:tc>
           <w:tcPr>
-            <w:tcW w:w="1360" w:type="dxa"/>
+            <w:tcW w:w="2008" w:type="dxa"/>
             <w:tcBorders>
               <w:top w:val="nil"/>
               <w:left w:val="nil"/>
@@ -2732,136 +2857,7 @@
           </w:tcPr>
           <w:p>
             <w:pPr>
-              <w:spacing w:after="0" w:line="480" w:lineRule="auto"/>
-              <w:jc w:val="center"/>
-              <w:rPr>
-                <w:rFonts w:ascii="Aptos Narrow" w:eastAsia="Times New Roman" w:hAnsi="Aptos Narrow" w:cs="Times New Roman"/>
-                <w:color w:val="000000"/>
-                <w:kern w:val="0"/>
-                <w:sz w:val="22"/>
-                <w:szCs w:val="22"/>
-                <w14:ligatures w14:val="none"/>
-              </w:rPr>
-            </w:pPr>
-            <w:r>
-              <w:rPr>
-                <w:rFonts w:ascii="Aptos Narrow" w:eastAsia="Times New Roman" w:hAnsi="Aptos Narrow" w:cs="Times New Roman"/>
-                <w:color w:val="000000"/>
-                <w:kern w:val="0"/>
-                <w:sz w:val="22"/>
-                <w:szCs w:val="22"/>
-                <w14:ligatures w14:val="none"/>
-              </w:rPr>
-              <w:t>0.0003</w:t>
-            </w:r>
-          </w:p>
-        </w:tc>
-        <w:tc>
-          <w:tcPr>
-            <w:tcW w:w="1360" w:type="dxa"/>
-            <w:tcBorders>
-              <w:top w:val="nil"/>
-              <w:left w:val="nil"/>
-              <w:bottom w:val="single" w:sz="4" w:space="0" w:color="auto"/>
-              <w:right w:val="single" w:sz="4" w:space="0" w:color="auto"/>
-            </w:tcBorders>
-            <w:shd w:val="clear" w:color="auto" w:fill="auto"/>
-            <w:noWrap/>
-            <w:vAlign w:val="bottom"/>
-            <w:hideMark/>
-          </w:tcPr>
-          <w:p>
-            <w:pPr>
-              <w:spacing w:after="0" w:line="480" w:lineRule="auto"/>
-              <w:jc w:val="center"/>
-              <w:rPr>
-                <w:rFonts w:ascii="Aptos Narrow" w:eastAsia="Times New Roman" w:hAnsi="Aptos Narrow" w:cs="Times New Roman"/>
-                <w:color w:val="000000"/>
-                <w:kern w:val="0"/>
-                <w:sz w:val="22"/>
-                <w:szCs w:val="22"/>
-                <w14:ligatures w14:val="none"/>
-              </w:rPr>
-            </w:pPr>
-            <w:r>
-              <w:rPr>
-                <w:rFonts w:ascii="Aptos Narrow" w:eastAsia="Times New Roman" w:hAnsi="Aptos Narrow" w:cs="Times New Roman"/>
-                <w:color w:val="000000"/>
-                <w:kern w:val="0"/>
-                <w:sz w:val="22"/>
-                <w:szCs w:val="22"/>
-                <w14:ligatures w14:val="none"/>
-              </w:rPr>
-              <w:t>50.33</w:t>
-            </w:r>
-          </w:p>
-        </w:tc>
-      </w:tr>
-      <w:tr>
-        <w:trPr>
-          <w:trHeight w:val="288"/>
-        </w:trPr>
-        <w:tc>
-          <w:tcPr>
-            <w:tcW w:w="480" w:type="dxa"/>
-            <w:tcBorders>
-              <w:top w:val="nil"/>
-              <w:left w:val="single" w:sz="4" w:space="0" w:color="auto"/>
-              <w:bottom w:val="single" w:sz="4" w:space="0" w:color="auto"/>
-              <w:right w:val="single" w:sz="4" w:space="0" w:color="auto"/>
-            </w:tcBorders>
-            <w:shd w:val="clear" w:color="auto" w:fill="auto"/>
-            <w:noWrap/>
-            <w:vAlign w:val="bottom"/>
-            <w:hideMark/>
-          </w:tcPr>
-          <w:p>
-            <w:pPr>
-              <w:spacing w:after="0" w:line="480" w:lineRule="auto"/>
-              <w:jc w:val="center"/>
-              <w:rPr>
-                <w:rFonts w:ascii="Aptos Narrow" w:eastAsia="Times New Roman" w:hAnsi="Aptos Narrow" w:cs="Times New Roman"/>
-                <w:b/>
-                <w:bCs/>
-                <w:color w:val="000000"/>
-                <w:kern w:val="0"/>
-                <w:sz w:val="22"/>
-                <w:szCs w:val="22"/>
-                <w14:ligatures w14:val="none"/>
-              </w:rPr>
-            </w:pPr>
-            <w:r>
-              <w:rPr>
-                <w:rFonts w:ascii="Aptos Narrow" w:eastAsia="Times New Roman" w:hAnsi="Aptos Narrow" w:cs="Times New Roman"/>
-                <w:b/>
-                <w:bCs/>
-                <w:color w:val="000000"/>
-                <w:kern w:val="0"/>
-                <w:sz w:val="22"/>
-                <w:szCs w:val="22"/>
-                <w14:ligatures w14:val="none"/>
-              </w:rPr>
-              <w:t>2</w:t>
-            </w:r>
-          </w:p>
-        </w:tc>
-        <w:tc>
-          <w:tcPr>
-            <w:tcW w:w="1860" w:type="dxa"/>
-            <w:tcBorders>
-              <w:top w:val="nil"/>
-              <w:left w:val="nil"/>
-              <w:bottom w:val="single" w:sz="4" w:space="0" w:color="auto"/>
-              <w:right w:val="single" w:sz="4" w:space="0" w:color="auto"/>
-            </w:tcBorders>
-            <w:shd w:val="clear" w:color="auto" w:fill="auto"/>
-            <w:noWrap/>
-            <w:vAlign w:val="bottom"/>
-            <w:hideMark/>
-          </w:tcPr>
-          <w:p>
-            <w:pPr>
-              <w:spacing w:after="0" w:line="480" w:lineRule="auto"/>
+              <w:spacing w:after="0" w:line="240" w:lineRule="auto"/>
               <w:jc w:val="center"/>
               <w:rPr>
                 <w:rFonts w:ascii="Aptos Narrow" w:eastAsia="Times New Roman" w:hAnsi="Aptos Narrow" w:cs="Times New Roman"/>
@@ -2901,7 +2897,7 @@
           </w:tcPr>
           <w:p>
             <w:pPr>
-              <w:spacing w:after="0" w:line="480" w:lineRule="auto"/>
+              <w:spacing w:after="0" w:line="240" w:lineRule="auto"/>
               <w:jc w:val="center"/>
               <w:rPr>
                 <w:rFonts w:ascii="Aptos Narrow" w:eastAsia="Times New Roman" w:hAnsi="Aptos Narrow" w:cs="Times New Roman"/>
@@ -2941,7 +2937,7 @@
           </w:tcPr>
           <w:p>
             <w:pPr>
-              <w:spacing w:after="0" w:line="480" w:lineRule="auto"/>
+              <w:spacing w:after="0" w:line="240" w:lineRule="auto"/>
               <w:jc w:val="center"/>
               <w:rPr>
                 <w:rFonts w:ascii="Aptos Narrow" w:eastAsia="Times New Roman" w:hAnsi="Aptos Narrow" w:cs="Times New Roman"/>
@@ -2961,7 +2957,7 @@
                 <w:szCs w:val="22"/>
                 <w14:ligatures w14:val="none"/>
               </w:rPr>
-              <w:t>0.1777</w:t>
+              <w:t>0.01777</w:t>
             </w:r>
           </w:p>
         </w:tc>
@@ -2981,7 +2977,7 @@
           </w:tcPr>
           <w:p>
             <w:pPr>
-              <w:spacing w:after="0" w:line="480" w:lineRule="auto"/>
+              <w:spacing w:after="0" w:line="240" w:lineRule="auto"/>
               <w:jc w:val="center"/>
               <w:rPr>
                 <w:rFonts w:ascii="Aptos Narrow" w:eastAsia="Times New Roman" w:hAnsi="Aptos Narrow" w:cs="Times New Roman"/>
@@ -3002,6 +2998,84 @@
                 <w14:ligatures w14:val="none"/>
               </w:rPr>
               <w:t>0.0402</w:t>
+            </w:r>
+          </w:p>
+        </w:tc>
+        <w:tc>
+          <w:tcPr>
+            <w:tcW w:w="1389" w:type="dxa"/>
+            <w:tcBorders>
+              <w:top w:val="nil"/>
+              <w:left w:val="nil"/>
+              <w:bottom w:val="single" w:sz="4" w:space="0" w:color="auto"/>
+              <w:right w:val="single" w:sz="4" w:space="0" w:color="auto"/>
+            </w:tcBorders>
+            <w:shd w:val="clear" w:color="auto" w:fill="auto"/>
+            <w:noWrap/>
+            <w:vAlign w:val="bottom"/>
+            <w:hideMark/>
+          </w:tcPr>
+          <w:p>
+            <w:pPr>
+              <w:spacing w:after="0" w:line="240" w:lineRule="auto"/>
+              <w:jc w:val="center"/>
+              <w:rPr>
+                <w:rFonts w:ascii="Aptos Narrow" w:eastAsia="Times New Roman" w:hAnsi="Aptos Narrow" w:cs="Times New Roman"/>
+                <w:color w:val="000000"/>
+                <w:kern w:val="0"/>
+                <w:sz w:val="22"/>
+                <w:szCs w:val="22"/>
+                <w14:ligatures w14:val="none"/>
+              </w:rPr>
+            </w:pPr>
+            <w:r>
+              <w:rPr>
+                <w:rFonts w:ascii="Aptos Narrow" w:eastAsia="Times New Roman" w:hAnsi="Aptos Narrow" w:cs="Times New Roman"/>
+                <w:color w:val="000000"/>
+                <w:kern w:val="0"/>
+                <w:sz w:val="22"/>
+                <w:szCs w:val="22"/>
+                <w14:ligatures w14:val="none"/>
+              </w:rPr>
+              <w:t>3.21</w:t>
+            </w:r>
+          </w:p>
+        </w:tc>
+        <w:tc>
+          <w:tcPr>
+            <w:tcW w:w="1389" w:type="dxa"/>
+            <w:tcBorders>
+              <w:top w:val="nil"/>
+              <w:left w:val="nil"/>
+              <w:bottom w:val="single" w:sz="4" w:space="0" w:color="auto"/>
+              <w:right w:val="single" w:sz="4" w:space="0" w:color="auto"/>
+            </w:tcBorders>
+            <w:shd w:val="clear" w:color="auto" w:fill="auto"/>
+            <w:noWrap/>
+            <w:vAlign w:val="bottom"/>
+            <w:hideMark/>
+          </w:tcPr>
+          <w:p>
+            <w:pPr>
+              <w:spacing w:after="0" w:line="240" w:lineRule="auto"/>
+              <w:jc w:val="center"/>
+              <w:rPr>
+                <w:rFonts w:ascii="Aptos Narrow" w:eastAsia="Times New Roman" w:hAnsi="Aptos Narrow" w:cs="Times New Roman"/>
+                <w:color w:val="000000"/>
+                <w:kern w:val="0"/>
+                <w:sz w:val="22"/>
+                <w:szCs w:val="22"/>
+                <w14:ligatures w14:val="none"/>
+              </w:rPr>
+            </w:pPr>
+            <w:r>
+              <w:rPr>
+                <w:rFonts w:ascii="Aptos Narrow" w:hAnsi="Aptos Narrow"/>
+                <w:color w:val="000000"/>
+                <w:sz w:val="22"/>
+                <w:szCs w:val="22"/>
+              </w:rPr>
+              <w:t>0.000078</w:t>
             </w:r>
           </w:p>
         </w:tc>
@@ -3021,7 +3095,7 @@
           </w:tcPr>
           <w:p>
             <w:pPr>
-              <w:spacing w:after="0" w:line="480" w:lineRule="auto"/>
+              <w:spacing w:after="0" w:line="240" w:lineRule="auto"/>
               <w:jc w:val="center"/>
               <w:rPr>
                 <w:rFonts w:ascii="Aptos Narrow" w:eastAsia="Times New Roman" w:hAnsi="Aptos Narrow" w:cs="Times New Roman"/>
@@ -3034,20 +3108,67 @@
             </w:pPr>
             <w:r>
               <w:rPr>
-                <w:rFonts w:ascii="Aptos Narrow" w:eastAsia="Times New Roman" w:hAnsi="Aptos Narrow" w:cs="Times New Roman"/>
-                <w:color w:val="000000"/>
-                <w:kern w:val="0"/>
-                <w:sz w:val="22"/>
-                <w:szCs w:val="22"/>
-                <w14:ligatures w14:val="none"/>
-              </w:rPr>
-              <w:t>3.21</w:t>
+                <w:rFonts w:ascii="Aptos Narrow" w:hAnsi="Aptos Narrow"/>
+                <w:color w:val="000000"/>
+                <w:sz w:val="22"/>
+                <w:szCs w:val="22"/>
+              </w:rPr>
+              <w:t>515.38</w:t>
+            </w:r>
+          </w:p>
+        </w:tc>
+      </w:tr>
+      <w:tr>
+        <w:trPr>
+          <w:trHeight w:val="288"/>
+        </w:trPr>
+        <w:tc>
+          <w:tcPr>
+            <w:tcW w:w="600" w:type="dxa"/>
+            <w:tcBorders>
+              <w:top w:val="nil"/>
+              <w:left w:val="single" w:sz="4" w:space="0" w:color="auto"/>
+              <w:bottom w:val="single" w:sz="4" w:space="0" w:color="auto"/>
+              <w:right w:val="single" w:sz="4" w:space="0" w:color="auto"/>
+            </w:tcBorders>
+            <w:shd w:val="clear" w:color="auto" w:fill="auto"/>
+            <w:noWrap/>
+            <w:vAlign w:val="bottom"/>
+            <w:hideMark/>
+          </w:tcPr>
+          <w:p>
+            <w:pPr>
+              <w:spacing w:after="0" w:line="240" w:lineRule="auto"/>
+              <w:jc w:val="center"/>
+              <w:rPr>
+                <w:rFonts w:ascii="Aptos Narrow" w:eastAsia="Times New Roman" w:hAnsi="Aptos Narrow" w:cs="Times New Roman"/>
+                <w:b/>
+                <w:bCs/>
+                <w:color w:val="000000"/>
+                <w:kern w:val="0"/>
+                <w:sz w:val="22"/>
+                <w:szCs w:val="22"/>
+                <w14:ligatures w14:val="none"/>
+              </w:rPr>
+            </w:pPr>
+            <w:r>
+              <w:rPr>
+                <w:rFonts w:ascii="Aptos Narrow" w:eastAsia="Times New Roman" w:hAnsi="Aptos Narrow" w:cs="Times New Roman"/>
+                <w:b/>
+                <w:bCs/>
+                <w:color w:val="000000"/>
+                <w:kern w:val="0"/>
+                <w:sz w:val="22"/>
+                <w:szCs w:val="22"/>
+                <w14:ligatures w14:val="none"/>
+              </w:rPr>
+              <w:t>3</w:t>
             </w:r>
           </w:p>
         </w:tc>
         <w:tc>
           <w:tcPr>
-            <w:tcW w:w="1360" w:type="dxa"/>
+            <w:tcW w:w="2008" w:type="dxa"/>
             <w:tcBorders>
               <w:top w:val="nil"/>
               <w:left w:val="nil"/>
@@ -3061,136 +3182,7 @@
           </w:tcPr>
           <w:p>
             <w:pPr>
-              <w:spacing w:after="0" w:line="480" w:lineRule="auto"/>
-              <w:jc w:val="center"/>
-              <w:rPr>
-                <w:rFonts w:ascii="Aptos Narrow" w:eastAsia="Times New Roman" w:hAnsi="Aptos Narrow" w:cs="Times New Roman"/>
-                <w:color w:val="000000"/>
-                <w:kern w:val="0"/>
-                <w:sz w:val="22"/>
-                <w:szCs w:val="22"/>
-                <w14:ligatures w14:val="none"/>
-              </w:rPr>
-            </w:pPr>
-            <w:r>
-              <w:rPr>
-                <w:rFonts w:ascii="Aptos Narrow" w:eastAsia="Times New Roman" w:hAnsi="Aptos Narrow" w:cs="Times New Roman"/>
-                <w:color w:val="000000"/>
-                <w:kern w:val="0"/>
-                <w:sz w:val="22"/>
-                <w:szCs w:val="22"/>
-                <w14:ligatures w14:val="none"/>
-              </w:rPr>
-              <w:t>0.0008</w:t>
-            </w:r>
-          </w:p>
-        </w:tc>
-        <w:tc>
-          <w:tcPr>
-            <w:tcW w:w="1360" w:type="dxa"/>
-            <w:tcBorders>
-              <w:top w:val="nil"/>
-              <w:left w:val="nil"/>
-              <w:bottom w:val="single" w:sz="4" w:space="0" w:color="auto"/>
-              <w:right w:val="single" w:sz="4" w:space="0" w:color="auto"/>
-            </w:tcBorders>
-            <w:shd w:val="clear" w:color="auto" w:fill="auto"/>
-            <w:noWrap/>
-            <w:vAlign w:val="bottom"/>
-            <w:hideMark/>
-          </w:tcPr>
-          <w:p>
-            <w:pPr>
-              <w:spacing w:after="0" w:line="480" w:lineRule="auto"/>
-              <w:jc w:val="center"/>
-              <w:rPr>
-                <w:rFonts w:ascii="Aptos Narrow" w:eastAsia="Times New Roman" w:hAnsi="Aptos Narrow" w:cs="Times New Roman"/>
-                <w:color w:val="000000"/>
-                <w:kern w:val="0"/>
-                <w:sz w:val="22"/>
-                <w:szCs w:val="22"/>
-                <w14:ligatures w14:val="none"/>
-              </w:rPr>
-            </w:pPr>
-            <w:r>
-              <w:rPr>
-                <w:rFonts w:ascii="Aptos Narrow" w:eastAsia="Times New Roman" w:hAnsi="Aptos Narrow" w:cs="Times New Roman"/>
-                <w:color w:val="000000"/>
-                <w:kern w:val="0"/>
-                <w:sz w:val="22"/>
-                <w:szCs w:val="22"/>
-                <w14:ligatures w14:val="none"/>
-              </w:rPr>
-              <w:t>50.25</w:t>
-            </w:r>
-          </w:p>
-        </w:tc>
-      </w:tr>
-      <w:tr>
-        <w:trPr>
-          <w:trHeight w:val="288"/>
-        </w:trPr>
-        <w:tc>
-          <w:tcPr>
-            <w:tcW w:w="480" w:type="dxa"/>
-            <w:tcBorders>
-              <w:top w:val="nil"/>
-              <w:left w:val="single" w:sz="4" w:space="0" w:color="auto"/>
-              <w:bottom w:val="single" w:sz="4" w:space="0" w:color="auto"/>
-              <w:right w:val="single" w:sz="4" w:space="0" w:color="auto"/>
-            </w:tcBorders>
-            <w:shd w:val="clear" w:color="auto" w:fill="auto"/>
-            <w:noWrap/>
-            <w:vAlign w:val="bottom"/>
-            <w:hideMark/>
-          </w:tcPr>
-          <w:p>
-            <w:pPr>
-              <w:spacing w:after="0" w:line="480" w:lineRule="auto"/>
-              <w:jc w:val="center"/>
-              <w:rPr>
-                <w:rFonts w:ascii="Aptos Narrow" w:eastAsia="Times New Roman" w:hAnsi="Aptos Narrow" w:cs="Times New Roman"/>
-                <w:b/>
-                <w:bCs/>
-                <w:color w:val="000000"/>
-                <w:kern w:val="0"/>
-                <w:sz w:val="22"/>
-                <w:szCs w:val="22"/>
-                <w14:ligatures w14:val="none"/>
-              </w:rPr>
-            </w:pPr>
-            <w:r>
-              <w:rPr>
-                <w:rFonts w:ascii="Aptos Narrow" w:eastAsia="Times New Roman" w:hAnsi="Aptos Narrow" w:cs="Times New Roman"/>
-                <w:b/>
-                <w:bCs/>
-                <w:color w:val="000000"/>
-                <w:kern w:val="0"/>
-                <w:sz w:val="22"/>
-                <w:szCs w:val="22"/>
-                <w14:ligatures w14:val="none"/>
-              </w:rPr>
-              <w:t>3</w:t>
-            </w:r>
-          </w:p>
-        </w:tc>
-        <w:tc>
-          <w:tcPr>
-            <w:tcW w:w="1860" w:type="dxa"/>
-            <w:tcBorders>
-              <w:top w:val="nil"/>
-              <w:left w:val="nil"/>
-              <w:bottom w:val="single" w:sz="4" w:space="0" w:color="auto"/>
-              <w:right w:val="single" w:sz="4" w:space="0" w:color="auto"/>
-            </w:tcBorders>
-            <w:shd w:val="clear" w:color="auto" w:fill="auto"/>
-            <w:noWrap/>
-            <w:vAlign w:val="bottom"/>
-            <w:hideMark/>
-          </w:tcPr>
-          <w:p>
-            <w:pPr>
-              <w:spacing w:after="0" w:line="480" w:lineRule="auto"/>
+              <w:spacing w:after="0" w:line="240" w:lineRule="auto"/>
               <w:jc w:val="center"/>
               <w:rPr>
                 <w:rFonts w:ascii="Aptos Narrow" w:eastAsia="Times New Roman" w:hAnsi="Aptos Narrow" w:cs="Times New Roman"/>
@@ -3230,7 +3222,7 @@
           </w:tcPr>
           <w:p>
             <w:pPr>
-              <w:spacing w:after="0" w:line="480" w:lineRule="auto"/>
+              <w:spacing w:after="0" w:line="240" w:lineRule="auto"/>
               <w:jc w:val="center"/>
               <w:rPr>
                 <w:rFonts w:ascii="Aptos Narrow" w:eastAsia="Times New Roman" w:hAnsi="Aptos Narrow" w:cs="Times New Roman"/>
@@ -3270,7 +3262,7 @@
           </w:tcPr>
           <w:p>
             <w:pPr>
-              <w:spacing w:after="0" w:line="480" w:lineRule="auto"/>
+              <w:spacing w:after="0" w:line="240" w:lineRule="auto"/>
               <w:jc w:val="center"/>
               <w:rPr>
                 <w:rFonts w:ascii="Aptos Narrow" w:eastAsia="Times New Roman" w:hAnsi="Aptos Narrow" w:cs="Times New Roman"/>
@@ -3290,7 +3282,7 @@
                 <w:szCs w:val="22"/>
                 <w14:ligatures w14:val="none"/>
               </w:rPr>
-              <w:t>0.1777</w:t>
+              <w:t>0.01777</w:t>
             </w:r>
           </w:p>
         </w:tc>
@@ -3310,7 +3302,7 @@
           </w:tcPr>
           <w:p>
             <w:pPr>
-              <w:spacing w:after="0" w:line="480" w:lineRule="auto"/>
+              <w:spacing w:after="0" w:line="240" w:lineRule="auto"/>
               <w:jc w:val="center"/>
               <w:rPr>
                 <w:rFonts w:ascii="Aptos Narrow" w:eastAsia="Times New Roman" w:hAnsi="Aptos Narrow" w:cs="Times New Roman"/>
@@ -3331,6 +3323,84 @@
                 <w14:ligatures w14:val="none"/>
               </w:rPr>
               <w:t>0.1049</w:t>
+            </w:r>
+          </w:p>
+        </w:tc>
+        <w:tc>
+          <w:tcPr>
+            <w:tcW w:w="1389" w:type="dxa"/>
+            <w:tcBorders>
+              <w:top w:val="nil"/>
+              <w:left w:val="nil"/>
+              <w:bottom w:val="single" w:sz="4" w:space="0" w:color="auto"/>
+              <w:right w:val="single" w:sz="4" w:space="0" w:color="auto"/>
+            </w:tcBorders>
+            <w:shd w:val="clear" w:color="auto" w:fill="auto"/>
+            <w:noWrap/>
+            <w:vAlign w:val="bottom"/>
+            <w:hideMark/>
+          </w:tcPr>
+          <w:p>
+            <w:pPr>
+              <w:spacing w:after="0" w:line="240" w:lineRule="auto"/>
+              <w:jc w:val="center"/>
+              <w:rPr>
+                <w:rFonts w:ascii="Aptos Narrow" w:eastAsia="Times New Roman" w:hAnsi="Aptos Narrow" w:cs="Times New Roman"/>
+                <w:color w:val="000000"/>
+                <w:kern w:val="0"/>
+                <w:sz w:val="22"/>
+                <w:szCs w:val="22"/>
+                <w14:ligatures w14:val="none"/>
+              </w:rPr>
+            </w:pPr>
+            <w:r>
+              <w:rPr>
+                <w:rFonts w:ascii="Aptos Narrow" w:eastAsia="Times New Roman" w:hAnsi="Aptos Narrow" w:cs="Times New Roman"/>
+                <w:color w:val="000000"/>
+                <w:kern w:val="0"/>
+                <w:sz w:val="22"/>
+                <w:szCs w:val="22"/>
+                <w14:ligatures w14:val="none"/>
+              </w:rPr>
+              <w:t>3.41</w:t>
+            </w:r>
+          </w:p>
+        </w:tc>
+        <w:tc>
+          <w:tcPr>
+            <w:tcW w:w="1389" w:type="dxa"/>
+            <w:tcBorders>
+              <w:top w:val="nil"/>
+              <w:left w:val="nil"/>
+              <w:bottom w:val="single" w:sz="4" w:space="0" w:color="auto"/>
+              <w:right w:val="single" w:sz="4" w:space="0" w:color="auto"/>
+            </w:tcBorders>
+            <w:shd w:val="clear" w:color="auto" w:fill="auto"/>
+            <w:noWrap/>
+            <w:vAlign w:val="bottom"/>
+            <w:hideMark/>
+          </w:tcPr>
+          <w:p>
+            <w:pPr>
+              <w:spacing w:after="0" w:line="240" w:lineRule="auto"/>
+              <w:jc w:val="center"/>
+              <w:rPr>
+                <w:rFonts w:ascii="Aptos Narrow" w:eastAsia="Times New Roman" w:hAnsi="Aptos Narrow" w:cs="Times New Roman"/>
+                <w:color w:val="000000"/>
+                <w:kern w:val="0"/>
+                <w:sz w:val="22"/>
+                <w:szCs w:val="22"/>
+                <w14:ligatures w14:val="none"/>
+              </w:rPr>
+            </w:pPr>
+            <w:r>
+              <w:rPr>
+                <w:rFonts w:ascii="Aptos Narrow" w:hAnsi="Aptos Narrow"/>
+                <w:color w:val="000000"/>
+                <w:sz w:val="22"/>
+                <w:szCs w:val="22"/>
+              </w:rPr>
+              <w:t>0.000165</w:t>
             </w:r>
           </w:p>
         </w:tc>
@@ -3350,7 +3420,7 @@
           </w:tcPr>
           <w:p>
             <w:pPr>
-              <w:spacing w:after="0" w:line="480" w:lineRule="auto"/>
+              <w:spacing w:after="0" w:line="240" w:lineRule="auto"/>
               <w:jc w:val="center"/>
               <w:rPr>
                 <w:rFonts w:ascii="Aptos Narrow" w:eastAsia="Times New Roman" w:hAnsi="Aptos Narrow" w:cs="Times New Roman"/>
@@ -3363,20 +3433,67 @@
             </w:pPr>
             <w:r>
               <w:rPr>
-                <w:rFonts w:ascii="Aptos Narrow" w:eastAsia="Times New Roman" w:hAnsi="Aptos Narrow" w:cs="Times New Roman"/>
-                <w:color w:val="000000"/>
-                <w:kern w:val="0"/>
-                <w:sz w:val="22"/>
-                <w:szCs w:val="22"/>
-                <w14:ligatures w14:val="none"/>
-              </w:rPr>
-              <w:t>3.41</w:t>
+                <w:rFonts w:ascii="Aptos Narrow" w:hAnsi="Aptos Narrow"/>
+                <w:color w:val="000000"/>
+                <w:sz w:val="22"/>
+                <w:szCs w:val="22"/>
+              </w:rPr>
+              <w:t>635.76</w:t>
+            </w:r>
+          </w:p>
+        </w:tc>
+      </w:tr>
+      <w:tr>
+        <w:trPr>
+          <w:trHeight w:val="288"/>
+        </w:trPr>
+        <w:tc>
+          <w:tcPr>
+            <w:tcW w:w="600" w:type="dxa"/>
+            <w:tcBorders>
+              <w:top w:val="nil"/>
+              <w:left w:val="single" w:sz="4" w:space="0" w:color="auto"/>
+              <w:bottom w:val="single" w:sz="4" w:space="0" w:color="auto"/>
+              <w:right w:val="single" w:sz="4" w:space="0" w:color="auto"/>
+            </w:tcBorders>
+            <w:shd w:val="clear" w:color="auto" w:fill="auto"/>
+            <w:noWrap/>
+            <w:vAlign w:val="bottom"/>
+            <w:hideMark/>
+          </w:tcPr>
+          <w:p>
+            <w:pPr>
+              <w:spacing w:after="0" w:line="240" w:lineRule="auto"/>
+              <w:jc w:val="center"/>
+              <w:rPr>
+                <w:rFonts w:ascii="Aptos Narrow" w:eastAsia="Times New Roman" w:hAnsi="Aptos Narrow" w:cs="Times New Roman"/>
+                <w:b/>
+                <w:bCs/>
+                <w:color w:val="000000"/>
+                <w:kern w:val="0"/>
+                <w:sz w:val="22"/>
+                <w:szCs w:val="22"/>
+                <w14:ligatures w14:val="none"/>
+              </w:rPr>
+            </w:pPr>
+            <w:r>
+              <w:rPr>
+                <w:rFonts w:ascii="Aptos Narrow" w:eastAsia="Times New Roman" w:hAnsi="Aptos Narrow" w:cs="Times New Roman"/>
+                <w:b/>
+                <w:bCs/>
+                <w:color w:val="000000"/>
+                <w:kern w:val="0"/>
+                <w:sz w:val="22"/>
+                <w:szCs w:val="22"/>
+                <w14:ligatures w14:val="none"/>
+              </w:rPr>
+              <w:t>4</w:t>
             </w:r>
           </w:p>
         </w:tc>
         <w:tc>
           <w:tcPr>
-            <w:tcW w:w="1360" w:type="dxa"/>
+            <w:tcW w:w="2008" w:type="dxa"/>
             <w:tcBorders>
               <w:top w:val="nil"/>
               <w:left w:val="nil"/>
@@ -3390,138 +3507,7 @@
           </w:tcPr>
           <w:p>
             <w:pPr>
-              <w:spacing w:after="0" w:line="480" w:lineRule="auto"/>
-              <w:jc w:val="center"/>
-              <w:rPr>
-                <w:rFonts w:ascii="Aptos Narrow" w:eastAsia="Times New Roman" w:hAnsi="Aptos Narrow" w:cs="Times New Roman"/>
-                <w:color w:val="000000"/>
-                <w:kern w:val="0"/>
-                <w:sz w:val="22"/>
-                <w:szCs w:val="22"/>
-                <w14:ligatures w14:val="none"/>
-              </w:rPr>
-            </w:pPr>
-            <w:r>
-              <w:rPr>
-                <w:rFonts w:ascii="Aptos Narrow" w:eastAsia="Times New Roman" w:hAnsi="Aptos Narrow" w:cs="Times New Roman"/>
-                <w:color w:val="000000"/>
-                <w:kern w:val="0"/>
-                <w:sz w:val="22"/>
-                <w:szCs w:val="22"/>
-                <w14:ligatures w14:val="none"/>
-              </w:rPr>
-              <w:t>0.0016</w:t>
-            </w:r>
-          </w:p>
-        </w:tc>
-        <w:tc>
-          <w:tcPr>
-            <w:tcW w:w="1360" w:type="dxa"/>
-            <w:tcBorders>
-              <w:top w:val="nil"/>
-              <w:left w:val="nil"/>
-              <w:bottom w:val="single" w:sz="4" w:space="0" w:color="auto"/>
-              <w:right w:val="single" w:sz="4" w:space="0" w:color="auto"/>
-            </w:tcBorders>
-            <w:shd w:val="clear" w:color="auto" w:fill="auto"/>
-            <w:noWrap/>
-            <w:vAlign w:val="bottom"/>
-            <w:hideMark/>
-          </w:tcPr>
-          <w:p>
-            <w:pPr>
-              <w:spacing w:after="0" w:line="480" w:lineRule="auto"/>
-              <w:jc w:val="center"/>
-              <w:rPr>
-                <w:rFonts w:ascii="Aptos Narrow" w:eastAsia="Times New Roman" w:hAnsi="Aptos Narrow" w:cs="Times New Roman"/>
-                <w:iCs/>
-                <w:color w:val="000000"/>
-                <w:kern w:val="0"/>
-                <w:sz w:val="22"/>
-                <w:szCs w:val="22"/>
-                <w14:ligatures w14:val="none"/>
-              </w:rPr>
-            </w:pPr>
-            <w:r>
-              <w:rPr>
-                <w:rFonts w:ascii="Cambria Math" w:eastAsiaTheme="minorEastAsia" w:hAnsi="Cambria Math" w:cs="Times New Roman"/>
-                <w:iCs/>
-                <w:color w:val="000000"/>
-                <w:kern w:val="0"/>
-                <w:sz w:val="22"/>
-                <w:szCs w:val="22"/>
-                <w14:ligatures w14:val="none"/>
-              </w:rPr>
-              <w:t>65.56</w:t>
-            </w:r>
-          </w:p>
-        </w:tc>
-      </w:tr>
-      <w:tr>
-        <w:trPr>
-          <w:trHeight w:val="288"/>
-        </w:trPr>
-        <w:tc>
-          <w:tcPr>
-            <w:tcW w:w="480" w:type="dxa"/>
-            <w:tcBorders>
-              <w:top w:val="nil"/>
-              <w:left w:val="single" w:sz="4" w:space="0" w:color="auto"/>
-              <w:bottom w:val="single" w:sz="4" w:space="0" w:color="auto"/>
-              <w:right w:val="single" w:sz="4" w:space="0" w:color="auto"/>
-            </w:tcBorders>
-            <w:shd w:val="clear" w:color="auto" w:fill="auto"/>
-            <w:noWrap/>
-            <w:vAlign w:val="bottom"/>
-            <w:hideMark/>
-          </w:tcPr>
-          <w:p>
-            <w:pPr>
-              <w:spacing w:after="0" w:line="480" w:lineRule="auto"/>
-              <w:jc w:val="center"/>
-              <w:rPr>
-                <w:rFonts w:ascii="Aptos Narrow" w:eastAsia="Times New Roman" w:hAnsi="Aptos Narrow" w:cs="Times New Roman"/>
-                <w:b/>
-                <w:bCs/>
-                <w:color w:val="000000"/>
-                <w:kern w:val="0"/>
-                <w:sz w:val="22"/>
-                <w:szCs w:val="22"/>
-                <w14:ligatures w14:val="none"/>
-              </w:rPr>
-            </w:pPr>
-            <w:r>
-              <w:rPr>
-                <w:rFonts w:ascii="Aptos Narrow" w:eastAsia="Times New Roman" w:hAnsi="Aptos Narrow" w:cs="Times New Roman"/>
-                <w:b/>
-                <w:bCs/>
-                <w:color w:val="000000"/>
-                <w:kern w:val="0"/>
-                <w:sz w:val="22"/>
-                <w:szCs w:val="22"/>
-                <w14:ligatures w14:val="none"/>
-              </w:rPr>
-              <w:t>4</w:t>
-            </w:r>
-          </w:p>
-        </w:tc>
-        <w:tc>
-          <w:tcPr>
-            <w:tcW w:w="1860" w:type="dxa"/>
-            <w:tcBorders>
-              <w:top w:val="nil"/>
-              <w:left w:val="nil"/>
-              <w:bottom w:val="single" w:sz="4" w:space="0" w:color="auto"/>
-              <w:right w:val="single" w:sz="4" w:space="0" w:color="auto"/>
-            </w:tcBorders>
-            <w:shd w:val="clear" w:color="auto" w:fill="auto"/>
-            <w:noWrap/>
-            <w:vAlign w:val="bottom"/>
-            <w:hideMark/>
-          </w:tcPr>
-          <w:p>
-            <w:pPr>
-              <w:spacing w:after="0" w:line="480" w:lineRule="auto"/>
+              <w:spacing w:after="0" w:line="240" w:lineRule="auto"/>
               <w:jc w:val="center"/>
               <w:rPr>
                 <w:rFonts w:ascii="Aptos Narrow" w:eastAsia="Times New Roman" w:hAnsi="Aptos Narrow" w:cs="Times New Roman"/>
@@ -3561,7 +3547,7 @@
           </w:tcPr>
           <w:p>
             <w:pPr>
-              <w:spacing w:after="0" w:line="480" w:lineRule="auto"/>
+              <w:spacing w:after="0" w:line="240" w:lineRule="auto"/>
               <w:jc w:val="center"/>
               <w:rPr>
                 <w:rFonts w:ascii="Aptos Narrow" w:eastAsia="Times New Roman" w:hAnsi="Aptos Narrow" w:cs="Times New Roman"/>
@@ -3601,7 +3587,7 @@
           </w:tcPr>
           <w:p>
             <w:pPr>
-              <w:spacing w:after="0" w:line="480" w:lineRule="auto"/>
+              <w:spacing w:after="0" w:line="240" w:lineRule="auto"/>
               <w:jc w:val="center"/>
               <w:rPr>
                 <w:rFonts w:ascii="Aptos Narrow" w:eastAsia="Times New Roman" w:hAnsi="Aptos Narrow" w:cs="Times New Roman"/>
@@ -3621,7 +3607,7 @@
                 <w:szCs w:val="22"/>
                 <w14:ligatures w14:val="none"/>
               </w:rPr>
-              <w:t>0.1777</w:t>
+              <w:t>0.01777</w:t>
             </w:r>
           </w:p>
         </w:tc>
@@ -3641,7 +3627,7 @@
           </w:tcPr>
           <w:p>
             <w:pPr>
-              <w:spacing w:after="0" w:line="480" w:lineRule="auto"/>
+              <w:spacing w:after="0" w:line="240" w:lineRule="auto"/>
               <w:jc w:val="center"/>
               <w:rPr>
                 <w:rFonts w:ascii="Aptos Narrow" w:eastAsia="Times New Roman" w:hAnsi="Aptos Narrow" w:cs="Times New Roman"/>
@@ -3662,6 +3648,84 @@
                 <w14:ligatures w14:val="none"/>
               </w:rPr>
               <w:t>0.1877</w:t>
+            </w:r>
+          </w:p>
+        </w:tc>
+        <w:tc>
+          <w:tcPr>
+            <w:tcW w:w="1389" w:type="dxa"/>
+            <w:tcBorders>
+              <w:top w:val="nil"/>
+              <w:left w:val="nil"/>
+              <w:bottom w:val="single" w:sz="4" w:space="0" w:color="auto"/>
+              <w:right w:val="single" w:sz="4" w:space="0" w:color="auto"/>
+            </w:tcBorders>
+            <w:shd w:val="clear" w:color="auto" w:fill="auto"/>
+            <w:noWrap/>
+            <w:vAlign w:val="bottom"/>
+            <w:hideMark/>
+          </w:tcPr>
+          <w:p>
+            <w:pPr>
+              <w:spacing w:after="0" w:line="240" w:lineRule="auto"/>
+              <w:jc w:val="center"/>
+              <w:rPr>
+                <w:rFonts w:ascii="Aptos Narrow" w:eastAsia="Times New Roman" w:hAnsi="Aptos Narrow" w:cs="Times New Roman"/>
+                <w:color w:val="000000"/>
+                <w:kern w:val="0"/>
+                <w:sz w:val="22"/>
+                <w:szCs w:val="22"/>
+                <w14:ligatures w14:val="none"/>
+              </w:rPr>
+            </w:pPr>
+            <w:r>
+              <w:rPr>
+                <w:rFonts w:ascii="Aptos Narrow" w:eastAsia="Times New Roman" w:hAnsi="Aptos Narrow" w:cs="Times New Roman"/>
+                <w:color w:val="000000"/>
+                <w:kern w:val="0"/>
+                <w:sz w:val="22"/>
+                <w:szCs w:val="22"/>
+                <w14:ligatures w14:val="none"/>
+              </w:rPr>
+              <w:t>3.03</w:t>
+            </w:r>
+          </w:p>
+        </w:tc>
+        <w:tc>
+          <w:tcPr>
+            <w:tcW w:w="1389" w:type="dxa"/>
+            <w:tcBorders>
+              <w:top w:val="nil"/>
+              <w:left w:val="nil"/>
+              <w:bottom w:val="single" w:sz="4" w:space="0" w:color="auto"/>
+              <w:right w:val="single" w:sz="4" w:space="0" w:color="auto"/>
+            </w:tcBorders>
+            <w:shd w:val="clear" w:color="auto" w:fill="auto"/>
+            <w:noWrap/>
+            <w:vAlign w:val="bottom"/>
+            <w:hideMark/>
+          </w:tcPr>
+          <w:p>
+            <w:pPr>
+              <w:spacing w:after="0" w:line="240" w:lineRule="auto"/>
+              <w:jc w:val="center"/>
+              <w:rPr>
+                <w:rFonts w:ascii="Aptos Narrow" w:eastAsia="Times New Roman" w:hAnsi="Aptos Narrow" w:cs="Times New Roman"/>
+                <w:color w:val="000000"/>
+                <w:kern w:val="0"/>
+                <w:sz w:val="22"/>
+                <w:szCs w:val="22"/>
+                <w14:ligatures w14:val="none"/>
+              </w:rPr>
+            </w:pPr>
+            <w:r>
+              <w:rPr>
+                <w:rFonts w:ascii="Aptos Narrow" w:hAnsi="Aptos Narrow"/>
+                <w:color w:val="000000"/>
+                <w:sz w:val="22"/>
+                <w:szCs w:val="22"/>
+              </w:rPr>
+              <w:t>0.00038</w:t>
             </w:r>
           </w:p>
         </w:tc>
@@ -3681,7 +3745,7 @@
           </w:tcPr>
           <w:p>
             <w:pPr>
-              <w:spacing w:after="0" w:line="480" w:lineRule="auto"/>
+              <w:spacing w:after="0" w:line="240" w:lineRule="auto"/>
               <w:jc w:val="center"/>
               <w:rPr>
                 <w:rFonts w:ascii="Aptos Narrow" w:eastAsia="Times New Roman" w:hAnsi="Aptos Narrow" w:cs="Times New Roman"/>
@@ -3694,20 +3758,67 @@
             </w:pPr>
             <w:r>
               <w:rPr>
-                <w:rFonts w:ascii="Aptos Narrow" w:eastAsia="Times New Roman" w:hAnsi="Aptos Narrow" w:cs="Times New Roman"/>
-                <w:color w:val="000000"/>
-                <w:kern w:val="0"/>
-                <w:sz w:val="22"/>
-                <w:szCs w:val="22"/>
-                <w14:ligatures w14:val="none"/>
-              </w:rPr>
-              <w:t>3.03</w:t>
+                <w:rFonts w:ascii="Aptos Narrow" w:hAnsi="Aptos Narrow"/>
+                <w:color w:val="000000"/>
+                <w:sz w:val="22"/>
+                <w:szCs w:val="22"/>
+              </w:rPr>
+              <w:t>493.95</w:t>
+            </w:r>
+          </w:p>
+        </w:tc>
+      </w:tr>
+      <w:tr>
+        <w:trPr>
+          <w:trHeight w:val="288"/>
+        </w:trPr>
+        <w:tc>
+          <w:tcPr>
+            <w:tcW w:w="600" w:type="dxa"/>
+            <w:tcBorders>
+              <w:top w:val="nil"/>
+              <w:left w:val="single" w:sz="4" w:space="0" w:color="auto"/>
+              <w:bottom w:val="single" w:sz="4" w:space="0" w:color="auto"/>
+              <w:right w:val="single" w:sz="4" w:space="0" w:color="auto"/>
+            </w:tcBorders>
+            <w:shd w:val="clear" w:color="auto" w:fill="auto"/>
+            <w:noWrap/>
+            <w:vAlign w:val="bottom"/>
+            <w:hideMark/>
+          </w:tcPr>
+          <w:p>
+            <w:pPr>
+              <w:spacing w:after="0" w:line="240" w:lineRule="auto"/>
+              <w:jc w:val="center"/>
+              <w:rPr>
+                <w:rFonts w:ascii="Aptos Narrow" w:eastAsia="Times New Roman" w:hAnsi="Aptos Narrow" w:cs="Times New Roman"/>
+                <w:b/>
+                <w:bCs/>
+                <w:color w:val="000000"/>
+                <w:kern w:val="0"/>
+                <w:sz w:val="22"/>
+                <w:szCs w:val="22"/>
+                <w14:ligatures w14:val="none"/>
+              </w:rPr>
+            </w:pPr>
+            <w:r>
+              <w:rPr>
+                <w:rFonts w:ascii="Aptos Narrow" w:eastAsia="Times New Roman" w:hAnsi="Aptos Narrow" w:cs="Times New Roman"/>
+                <w:b/>
+                <w:bCs/>
+                <w:color w:val="000000"/>
+                <w:kern w:val="0"/>
+                <w:sz w:val="22"/>
+                <w:szCs w:val="22"/>
+                <w14:ligatures w14:val="none"/>
+              </w:rPr>
+              <w:t>5</w:t>
             </w:r>
           </w:p>
         </w:tc>
         <w:tc>
           <w:tcPr>
-            <w:tcW w:w="1360" w:type="dxa"/>
+            <w:tcW w:w="2008" w:type="dxa"/>
             <w:tcBorders>
               <w:top w:val="nil"/>
               <w:left w:val="nil"/>
@@ -3721,136 +3832,7 @@
           </w:tcPr>
           <w:p>
             <w:pPr>
-              <w:spacing w:after="0" w:line="480" w:lineRule="auto"/>
-              <w:jc w:val="center"/>
-              <w:rPr>
-                <w:rFonts w:ascii="Aptos Narrow" w:eastAsia="Times New Roman" w:hAnsi="Aptos Narrow" w:cs="Times New Roman"/>
-                <w:color w:val="000000"/>
-                <w:kern w:val="0"/>
-                <w:sz w:val="22"/>
-                <w:szCs w:val="22"/>
-                <w14:ligatures w14:val="none"/>
-              </w:rPr>
-            </w:pPr>
-            <w:r>
-              <w:rPr>
-                <w:rFonts w:ascii="Aptos Narrow" w:eastAsia="Times New Roman" w:hAnsi="Aptos Narrow" w:cs="Times New Roman"/>
-                <w:color w:val="000000"/>
-                <w:kern w:val="0"/>
-                <w:sz w:val="22"/>
-                <w:szCs w:val="22"/>
-                <w14:ligatures w14:val="none"/>
-              </w:rPr>
-              <w:t>0.0038</w:t>
-            </w:r>
-          </w:p>
-        </w:tc>
-        <w:tc>
-          <w:tcPr>
-            <w:tcW w:w="1360" w:type="dxa"/>
-            <w:tcBorders>
-              <w:top w:val="nil"/>
-              <w:left w:val="nil"/>
-              <w:bottom w:val="single" w:sz="4" w:space="0" w:color="auto"/>
-              <w:right w:val="single" w:sz="4" w:space="0" w:color="auto"/>
-            </w:tcBorders>
-            <w:shd w:val="clear" w:color="auto" w:fill="auto"/>
-            <w:noWrap/>
-            <w:vAlign w:val="bottom"/>
-            <w:hideMark/>
-          </w:tcPr>
-          <w:p>
-            <w:pPr>
-              <w:spacing w:after="0" w:line="480" w:lineRule="auto"/>
-              <w:jc w:val="center"/>
-              <w:rPr>
-                <w:rFonts w:ascii="Aptos Narrow" w:eastAsia="Times New Roman" w:hAnsi="Aptos Narrow" w:cs="Times New Roman"/>
-                <w:color w:val="000000"/>
-                <w:kern w:val="0"/>
-                <w:sz w:val="22"/>
-                <w:szCs w:val="22"/>
-                <w14:ligatures w14:val="none"/>
-              </w:rPr>
-            </w:pPr>
-            <w:r>
-              <w:rPr>
-                <w:rFonts w:ascii="Aptos Narrow" w:eastAsia="Times New Roman" w:hAnsi="Aptos Narrow" w:cs="Times New Roman"/>
-                <w:color w:val="000000"/>
-                <w:kern w:val="0"/>
-                <w:sz w:val="22"/>
-                <w:szCs w:val="22"/>
-                <w14:ligatures w14:val="none"/>
-              </w:rPr>
-              <w:t>49.39</w:t>
-            </w:r>
-          </w:p>
-        </w:tc>
-      </w:tr>
-      <w:tr>
-        <w:trPr>
-          <w:trHeight w:val="288"/>
-        </w:trPr>
-        <w:tc>
-          <w:tcPr>
-            <w:tcW w:w="480" w:type="dxa"/>
-            <w:tcBorders>
-              <w:top w:val="nil"/>
-              <w:left w:val="single" w:sz="4" w:space="0" w:color="auto"/>
-              <w:bottom w:val="single" w:sz="4" w:space="0" w:color="auto"/>
-              <w:right w:val="single" w:sz="4" w:space="0" w:color="auto"/>
-            </w:tcBorders>
-            <w:shd w:val="clear" w:color="auto" w:fill="auto"/>
-            <w:noWrap/>
-            <w:vAlign w:val="bottom"/>
-            <w:hideMark/>
-          </w:tcPr>
-          <w:p>
-            <w:pPr>
-              <w:spacing w:after="0" w:line="480" w:lineRule="auto"/>
-              <w:jc w:val="center"/>
-              <w:rPr>
-                <w:rFonts w:ascii="Aptos Narrow" w:eastAsia="Times New Roman" w:hAnsi="Aptos Narrow" w:cs="Times New Roman"/>
-                <w:b/>
-                <w:bCs/>
-                <w:color w:val="000000"/>
-                <w:kern w:val="0"/>
-                <w:sz w:val="22"/>
-                <w:szCs w:val="22"/>
-                <w14:ligatures w14:val="none"/>
-              </w:rPr>
-            </w:pPr>
-            <w:r>
-              <w:rPr>
-                <w:rFonts w:ascii="Aptos Narrow" w:eastAsia="Times New Roman" w:hAnsi="Aptos Narrow" w:cs="Times New Roman"/>
-                <w:b/>
-                <w:bCs/>
-                <w:color w:val="000000"/>
-                <w:kern w:val="0"/>
-                <w:sz w:val="22"/>
-                <w:szCs w:val="22"/>
-                <w14:ligatures w14:val="none"/>
-              </w:rPr>
-              <w:t>5</w:t>
-            </w:r>
-          </w:p>
-        </w:tc>
-        <w:tc>
-          <w:tcPr>
-            <w:tcW w:w="1860" w:type="dxa"/>
-            <w:tcBorders>
-              <w:top w:val="nil"/>
-              <w:left w:val="nil"/>
-              <w:bottom w:val="single" w:sz="4" w:space="0" w:color="auto"/>
-              <w:right w:val="single" w:sz="4" w:space="0" w:color="auto"/>
-            </w:tcBorders>
-            <w:shd w:val="clear" w:color="auto" w:fill="auto"/>
-            <w:noWrap/>
-            <w:vAlign w:val="bottom"/>
-            <w:hideMark/>
-          </w:tcPr>
-          <w:p>
-            <w:pPr>
-              <w:spacing w:after="0" w:line="480" w:lineRule="auto"/>
+              <w:spacing w:after="0" w:line="240" w:lineRule="auto"/>
               <w:jc w:val="center"/>
               <w:rPr>
                 <w:rFonts w:ascii="Aptos Narrow" w:eastAsia="Times New Roman" w:hAnsi="Aptos Narrow" w:cs="Times New Roman"/>
@@ -3890,7 +3872,7 @@
           </w:tcPr>
           <w:p>
             <w:pPr>
-              <w:spacing w:after="0" w:line="480" w:lineRule="auto"/>
+              <w:spacing w:after="0" w:line="240" w:lineRule="auto"/>
               <w:jc w:val="center"/>
               <w:rPr>
                 <w:rFonts w:ascii="Aptos Narrow" w:eastAsia="Times New Roman" w:hAnsi="Aptos Narrow" w:cs="Times New Roman"/>
@@ -3930,7 +3912,7 @@
           </w:tcPr>
           <w:p>
             <w:pPr>
-              <w:spacing w:after="0" w:line="480" w:lineRule="auto"/>
+              <w:spacing w:after="0" w:line="240" w:lineRule="auto"/>
               <w:jc w:val="center"/>
               <w:rPr>
                 <w:rFonts w:ascii="Aptos Narrow" w:eastAsia="Times New Roman" w:hAnsi="Aptos Narrow" w:cs="Times New Roman"/>
@@ -3950,7 +3932,7 @@
                 <w:szCs w:val="22"/>
                 <w14:ligatures w14:val="none"/>
               </w:rPr>
-              <w:t>0.1777</w:t>
+              <w:t>0.01777</w:t>
             </w:r>
           </w:p>
         </w:tc>
@@ -3970,7 +3952,7 @@
           </w:tcPr>
           <w:p>
             <w:pPr>
-              <w:spacing w:after="0" w:line="480" w:lineRule="auto"/>
+              <w:spacing w:after="0" w:line="240" w:lineRule="auto"/>
               <w:jc w:val="center"/>
               <w:rPr>
                 <w:rFonts w:ascii="Aptos Narrow" w:eastAsia="Times New Roman" w:hAnsi="Aptos Narrow" w:cs="Times New Roman"/>
@@ -3991,6 +3973,84 @@
                 <w14:ligatures w14:val="none"/>
               </w:rPr>
               <w:t>0.3242</w:t>
+            </w:r>
+          </w:p>
+        </w:tc>
+        <w:tc>
+          <w:tcPr>
+            <w:tcW w:w="1389" w:type="dxa"/>
+            <w:tcBorders>
+              <w:top w:val="nil"/>
+              <w:left w:val="nil"/>
+              <w:bottom w:val="single" w:sz="4" w:space="0" w:color="auto"/>
+              <w:right w:val="single" w:sz="4" w:space="0" w:color="auto"/>
+            </w:tcBorders>
+            <w:shd w:val="clear" w:color="auto" w:fill="auto"/>
+            <w:noWrap/>
+            <w:vAlign w:val="bottom"/>
+            <w:hideMark/>
+          </w:tcPr>
+          <w:p>
+            <w:pPr>
+              <w:spacing w:after="0" w:line="240" w:lineRule="auto"/>
+              <w:jc w:val="center"/>
+              <w:rPr>
+                <w:rFonts w:ascii="Aptos Narrow" w:eastAsia="Times New Roman" w:hAnsi="Aptos Narrow" w:cs="Times New Roman"/>
+                <w:color w:val="000000"/>
+                <w:kern w:val="0"/>
+                <w:sz w:val="22"/>
+                <w:szCs w:val="22"/>
+                <w14:ligatures w14:val="none"/>
+              </w:rPr>
+            </w:pPr>
+            <w:r>
+              <w:rPr>
+                <w:rFonts w:ascii="Aptos Narrow" w:eastAsia="Times New Roman" w:hAnsi="Aptos Narrow" w:cs="Times New Roman"/>
+                <w:color w:val="000000"/>
+                <w:kern w:val="0"/>
+                <w:sz w:val="22"/>
+                <w:szCs w:val="22"/>
+                <w14:ligatures w14:val="none"/>
+              </w:rPr>
+              <w:t>3.19</w:t>
+            </w:r>
+          </w:p>
+        </w:tc>
+        <w:tc>
+          <w:tcPr>
+            <w:tcW w:w="1389" w:type="dxa"/>
+            <w:tcBorders>
+              <w:top w:val="nil"/>
+              <w:left w:val="nil"/>
+              <w:bottom w:val="single" w:sz="4" w:space="0" w:color="auto"/>
+              <w:right w:val="single" w:sz="4" w:space="0" w:color="auto"/>
+            </w:tcBorders>
+            <w:shd w:val="clear" w:color="auto" w:fill="auto"/>
+            <w:noWrap/>
+            <w:vAlign w:val="bottom"/>
+            <w:hideMark/>
+          </w:tcPr>
+          <w:p>
+            <w:pPr>
+              <w:spacing w:after="0" w:line="240" w:lineRule="auto"/>
+              <w:jc w:val="center"/>
+              <w:rPr>
+                <w:rFonts w:ascii="Aptos Narrow" w:eastAsia="Times New Roman" w:hAnsi="Aptos Narrow" w:cs="Times New Roman"/>
+                <w:color w:val="000000"/>
+                <w:kern w:val="0"/>
+                <w:sz w:val="22"/>
+                <w:szCs w:val="22"/>
+                <w14:ligatures w14:val="none"/>
+              </w:rPr>
+            </w:pPr>
+            <w:r>
+              <w:rPr>
+                <w:rFonts w:ascii="Aptos Narrow" w:hAnsi="Aptos Narrow"/>
+                <w:color w:val="000000"/>
+                <w:sz w:val="22"/>
+                <w:szCs w:val="22"/>
+              </w:rPr>
+              <w:t>0.000615</w:t>
             </w:r>
           </w:p>
         </w:tc>
@@ -4010,7 +4070,7 @@
           </w:tcPr>
           <w:p>
             <w:pPr>
-              <w:spacing w:after="0" w:line="480" w:lineRule="auto"/>
+              <w:spacing w:after="0" w:line="240" w:lineRule="auto"/>
               <w:jc w:val="center"/>
               <w:rPr>
                 <w:rFonts w:ascii="Aptos Narrow" w:eastAsia="Times New Roman" w:hAnsi="Aptos Narrow" w:cs="Times New Roman"/>
@@ -4023,94 +4083,12 @@
             </w:pPr>
             <w:r>
               <w:rPr>
-                <w:rFonts w:ascii="Aptos Narrow" w:eastAsia="Times New Roman" w:hAnsi="Aptos Narrow" w:cs="Times New Roman"/>
-                <w:color w:val="000000"/>
-                <w:kern w:val="0"/>
-                <w:sz w:val="22"/>
-                <w:szCs w:val="22"/>
-                <w14:ligatures w14:val="none"/>
-              </w:rPr>
-              <w:t>3.19</w:t>
-            </w:r>
-          </w:p>
-        </w:tc>
-        <w:tc>
-          <w:tcPr>
-            <w:tcW w:w="1360" w:type="dxa"/>
-            <w:tcBorders>
-              <w:top w:val="nil"/>
-              <w:left w:val="nil"/>
-              <w:bottom w:val="single" w:sz="4" w:space="0" w:color="auto"/>
-              <w:right w:val="single" w:sz="4" w:space="0" w:color="auto"/>
-            </w:tcBorders>
-            <w:shd w:val="clear" w:color="auto" w:fill="auto"/>
-            <w:noWrap/>
-            <w:vAlign w:val="bottom"/>
-            <w:hideMark/>
-          </w:tcPr>
-          <w:p>
-            <w:pPr>
-              <w:spacing w:after="0" w:line="480" w:lineRule="auto"/>
-              <w:jc w:val="center"/>
-              <w:rPr>
-                <w:rFonts w:ascii="Aptos Narrow" w:eastAsia="Times New Roman" w:hAnsi="Aptos Narrow" w:cs="Times New Roman"/>
-                <w:color w:val="000000"/>
-                <w:kern w:val="0"/>
-                <w:sz w:val="22"/>
-                <w:szCs w:val="22"/>
-                <w14:ligatures w14:val="none"/>
-              </w:rPr>
-            </w:pPr>
-            <w:r>
-              <w:rPr>
-                <w:rFonts w:ascii="Aptos Narrow" w:eastAsia="Times New Roman" w:hAnsi="Aptos Narrow" w:cs="Times New Roman"/>
-                <w:color w:val="000000"/>
-                <w:kern w:val="0"/>
-                <w:sz w:val="22"/>
-                <w:szCs w:val="22"/>
-                <w14:ligatures w14:val="none"/>
-              </w:rPr>
-              <w:t>0.0062</w:t>
-            </w:r>
-          </w:p>
-        </w:tc>
-        <w:tc>
-          <w:tcPr>
-            <w:tcW w:w="1360" w:type="dxa"/>
-            <w:tcBorders>
-              <w:top w:val="nil"/>
-              <w:left w:val="nil"/>
-              <w:bottom w:val="single" w:sz="4" w:space="0" w:color="auto"/>
-              <w:right w:val="single" w:sz="4" w:space="0" w:color="auto"/>
-            </w:tcBorders>
-            <w:shd w:val="clear" w:color="auto" w:fill="auto"/>
-            <w:noWrap/>
-            <w:vAlign w:val="bottom"/>
-            <w:hideMark/>
-          </w:tcPr>
-          <w:p>
-            <w:pPr>
-              <w:spacing w:after="0" w:line="480" w:lineRule="auto"/>
-              <w:jc w:val="center"/>
-              <w:rPr>
-                <w:rFonts w:ascii="Aptos Narrow" w:eastAsia="Times New Roman" w:hAnsi="Aptos Narrow" w:cs="Times New Roman"/>
-                <w:color w:val="000000"/>
-                <w:kern w:val="0"/>
-                <w:sz w:val="22"/>
-                <w:szCs w:val="22"/>
-                <w14:ligatures w14:val="none"/>
-              </w:rPr>
-            </w:pPr>
-            <w:r>
-              <w:rPr>
-                <w:rFonts w:ascii="Aptos Narrow" w:eastAsia="Times New Roman" w:hAnsi="Aptos Narrow" w:cs="Times New Roman"/>
-                <w:color w:val="000000"/>
-                <w:kern w:val="0"/>
-                <w:sz w:val="22"/>
-                <w:szCs w:val="22"/>
-                <w14:ligatures w14:val="none"/>
-              </w:rPr>
-              <w:t>52.29</w:t>
+                <w:rFonts w:ascii="Aptos Narrow" w:hAnsi="Aptos Narrow"/>
+                <w:color w:val="000000"/>
+                <w:sz w:val="22"/>
+                <w:szCs w:val="22"/>
+              </w:rPr>
+              <w:t>527.15</w:t>
             </w:r>
           </w:p>
         </w:tc>
@@ -4121,7 +4099,7 @@
         </w:trPr>
         <w:tc>
           <w:tcPr>
-            <w:tcW w:w="480" w:type="dxa"/>
+            <w:tcW w:w="600" w:type="dxa"/>
             <w:tcBorders>
               <w:top w:val="nil"/>
               <w:left w:val="nil"/>
@@ -4135,7 +4113,7 @@
           </w:tcPr>
           <w:p>
             <w:pPr>
-              <w:spacing w:after="0" w:line="480" w:lineRule="auto"/>
+              <w:spacing w:after="0" w:line="240" w:lineRule="auto"/>
               <w:jc w:val="center"/>
               <w:rPr>
                 <w:rFonts w:ascii="Aptos Narrow" w:eastAsia="Times New Roman" w:hAnsi="Aptos Narrow" w:cs="Times New Roman"/>
@@ -4150,7 +4128,7 @@
         </w:tc>
         <w:tc>
           <w:tcPr>
-            <w:tcW w:w="1860" w:type="dxa"/>
+            <w:tcW w:w="2008" w:type="dxa"/>
             <w:tcBorders>
               <w:top w:val="nil"/>
               <w:left w:val="nil"/>
@@ -4164,7 +4142,7 @@
           </w:tcPr>
           <w:p>
             <w:pPr>
-              <w:spacing w:after="0" w:line="480" w:lineRule="auto"/>
+              <w:spacing w:after="0" w:line="240" w:lineRule="auto"/>
               <w:rPr>
                 <w:rFonts w:ascii="Times New Roman" w:eastAsia="Times New Roman" w:hAnsi="Times New Roman" w:cs="Times New Roman"/>
                 <w:kern w:val="0"/>
@@ -4191,7 +4169,7 @@
           </w:tcPr>
           <w:p>
             <w:pPr>
-              <w:spacing w:after="0" w:line="480" w:lineRule="auto"/>
+              <w:spacing w:after="0" w:line="240" w:lineRule="auto"/>
               <w:rPr>
                 <w:rFonts w:ascii="Times New Roman" w:eastAsia="Times New Roman" w:hAnsi="Times New Roman" w:cs="Times New Roman"/>
                 <w:kern w:val="0"/>
@@ -4218,7 +4196,7 @@
           </w:tcPr>
           <w:p>
             <w:pPr>
-              <w:spacing w:after="0" w:line="480" w:lineRule="auto"/>
+              <w:spacing w:after="0" w:line="240" w:lineRule="auto"/>
               <w:rPr>
                 <w:rFonts w:ascii="Times New Roman" w:eastAsia="Times New Roman" w:hAnsi="Times New Roman" w:cs="Times New Roman"/>
                 <w:kern w:val="0"/>
@@ -4245,12 +4223,85 @@
           </w:tcPr>
           <w:p>
             <w:pPr>
-              <w:spacing w:after="0" w:line="480" w:lineRule="auto"/>
+              <w:spacing w:after="0" w:line="240" w:lineRule="auto"/>
               <w:rPr>
                 <w:rFonts w:ascii="Times New Roman" w:eastAsia="Times New Roman" w:hAnsi="Times New Roman" w:cs="Times New Roman"/>
                 <w:kern w:val="0"/>
                 <w:sz w:val="20"/>
                 <w:szCs w:val="20"/>
+                <w14:ligatures w14:val="none"/>
+              </w:rPr>
+            </w:pPr>
+          </w:p>
+        </w:tc>
+        <w:tc>
+          <w:tcPr>
+            <w:tcW w:w="1389" w:type="dxa"/>
+            <w:tcBorders>
+              <w:top w:val="nil"/>
+              <w:left w:val="single" w:sz="4" w:space="0" w:color="auto"/>
+              <w:bottom w:val="single" w:sz="4" w:space="0" w:color="auto"/>
+              <w:right w:val="single" w:sz="4" w:space="0" w:color="auto"/>
+            </w:tcBorders>
+            <w:shd w:val="clear" w:color="auto" w:fill="auto"/>
+            <w:noWrap/>
+            <w:vAlign w:val="bottom"/>
+            <w:hideMark/>
+          </w:tcPr>
+          <w:p>
+            <w:pPr>
+              <w:spacing w:after="0" w:line="240" w:lineRule="auto"/>
+              <w:rPr>
+                <w:rFonts w:ascii="Aptos Narrow" w:eastAsia="Times New Roman" w:hAnsi="Aptos Narrow" w:cs="Times New Roman"/>
+                <w:b/>
+                <w:bCs/>
+                <w:color w:val="000000"/>
+                <w:kern w:val="0"/>
+                <w:sz w:val="22"/>
+                <w:szCs w:val="22"/>
+                <w14:ligatures w14:val="none"/>
+              </w:rPr>
+            </w:pPr>
+            <w:r>
+              <w:rPr>
+                <w:rFonts w:ascii="Aptos Narrow" w:eastAsia="Times New Roman" w:hAnsi="Aptos Narrow" w:cs="Times New Roman"/>
+                <w:b/>
+                <w:bCs/>
+                <w:color w:val="000000"/>
+                <w:kern w:val="0"/>
+                <w:sz w:val="22"/>
+                <w:szCs w:val="22"/>
+                <w14:ligatures w14:val="none"/>
+              </w:rPr>
+              <w:t>Average:</w:t>
+            </w:r>
+          </w:p>
+        </w:tc>
+        <w:tc>
+          <w:tcPr>
+            <w:tcW w:w="1389" w:type="dxa"/>
+            <w:tcBorders>
+              <w:top w:val="nil"/>
+              <w:left w:val="nil"/>
+              <w:bottom w:val="nil"/>
+              <w:right w:val="nil"/>
+            </w:tcBorders>
+            <w:shd w:val="clear" w:color="auto" w:fill="auto"/>
+            <w:noWrap/>
+            <w:vAlign w:val="bottom"/>
+            <w:hideMark/>
+          </w:tcPr>
+          <w:p>
+            <w:pPr>
+              <w:spacing w:after="0" w:line="240" w:lineRule="auto"/>
+              <w:rPr>
+                <w:rFonts w:ascii="Aptos Narrow" w:eastAsia="Times New Roman" w:hAnsi="Aptos Narrow" w:cs="Times New Roman"/>
+                <w:b/>
+                <w:bCs/>
+                <w:color w:val="000000"/>
+                <w:kern w:val="0"/>
+                <w:sz w:val="22"/>
+                <w:szCs w:val="22"/>
                 <w14:ligatures w14:val="none"/>
               </w:rPr>
             </w:pPr>
@@ -4272,7 +4323,7 @@
           </w:tcPr>
           <w:p>
             <w:pPr>
-              <w:spacing w:after="0" w:line="480" w:lineRule="auto"/>
+              <w:spacing w:after="0" w:line="240" w:lineRule="auto"/>
               <w:rPr>
                 <w:rFonts w:ascii="Aptos Narrow" w:eastAsia="Times New Roman" w:hAnsi="Aptos Narrow" w:cs="Times New Roman"/>
                 <w:b/>
@@ -4299,9 +4350,14 @@
             </w:r>
           </w:p>
         </w:tc>
+      </w:tr>
+      <w:tr>
+        <w:trPr>
+          <w:trHeight w:val="288"/>
+        </w:trPr>
         <w:tc>
           <w:tcPr>
-            <w:tcW w:w="1360" w:type="dxa"/>
+            <w:tcW w:w="600" w:type="dxa"/>
             <w:tcBorders>
               <w:top w:val="nil"/>
               <w:left w:val="nil"/>
@@ -4315,11 +4371,188 @@
           </w:tcPr>
           <w:p>
             <w:pPr>
-              <w:spacing w:after="0" w:line="480" w:lineRule="auto"/>
+              <w:spacing w:after="0" w:line="240" w:lineRule="auto"/>
               <w:rPr>
                 <w:rFonts w:ascii="Aptos Narrow" w:eastAsia="Times New Roman" w:hAnsi="Aptos Narrow" w:cs="Times New Roman"/>
                 <w:b/>
                 <w:bCs/>
+                <w:color w:val="000000"/>
+                <w:kern w:val="0"/>
+                <w:sz w:val="22"/>
+                <w:szCs w:val="22"/>
+                <w14:ligatures w14:val="none"/>
+              </w:rPr>
+            </w:pPr>
+          </w:p>
+        </w:tc>
+        <w:tc>
+          <w:tcPr>
+            <w:tcW w:w="2008" w:type="dxa"/>
+            <w:tcBorders>
+              <w:top w:val="nil"/>
+              <w:left w:val="nil"/>
+              <w:bottom w:val="nil"/>
+              <w:right w:val="nil"/>
+            </w:tcBorders>
+            <w:shd w:val="clear" w:color="auto" w:fill="auto"/>
+            <w:noWrap/>
+            <w:vAlign w:val="bottom"/>
+            <w:hideMark/>
+          </w:tcPr>
+          <w:p>
+            <w:pPr>
+              <w:spacing w:after="0" w:line="240" w:lineRule="auto"/>
+              <w:rPr>
+                <w:rFonts w:ascii="Times New Roman" w:eastAsia="Times New Roman" w:hAnsi="Times New Roman" w:cs="Times New Roman"/>
+                <w:kern w:val="0"/>
+                <w:sz w:val="20"/>
+                <w:szCs w:val="20"/>
+                <w14:ligatures w14:val="none"/>
+              </w:rPr>
+            </w:pPr>
+          </w:p>
+        </w:tc>
+        <w:tc>
+          <w:tcPr>
+            <w:tcW w:w="1460" w:type="dxa"/>
+            <w:tcBorders>
+              <w:top w:val="nil"/>
+              <w:left w:val="nil"/>
+              <w:bottom w:val="nil"/>
+              <w:right w:val="nil"/>
+            </w:tcBorders>
+            <w:shd w:val="clear" w:color="auto" w:fill="auto"/>
+            <w:noWrap/>
+            <w:vAlign w:val="bottom"/>
+            <w:hideMark/>
+          </w:tcPr>
+          <w:p>
+            <w:pPr>
+              <w:spacing w:after="0" w:line="240" w:lineRule="auto"/>
+              <w:rPr>
+                <w:rFonts w:ascii="Times New Roman" w:eastAsia="Times New Roman" w:hAnsi="Times New Roman" w:cs="Times New Roman"/>
+                <w:kern w:val="0"/>
+                <w:sz w:val="20"/>
+                <w:szCs w:val="20"/>
+                <w14:ligatures w14:val="none"/>
+              </w:rPr>
+            </w:pPr>
+          </w:p>
+        </w:tc>
+        <w:tc>
+          <w:tcPr>
+            <w:tcW w:w="1520" w:type="dxa"/>
+            <w:tcBorders>
+              <w:top w:val="nil"/>
+              <w:left w:val="nil"/>
+              <w:bottom w:val="nil"/>
+              <w:right w:val="nil"/>
+            </w:tcBorders>
+            <w:shd w:val="clear" w:color="auto" w:fill="auto"/>
+            <w:noWrap/>
+            <w:vAlign w:val="bottom"/>
+            <w:hideMark/>
+          </w:tcPr>
+          <w:p>
+            <w:pPr>
+              <w:spacing w:after="0" w:line="240" w:lineRule="auto"/>
+              <w:rPr>
+                <w:rFonts w:ascii="Times New Roman" w:eastAsia="Times New Roman" w:hAnsi="Times New Roman" w:cs="Times New Roman"/>
+                <w:kern w:val="0"/>
+                <w:sz w:val="20"/>
+                <w:szCs w:val="20"/>
+                <w14:ligatures w14:val="none"/>
+              </w:rPr>
+            </w:pPr>
+          </w:p>
+        </w:tc>
+        <w:tc>
+          <w:tcPr>
+            <w:tcW w:w="940" w:type="dxa"/>
+            <w:tcBorders>
+              <w:top w:val="nil"/>
+              <w:left w:val="nil"/>
+              <w:bottom w:val="nil"/>
+              <w:right w:val="nil"/>
+            </w:tcBorders>
+            <w:shd w:val="clear" w:color="auto" w:fill="auto"/>
+            <w:noWrap/>
+            <w:vAlign w:val="bottom"/>
+            <w:hideMark/>
+          </w:tcPr>
+          <w:p>
+            <w:pPr>
+              <w:spacing w:after="0" w:line="240" w:lineRule="auto"/>
+              <w:rPr>
+                <w:rFonts w:ascii="Times New Roman" w:eastAsia="Times New Roman" w:hAnsi="Times New Roman" w:cs="Times New Roman"/>
+                <w:kern w:val="0"/>
+                <w:sz w:val="20"/>
+                <w:szCs w:val="20"/>
+                <w14:ligatures w14:val="none"/>
+              </w:rPr>
+            </w:pPr>
+          </w:p>
+        </w:tc>
+        <w:tc>
+          <w:tcPr>
+            <w:tcW w:w="1389" w:type="dxa"/>
+            <w:tcBorders>
+              <w:top w:val="nil"/>
+              <w:left w:val="single" w:sz="4" w:space="0" w:color="auto"/>
+              <w:bottom w:val="single" w:sz="4" w:space="0" w:color="auto"/>
+              <w:right w:val="single" w:sz="4" w:space="0" w:color="auto"/>
+            </w:tcBorders>
+            <w:shd w:val="clear" w:color="auto" w:fill="auto"/>
+            <w:noWrap/>
+            <w:vAlign w:val="bottom"/>
+            <w:hideMark/>
+          </w:tcPr>
+          <w:p>
+            <w:pPr>
+              <w:spacing w:after="0" w:line="240" w:lineRule="auto"/>
+              <w:jc w:val="center"/>
+              <w:rPr>
+                <w:rFonts w:ascii="Aptos Narrow" w:eastAsia="Times New Roman" w:hAnsi="Aptos Narrow" w:cs="Times New Roman"/>
+                <w:color w:val="000000"/>
+                <w:kern w:val="0"/>
+                <w:sz w:val="22"/>
+                <w:szCs w:val="22"/>
+                <w14:ligatures w14:val="none"/>
+              </w:rPr>
+            </w:pPr>
+            <w:r>
+              <w:rPr>
+                <w:rFonts w:ascii="Aptos Narrow" w:eastAsia="Times New Roman" w:hAnsi="Aptos Narrow" w:cs="Times New Roman"/>
+                <w:color w:val="000000"/>
+                <w:kern w:val="0"/>
+                <w:sz w:val="22"/>
+                <w:szCs w:val="22"/>
+                <w14:ligatures w14:val="none"/>
+              </w:rPr>
+              <w:t>3.222</w:t>
+            </w:r>
+          </w:p>
+        </w:tc>
+        <w:tc>
+          <w:tcPr>
+            <w:tcW w:w="1389" w:type="dxa"/>
+            <w:tcBorders>
+              <w:top w:val="nil"/>
+              <w:left w:val="nil"/>
+              <w:bottom w:val="nil"/>
+              <w:right w:val="nil"/>
+            </w:tcBorders>
+            <w:shd w:val="clear" w:color="auto" w:fill="auto"/>
+            <w:noWrap/>
+            <w:vAlign w:val="bottom"/>
+            <w:hideMark/>
+          </w:tcPr>
+          <w:p>
+            <w:pPr>
+              <w:spacing w:after="0" w:line="240" w:lineRule="auto"/>
+              <w:jc w:val="center"/>
+              <w:rPr>
+                <w:rFonts w:ascii="Aptos Narrow" w:eastAsia="Times New Roman" w:hAnsi="Aptos Narrow" w:cs="Times New Roman"/>
                 <w:color w:val="000000"/>
                 <w:kern w:val="0"/>
                 <w:sz w:val="22"/>
@@ -4345,282 +4578,22 @@
           </w:tcPr>
           <w:p>
             <w:pPr>
-              <w:spacing w:after="0" w:line="480" w:lineRule="auto"/>
-              <w:rPr>
-                <w:rFonts w:ascii="Aptos Narrow" w:eastAsia="Times New Roman" w:hAnsi="Aptos Narrow" w:cs="Times New Roman"/>
-                <w:b/>
-                <w:bCs/>
-                <w:color w:val="000000"/>
-                <w:kern w:val="0"/>
-                <w:sz w:val="22"/>
-                <w:szCs w:val="22"/>
-                <w14:ligatures w14:val="none"/>
+              <w:jc w:val="center"/>
+              <w:rPr>
+                <w:rFonts w:ascii="Aptos Narrow" w:hAnsi="Aptos Narrow"/>
+                <w:color w:val="000000"/>
+                <w:sz w:val="22"/>
+                <w:szCs w:val="22"/>
               </w:rPr>
             </w:pPr>
             <w:r>
               <w:rPr>
-                <w:rFonts w:ascii="Aptos Narrow" w:eastAsia="Times New Roman" w:hAnsi="Aptos Narrow" w:cs="Times New Roman"/>
-                <w:b/>
-                <w:bCs/>
-                <w:color w:val="000000"/>
-                <w:kern w:val="0"/>
-                <w:sz w:val="22"/>
-                <w:szCs w:val="22"/>
-                <w14:ligatures w14:val="none"/>
-              </w:rPr>
-              <w:t>Average:</w:t>
-            </w:r>
-          </w:p>
-        </w:tc>
-      </w:tr>
-      <w:tr>
-        <w:trPr>
-          <w:trHeight w:val="288"/>
-        </w:trPr>
-        <w:tc>
-          <w:tcPr>
-            <w:tcW w:w="480" w:type="dxa"/>
-            <w:tcBorders>
-              <w:top w:val="nil"/>
-              <w:left w:val="nil"/>
-              <w:bottom w:val="nil"/>
-              <w:right w:val="nil"/>
-            </w:tcBorders>
-            <w:shd w:val="clear" w:color="auto" w:fill="auto"/>
-            <w:noWrap/>
-            <w:vAlign w:val="bottom"/>
-            <w:hideMark/>
-          </w:tcPr>
-          <w:p>
-            <w:pPr>
-              <w:spacing w:after="0" w:line="480" w:lineRule="auto"/>
-              <w:rPr>
-                <w:rFonts w:ascii="Aptos Narrow" w:eastAsia="Times New Roman" w:hAnsi="Aptos Narrow" w:cs="Times New Roman"/>
-                <w:b/>
-                <w:bCs/>
-                <w:color w:val="000000"/>
-                <w:kern w:val="0"/>
-                <w:sz w:val="22"/>
-                <w:szCs w:val="22"/>
-                <w14:ligatures w14:val="none"/>
-              </w:rPr>
-            </w:pPr>
-          </w:p>
-        </w:tc>
-        <w:tc>
-          <w:tcPr>
-            <w:tcW w:w="1860" w:type="dxa"/>
-            <w:tcBorders>
-              <w:top w:val="nil"/>
-              <w:left w:val="nil"/>
-              <w:bottom w:val="nil"/>
-              <w:right w:val="nil"/>
-            </w:tcBorders>
-            <w:shd w:val="clear" w:color="auto" w:fill="auto"/>
-            <w:noWrap/>
-            <w:vAlign w:val="bottom"/>
-            <w:hideMark/>
-          </w:tcPr>
-          <w:p>
-            <w:pPr>
-              <w:spacing w:after="0" w:line="480" w:lineRule="auto"/>
-              <w:rPr>
-                <w:rFonts w:ascii="Times New Roman" w:eastAsia="Times New Roman" w:hAnsi="Times New Roman" w:cs="Times New Roman"/>
-                <w:kern w:val="0"/>
-                <w:sz w:val="20"/>
-                <w:szCs w:val="20"/>
-                <w14:ligatures w14:val="none"/>
-              </w:rPr>
-            </w:pPr>
-          </w:p>
-        </w:tc>
-        <w:tc>
-          <w:tcPr>
-            <w:tcW w:w="1460" w:type="dxa"/>
-            <w:tcBorders>
-              <w:top w:val="nil"/>
-              <w:left w:val="nil"/>
-              <w:bottom w:val="nil"/>
-              <w:right w:val="nil"/>
-            </w:tcBorders>
-            <w:shd w:val="clear" w:color="auto" w:fill="auto"/>
-            <w:noWrap/>
-            <w:vAlign w:val="bottom"/>
-            <w:hideMark/>
-          </w:tcPr>
-          <w:p>
-            <w:pPr>
-              <w:spacing w:after="0" w:line="480" w:lineRule="auto"/>
-              <w:rPr>
-                <w:rFonts w:ascii="Times New Roman" w:eastAsia="Times New Roman" w:hAnsi="Times New Roman" w:cs="Times New Roman"/>
-                <w:kern w:val="0"/>
-                <w:sz w:val="20"/>
-                <w:szCs w:val="20"/>
-                <w14:ligatures w14:val="none"/>
-              </w:rPr>
-            </w:pPr>
-          </w:p>
-        </w:tc>
-        <w:tc>
-          <w:tcPr>
-            <w:tcW w:w="1520" w:type="dxa"/>
-            <w:tcBorders>
-              <w:top w:val="nil"/>
-              <w:left w:val="nil"/>
-              <w:bottom w:val="nil"/>
-              <w:right w:val="nil"/>
-            </w:tcBorders>
-            <w:shd w:val="clear" w:color="auto" w:fill="auto"/>
-            <w:noWrap/>
-            <w:vAlign w:val="bottom"/>
-            <w:hideMark/>
-          </w:tcPr>
-          <w:p>
-            <w:pPr>
-              <w:spacing w:after="0" w:line="480" w:lineRule="auto"/>
-              <w:rPr>
-                <w:rFonts w:ascii="Times New Roman" w:eastAsia="Times New Roman" w:hAnsi="Times New Roman" w:cs="Times New Roman"/>
-                <w:kern w:val="0"/>
-                <w:sz w:val="20"/>
-                <w:szCs w:val="20"/>
-                <w14:ligatures w14:val="none"/>
-              </w:rPr>
-            </w:pPr>
-          </w:p>
-        </w:tc>
-        <w:tc>
-          <w:tcPr>
-            <w:tcW w:w="940" w:type="dxa"/>
-            <w:tcBorders>
-              <w:top w:val="nil"/>
-              <w:left w:val="nil"/>
-              <w:bottom w:val="nil"/>
-              <w:right w:val="nil"/>
-            </w:tcBorders>
-            <w:shd w:val="clear" w:color="auto" w:fill="auto"/>
-            <w:noWrap/>
-            <w:vAlign w:val="bottom"/>
-            <w:hideMark/>
-          </w:tcPr>
-          <w:p>
-            <w:pPr>
-              <w:spacing w:after="0" w:line="480" w:lineRule="auto"/>
-              <w:rPr>
-                <w:rFonts w:ascii="Times New Roman" w:eastAsia="Times New Roman" w:hAnsi="Times New Roman" w:cs="Times New Roman"/>
-                <w:kern w:val="0"/>
-                <w:sz w:val="20"/>
-                <w:szCs w:val="20"/>
-                <w14:ligatures w14:val="none"/>
-              </w:rPr>
-            </w:pPr>
-          </w:p>
-        </w:tc>
-        <w:tc>
-          <w:tcPr>
-            <w:tcW w:w="1360" w:type="dxa"/>
-            <w:tcBorders>
-              <w:top w:val="nil"/>
-              <w:left w:val="single" w:sz="4" w:space="0" w:color="auto"/>
-              <w:bottom w:val="single" w:sz="4" w:space="0" w:color="auto"/>
-              <w:right w:val="single" w:sz="4" w:space="0" w:color="auto"/>
-            </w:tcBorders>
-            <w:shd w:val="clear" w:color="auto" w:fill="auto"/>
-            <w:noWrap/>
-            <w:vAlign w:val="bottom"/>
-            <w:hideMark/>
-          </w:tcPr>
-          <w:p>
-            <w:pPr>
-              <w:spacing w:after="0" w:line="480" w:lineRule="auto"/>
-              <w:jc w:val="center"/>
-              <w:rPr>
-                <w:rFonts w:ascii="Aptos Narrow" w:eastAsia="Times New Roman" w:hAnsi="Aptos Narrow" w:cs="Times New Roman"/>
-                <w:color w:val="000000"/>
-                <w:kern w:val="0"/>
-                <w:sz w:val="22"/>
-                <w:szCs w:val="22"/>
-                <w14:ligatures w14:val="none"/>
-              </w:rPr>
-            </w:pPr>
-            <w:r>
-              <w:rPr>
-                <w:rFonts w:ascii="Aptos Narrow" w:eastAsia="Times New Roman" w:hAnsi="Aptos Narrow" w:cs="Times New Roman"/>
-                <w:color w:val="000000"/>
-                <w:kern w:val="0"/>
-                <w:sz w:val="22"/>
-                <w:szCs w:val="22"/>
-                <w14:ligatures w14:val="none"/>
-              </w:rPr>
-              <w:t>3.222</w:t>
-            </w:r>
-          </w:p>
-        </w:tc>
-        <w:tc>
-          <w:tcPr>
-            <w:tcW w:w="1360" w:type="dxa"/>
-            <w:tcBorders>
-              <w:top w:val="nil"/>
-              <w:left w:val="nil"/>
-              <w:bottom w:val="nil"/>
-              <w:right w:val="nil"/>
-            </w:tcBorders>
-            <w:shd w:val="clear" w:color="auto" w:fill="auto"/>
-            <w:noWrap/>
-            <w:vAlign w:val="bottom"/>
-            <w:hideMark/>
-          </w:tcPr>
-          <w:p>
-            <w:pPr>
-              <w:spacing w:after="0" w:line="480" w:lineRule="auto"/>
-              <w:jc w:val="center"/>
-              <w:rPr>
-                <w:rFonts w:ascii="Aptos Narrow" w:eastAsia="Times New Roman" w:hAnsi="Aptos Narrow" w:cs="Times New Roman"/>
-                <w:color w:val="000000"/>
-                <w:kern w:val="0"/>
-                <w:sz w:val="22"/>
-                <w:szCs w:val="22"/>
-                <w14:ligatures w14:val="none"/>
-              </w:rPr>
-            </w:pPr>
-          </w:p>
-        </w:tc>
-        <w:tc>
-          <w:tcPr>
-            <w:tcW w:w="1360" w:type="dxa"/>
-            <w:tcBorders>
-              <w:top w:val="nil"/>
-              <w:left w:val="single" w:sz="4" w:space="0" w:color="auto"/>
-              <w:bottom w:val="single" w:sz="4" w:space="0" w:color="auto"/>
-              <w:right w:val="single" w:sz="4" w:space="0" w:color="auto"/>
-            </w:tcBorders>
-            <w:shd w:val="clear" w:color="auto" w:fill="auto"/>
-            <w:noWrap/>
-            <w:vAlign w:val="bottom"/>
-            <w:hideMark/>
-          </w:tcPr>
-          <w:p>
-            <w:pPr>
-              <w:spacing w:after="0" w:line="480" w:lineRule="auto"/>
-              <w:jc w:val="center"/>
-              <w:rPr>
-                <w:rFonts w:ascii="Aptos Narrow" w:eastAsia="Times New Roman" w:hAnsi="Aptos Narrow" w:cs="Times New Roman"/>
-                <w:color w:val="000000"/>
-                <w:kern w:val="0"/>
-                <w:sz w:val="22"/>
-                <w:szCs w:val="22"/>
-                <w14:ligatures w14:val="none"/>
-              </w:rPr>
-            </w:pPr>
-            <w:r>
-              <w:rPr>
-                <w:rFonts w:ascii="Aptos Narrow" w:eastAsia="Times New Roman" w:hAnsi="Aptos Narrow" w:cs="Times New Roman"/>
-                <w:color w:val="000000"/>
-                <w:kern w:val="0"/>
-                <w:sz w:val="22"/>
-                <w:szCs w:val="22"/>
-                <w14:ligatures w14:val="none"/>
-              </w:rPr>
-              <w:t>53.564</w:t>
+                <w:rFonts w:ascii="Aptos Narrow" w:hAnsi="Aptos Narrow"/>
+                <w:color w:val="000000"/>
+                <w:sz w:val="22"/>
+                <w:szCs w:val="22"/>
+              </w:rPr>
+              <w:t>538.586</w:t>
             </w:r>
           </w:p>
         </w:tc>
@@ -4789,13 +4762,7 @@
               <w:rPr>
                 <w:rFonts w:ascii="Cambria Math" w:hAnsi="Cambria Math" w:cs="Times New Roman"/>
               </w:rPr>
-              <m:t>0.15</m:t>
-            </m:r>
-            <m:r>
-              <w:rPr>
-                <w:rFonts w:ascii="Cambria Math" w:hAnsi="Cambria Math" w:cs="Times New Roman"/>
-              </w:rPr>
-              <m:t>m</m:t>
+              <m:t>0.15m</m:t>
             </m:r>
           </m:num>
           <m:den>
@@ -4803,13 +4770,7 @@
               <w:rPr>
                 <w:rFonts w:ascii="Cambria Math" w:hAnsi="Cambria Math" w:cs="Times New Roman"/>
               </w:rPr>
-              <m:t>0.04582</m:t>
-            </m:r>
-            <m:r>
-              <w:rPr>
-                <w:rFonts w:ascii="Cambria Math" w:hAnsi="Cambria Math" w:cs="Times New Roman"/>
-              </w:rPr>
-              <m:t>m</m:t>
+              <m:t>0.04582m</m:t>
             </m:r>
           </m:den>
         </m:f>
@@ -4881,19 +4842,7 @@
               <w:rPr>
                 <w:rFonts w:ascii="Cambria Math" w:hAnsi="Cambria Math" w:cs="Times New Roman"/>
               </w:rPr>
-              <m:t>0.</m:t>
-            </m:r>
-            <m:r>
-              <w:rPr>
-                <w:rFonts w:ascii="Cambria Math" w:hAnsi="Cambria Math" w:cs="Times New Roman"/>
-              </w:rPr>
-              <m:t>24</m:t>
-            </m:r>
-            <m:r>
-              <w:rPr>
-                <w:rFonts w:ascii="Cambria Math" w:hAnsi="Cambria Math" w:cs="Times New Roman"/>
-              </w:rPr>
-              <m:t>m</m:t>
+              <m:t>0.24m</m:t>
             </m:r>
           </m:num>
           <m:den>
@@ -4901,19 +4850,7 @@
               <w:rPr>
                 <w:rFonts w:ascii="Cambria Math" w:hAnsi="Cambria Math" w:cs="Times New Roman"/>
               </w:rPr>
-              <m:t>0.0</m:t>
-            </m:r>
-            <m:r>
-              <w:rPr>
-                <w:rFonts w:ascii="Cambria Math" w:hAnsi="Cambria Math" w:cs="Times New Roman"/>
-              </w:rPr>
-              <m:t>7479</m:t>
-            </m:r>
-            <m:r>
-              <w:rPr>
-                <w:rFonts w:ascii="Cambria Math" w:hAnsi="Cambria Math" w:cs="Times New Roman"/>
-              </w:rPr>
-              <m:t>m</m:t>
+              <m:t>0.07479m</m:t>
             </m:r>
           </m:den>
         </m:f>
@@ -4985,19 +4922,7 @@
               <w:rPr>
                 <w:rFonts w:ascii="Cambria Math" w:hAnsi="Cambria Math" w:cs="Times New Roman"/>
               </w:rPr>
-              <m:t>0.</m:t>
-            </m:r>
-            <m:r>
-              <w:rPr>
-                <w:rFonts w:ascii="Cambria Math" w:hAnsi="Cambria Math" w:cs="Times New Roman"/>
-              </w:rPr>
-              <m:t>37</m:t>
-            </m:r>
-            <m:r>
-              <w:rPr>
-                <w:rFonts w:ascii="Cambria Math" w:hAnsi="Cambria Math" w:cs="Times New Roman"/>
-              </w:rPr>
-              <m:t>m</m:t>
+              <m:t>0.37m</m:t>
             </m:r>
           </m:num>
           <m:den>
@@ -5005,19 +4930,7 @@
               <w:rPr>
                 <w:rFonts w:ascii="Cambria Math" w:hAnsi="Cambria Math" w:cs="Times New Roman"/>
               </w:rPr>
-              <m:t>0.</m:t>
-            </m:r>
-            <m:r>
-              <w:rPr>
-                <w:rFonts w:ascii="Cambria Math" w:hAnsi="Cambria Math" w:cs="Times New Roman"/>
-              </w:rPr>
-              <m:t>10865</m:t>
-            </m:r>
-            <m:r>
-              <w:rPr>
-                <w:rFonts w:ascii="Cambria Math" w:hAnsi="Cambria Math" w:cs="Times New Roman"/>
-              </w:rPr>
-              <m:t>m</m:t>
+              <m:t>0.10865m</m:t>
             </m:r>
           </m:den>
         </m:f>
@@ -5025,13 +4938,7 @@
           <w:rPr>
             <w:rFonts w:ascii="Cambria Math" w:hAnsi="Cambria Math" w:cs="Times New Roman"/>
           </w:rPr>
-          <m:t>≈</m:t>
-        </m:r>
-        <m:r>
-          <w:rPr>
-            <w:rFonts w:ascii="Cambria Math" w:hAnsi="Cambria Math" w:cs="Times New Roman"/>
-          </w:rPr>
-          <m:t>3.41</m:t>
+          <m:t>≈3.41</m:t>
         </m:r>
       </m:oMath>
       <w:r>
@@ -5039,12 +4946,6 @@
           <w:rFonts w:ascii="Times New Roman" w:hAnsi="Times New Roman" w:cs="Times New Roman"/>
         </w:rPr>
         <w:br/>
-      </w:r>
-      <w:r>
-        <w:rPr>
-          <w:rFonts w:ascii="Times New Roman" w:hAnsi="Times New Roman" w:cs="Times New Roman"/>
-        </w:rPr>
-        <w:lastRenderedPageBreak/>
         <w:t>4.</w:t>
       </w:r>
       <w:r>
@@ -5101,13 +5002,7 @@
               <w:rPr>
                 <w:rFonts w:ascii="Cambria Math" w:hAnsi="Cambria Math" w:cs="Times New Roman"/>
               </w:rPr>
-              <m:t>0.5</m:t>
-            </m:r>
-            <m:r>
-              <w:rPr>
-                <w:rFonts w:ascii="Cambria Math" w:hAnsi="Cambria Math" w:cs="Times New Roman"/>
-              </w:rPr>
-              <m:t>m</m:t>
+              <m:t>0.5m</m:t>
             </m:r>
           </m:num>
           <m:den>
@@ -5115,19 +5010,7 @@
               <w:rPr>
                 <w:rFonts w:ascii="Cambria Math" w:hAnsi="Cambria Math" w:cs="Times New Roman"/>
               </w:rPr>
-              <m:t>0.</m:t>
-            </m:r>
-            <m:r>
-              <w:rPr>
-                <w:rFonts w:ascii="Cambria Math" w:hAnsi="Cambria Math" w:cs="Times New Roman"/>
-              </w:rPr>
-              <m:t>165</m:t>
-            </m:r>
-            <m:r>
-              <w:rPr>
-                <w:rFonts w:ascii="Cambria Math" w:hAnsi="Cambria Math" w:cs="Times New Roman"/>
-              </w:rPr>
-              <m:t>m</m:t>
+              <m:t>0.165m</m:t>
             </m:r>
           </m:den>
         </m:f>
@@ -5135,13 +5018,7 @@
           <w:rPr>
             <w:rFonts w:ascii="Cambria Math" w:hAnsi="Cambria Math" w:cs="Times New Roman"/>
           </w:rPr>
-          <m:t>≈</m:t>
-        </m:r>
-        <m:r>
-          <w:rPr>
-            <w:rFonts w:ascii="Cambria Math" w:hAnsi="Cambria Math" w:cs="Times New Roman"/>
-          </w:rPr>
-          <m:t>3.03</m:t>
+          <m:t>≈3.03</m:t>
         </m:r>
       </m:oMath>
       <w:r>
@@ -5205,13 +5082,7 @@
               <w:rPr>
                 <w:rFonts w:ascii="Cambria Math" w:hAnsi="Cambria Math" w:cs="Times New Roman"/>
               </w:rPr>
-              <m:t>0.67</m:t>
-            </m:r>
-            <m:r>
-              <w:rPr>
-                <w:rFonts w:ascii="Cambria Math" w:hAnsi="Cambria Math" w:cs="Times New Roman"/>
-              </w:rPr>
-              <m:t>m</m:t>
+              <m:t>0.67m</m:t>
             </m:r>
           </m:num>
           <m:den>
@@ -5219,19 +5090,7 @@
               <w:rPr>
                 <w:rFonts w:ascii="Cambria Math" w:hAnsi="Cambria Math" w:cs="Times New Roman"/>
               </w:rPr>
-              <m:t>0.</m:t>
-            </m:r>
-            <m:r>
-              <w:rPr>
-                <w:rFonts w:ascii="Cambria Math" w:hAnsi="Cambria Math" w:cs="Times New Roman"/>
-              </w:rPr>
-              <m:t>21</m:t>
-            </m:r>
-            <m:r>
-              <w:rPr>
-                <w:rFonts w:ascii="Cambria Math" w:hAnsi="Cambria Math" w:cs="Times New Roman"/>
-              </w:rPr>
-              <m:t>m</m:t>
+              <m:t>0.21m</m:t>
             </m:r>
           </m:den>
         </m:f>
@@ -5239,13 +5098,7 @@
           <w:rPr>
             <w:rFonts w:ascii="Cambria Math" w:hAnsi="Cambria Math" w:cs="Times New Roman"/>
           </w:rPr>
-          <m:t>≈</m:t>
-        </m:r>
-        <m:r>
-          <w:rPr>
-            <w:rFonts w:ascii="Cambria Math" w:hAnsi="Cambria Math" w:cs="Times New Roman"/>
-          </w:rPr>
-          <m:t>3.19</m:t>
+          <m:t>≈3.19</m:t>
         </m:r>
       </m:oMath>
       <w:r>
@@ -5523,13 +5376,7 @@
                       <w:rPr>
                         <w:rFonts w:ascii="Cambria Math" w:hAnsi="Cambria Math" w:cs="Times New Roman"/>
                       </w:rPr>
-                      <m:t>0.04582</m:t>
-                    </m:r>
-                    <m:r>
-                      <w:rPr>
-                        <w:rFonts w:ascii="Cambria Math" w:hAnsi="Cambria Math" w:cs="Times New Roman"/>
-                      </w:rPr>
-                      <m:t>m</m:t>
+                      <m:t>0.04582m</m:t>
                     </m:r>
                   </m:num>
                   <m:den>
@@ -5632,6 +5479,12 @@
           <w:rFonts w:ascii="Times New Roman" w:hAnsi="Times New Roman" w:cs="Times New Roman"/>
         </w:rPr>
         <w:br/>
+      </w:r>
+      <w:r>
+        <w:rPr>
+          <w:rFonts w:ascii="Times New Roman" w:hAnsi="Times New Roman" w:cs="Times New Roman"/>
+        </w:rPr>
+        <w:lastRenderedPageBreak/>
         <w:t>2.</w:t>
       </w:r>
       <w:r>
@@ -5716,19 +5569,7 @@
                       <w:rPr>
                         <w:rFonts w:ascii="Cambria Math" w:hAnsi="Cambria Math" w:cs="Times New Roman"/>
                       </w:rPr>
-                      <m:t>0</m:t>
-                    </m:r>
-                    <m:r>
-                      <w:rPr>
-                        <w:rFonts w:ascii="Cambria Math" w:hAnsi="Cambria Math" w:cs="Times New Roman"/>
-                      </w:rPr>
-                      <m:t>.07479</m:t>
-                    </m:r>
-                    <m:r>
-                      <w:rPr>
-                        <w:rFonts w:ascii="Cambria Math" w:hAnsi="Cambria Math" w:cs="Times New Roman"/>
-                      </w:rPr>
-                      <m:t>m</m:t>
+                      <m:t>0.07479m</m:t>
                     </m:r>
                   </m:num>
                   <m:den>
@@ -5756,13 +5597,7 @@
           <w:rPr>
             <w:rFonts w:ascii="Cambria Math" w:hAnsi="Cambria Math" w:cs="Times New Roman"/>
           </w:rPr>
-          <m:t>=</m:t>
-        </m:r>
-        <m:r>
-          <w:rPr>
-            <w:rFonts w:ascii="Cambria Math" w:hAnsi="Cambria Math" w:cs="Times New Roman"/>
-          </w:rPr>
-          <m:t xml:space="preserve"> </m:t>
+          <m:t xml:space="preserve">= </m:t>
         </m:r>
         <m:sSup>
           <m:sSupPr>
@@ -5786,21 +5621,7 @@
                 <w:szCs w:val="22"/>
                 <w14:ligatures w14:val="none"/>
               </w:rPr>
-              <m:t>0.001398386</m:t>
-            </m:r>
-            <m:r>
-              <m:rPr>
-                <m:sty m:val="p"/>
-              </m:rPr>
-              <w:rPr>
-                <w:rFonts w:ascii="Cambria Math" w:eastAsia="Times New Roman" w:hAnsi="Cambria Math" w:cs="Times New Roman"/>
-                <w:color w:val="000000"/>
-                <w:kern w:val="0"/>
-                <w:sz w:val="22"/>
-                <w:szCs w:val="22"/>
-                <w14:ligatures w14:val="none"/>
-              </w:rPr>
-              <m:t xml:space="preserve"> </m:t>
+              <m:t xml:space="preserve">0.001398386 </m:t>
             </m:r>
             <m:r>
               <w:rPr>
@@ -5908,19 +5729,7 @@
                       <w:rPr>
                         <w:rFonts w:ascii="Cambria Math" w:hAnsi="Cambria Math" w:cs="Times New Roman"/>
                       </w:rPr>
-                      <m:t>0</m:t>
-                    </m:r>
-                    <m:r>
-                      <w:rPr>
-                        <w:rFonts w:ascii="Cambria Math" w:hAnsi="Cambria Math" w:cs="Times New Roman"/>
-                      </w:rPr>
-                      <m:t>.10865</m:t>
-                    </m:r>
-                    <m:r>
-                      <w:rPr>
-                        <w:rFonts w:ascii="Cambria Math" w:hAnsi="Cambria Math" w:cs="Times New Roman"/>
-                      </w:rPr>
-                      <m:t>m</m:t>
+                      <m:t>0.10865m</m:t>
                     </m:r>
                   </m:num>
                   <m:den>
@@ -6110,19 +5919,7 @@
                       <w:rPr>
                         <w:rFonts w:ascii="Cambria Math" w:hAnsi="Cambria Math" w:cs="Times New Roman"/>
                       </w:rPr>
-                      <m:t>0.</m:t>
-                    </m:r>
-                    <m:r>
-                      <w:rPr>
-                        <w:rFonts w:ascii="Cambria Math" w:hAnsi="Cambria Math" w:cs="Times New Roman"/>
-                      </w:rPr>
-                      <m:t>165</m:t>
-                    </m:r>
-                    <m:r>
-                      <w:rPr>
-                        <w:rFonts w:ascii="Cambria Math" w:hAnsi="Cambria Math" w:cs="Times New Roman"/>
-                      </w:rPr>
-                      <m:t>m</m:t>
+                      <m:t>0.165m</m:t>
                     </m:r>
                   </m:num>
                   <m:den>
@@ -6189,13 +5986,7 @@
               <w:rPr>
                 <w:rFonts w:ascii="Cambria Math" w:hAnsi="Cambria Math" w:cs="Times New Roman"/>
               </w:rPr>
-              <m:t xml:space="preserve"> </m:t>
-            </m:r>
-            <m:r>
-              <w:rPr>
-                <w:rFonts w:ascii="Cambria Math" w:hAnsi="Cambria Math" w:cs="Times New Roman"/>
-              </w:rPr>
-              <m:t>m</m:t>
+              <m:t xml:space="preserve"> m</m:t>
             </m:r>
           </m:e>
           <m:sup>
@@ -6297,19 +6088,7 @@
                       <w:rPr>
                         <w:rFonts w:ascii="Cambria Math" w:hAnsi="Cambria Math" w:cs="Times New Roman"/>
                       </w:rPr>
-                      <m:t>0.</m:t>
-                    </m:r>
-                    <m:r>
-                      <w:rPr>
-                        <w:rFonts w:ascii="Cambria Math" w:hAnsi="Cambria Math" w:cs="Times New Roman"/>
-                      </w:rPr>
-                      <m:t>21</m:t>
-                    </m:r>
-                    <m:r>
-                      <w:rPr>
-                        <w:rFonts w:ascii="Cambria Math" w:hAnsi="Cambria Math" w:cs="Times New Roman"/>
-                      </w:rPr>
-                      <m:t>m</m:t>
+                      <m:t>0.21m</m:t>
                     </m:r>
                   </m:num>
                   <m:den>
@@ -6400,9 +6179,14 @@
     </w:p>
     <w:p>
       <w:pPr>
-        <w:spacing w:line="480" w:lineRule="auto"/>
-        <w:rPr>
-          <w:rFonts w:ascii="Times New Roman" w:hAnsi="Times New Roman" w:cs="Times New Roman"/>
+        <w:spacing w:after="0" w:line="240" w:lineRule="auto"/>
+        <w:rPr>
+          <w:rFonts w:ascii="Aptos Narrow" w:eastAsia="Times New Roman" w:hAnsi="Aptos Narrow" w:cs="Times New Roman"/>
+          <w:color w:val="000000"/>
+          <w:kern w:val="0"/>
+          <w:sz w:val="22"/>
+          <w:szCs w:val="22"/>
+          <w14:ligatures w14:val="none"/>
         </w:rPr>
       </w:pPr>
       <w:r>
@@ -6519,19 +6303,7 @@
           <w:rPr>
             <w:rFonts w:ascii="Cambria Math" w:hAnsi="Cambria Math" w:cs="Times New Roman"/>
           </w:rPr>
-          <m:t>=</m:t>
-        </m:r>
-        <m:r>
-          <w:rPr>
-            <w:rFonts w:ascii="Cambria Math" w:hAnsi="Cambria Math" w:cs="Times New Roman"/>
-          </w:rPr>
-          <m:t>π</m:t>
-        </m:r>
-        <m:r>
-          <w:rPr>
-            <w:rFonts w:ascii="Cambria Math" w:hAnsi="Cambria Math" w:cs="Times New Roman"/>
-          </w:rPr>
-          <m:t>×</m:t>
+          <m:t>=π×</m:t>
         </m:r>
         <m:r>
           <m:rPr>
@@ -6586,7 +6358,7 @@
           <w:rPr>
             <w:rFonts w:ascii="Cambria Math" w:hAnsi="Cambria Math" w:cs="Times New Roman"/>
           </w:rPr>
-          <m:t>×0.1777m=</m:t>
+          <m:t>×</m:t>
         </m:r>
         <m:r>
           <m:rPr>
@@ -6600,7 +6372,27 @@
             <w:szCs w:val="22"/>
             <w14:ligatures w14:val="none"/>
           </w:rPr>
-          <m:t xml:space="preserve">0.0003 </m:t>
+          <m:t>0.01777</m:t>
+        </m:r>
+        <m:r>
+          <w:rPr>
+            <w:rFonts w:ascii="Cambria Math" w:hAnsi="Cambria Math" w:cs="Times New Roman"/>
+          </w:rPr>
+          <m:t>m=</m:t>
+        </m:r>
+        <m:r>
+          <m:rPr>
+            <m:sty m:val="p"/>
+          </m:rPr>
+          <w:rPr>
+            <w:rFonts w:ascii="Cambria Math" w:eastAsia="Times New Roman" w:hAnsi="Cambria Math" w:cs="Times New Roman"/>
+            <w:color w:val="000000"/>
+            <w:kern w:val="0"/>
+            <w:sz w:val="22"/>
+            <w:szCs w:val="22"/>
+            <w14:ligatures w14:val="none"/>
+          </w:rPr>
+          <m:t xml:space="preserve">0.000029 </m:t>
         </m:r>
         <m:r>
           <w:rPr>
@@ -6680,14 +6472,48 @@
           <w:rPr>
             <w:rFonts w:ascii="Cambria Math" w:hAnsi="Cambria Math" w:cs="Times New Roman"/>
           </w:rPr>
-          <m:t>=</m:t>
+          <m:t>=π×</m:t>
         </m:r>
         <m:r>
+          <m:rPr>
+            <m:sty m:val="p"/>
+          </m:rPr>
           <w:rPr>
-            <w:rFonts w:ascii="Cambria Math" w:hAnsi="Cambria Math" w:cs="Times New Roman"/>
+            <w:rFonts w:ascii="Cambria Math" w:eastAsia="Times New Roman" w:hAnsi="Cambria Math" w:cs="Times New Roman"/>
+            <w:color w:val="000000"/>
+            <w:kern w:val="0"/>
+            <w:sz w:val="22"/>
+            <w:szCs w:val="22"/>
+            <w14:ligatures w14:val="none"/>
           </w:rPr>
-          <m:t>π</m:t>
+          <m:t>0.001398386</m:t>
         </m:r>
+        <m:sSup>
+          <m:sSupPr>
+            <m:ctrlPr>
+              <w:rPr>
+                <w:rFonts w:ascii="Cambria Math" w:hAnsi="Cambria Math" w:cs="Times New Roman"/>
+                <w:i/>
+              </w:rPr>
+            </m:ctrlPr>
+          </m:sSupPr>
+          <m:e>
+            <m:r>
+              <w:rPr>
+                <w:rFonts w:ascii="Cambria Math" w:hAnsi="Cambria Math" w:cs="Times New Roman"/>
+              </w:rPr>
+              <m:t>m</m:t>
+            </m:r>
+          </m:e>
+          <m:sup>
+            <m:r>
+              <w:rPr>
+                <w:rFonts w:ascii="Cambria Math" w:hAnsi="Cambria Math" w:cs="Times New Roman"/>
+              </w:rPr>
+              <m:t>2</m:t>
+            </m:r>
+          </m:sup>
+        </m:sSup>
         <m:r>
           <w:rPr>
             <w:rFonts w:ascii="Cambria Math" w:hAnsi="Cambria Math" w:cs="Times New Roman"/>
@@ -6706,73 +6532,24 @@
             <w:szCs w:val="22"/>
             <w14:ligatures w14:val="none"/>
           </w:rPr>
-          <m:t>0.001398386</m:t>
-        </m:r>
-        <m:sSup>
-          <m:sSupPr>
-            <m:ctrlPr>
-              <w:rPr>
-                <w:rFonts w:ascii="Cambria Math" w:hAnsi="Cambria Math" w:cs="Times New Roman"/>
-                <w:i/>
-              </w:rPr>
-            </m:ctrlPr>
-          </m:sSupPr>
-          <m:e>
-            <m:r>
-              <w:rPr>
-                <w:rFonts w:ascii="Cambria Math" w:hAnsi="Cambria Math" w:cs="Times New Roman"/>
-              </w:rPr>
-              <m:t>m</m:t>
-            </m:r>
-          </m:e>
-          <m:sup>
-            <m:r>
-              <w:rPr>
-                <w:rFonts w:ascii="Cambria Math" w:hAnsi="Cambria Math" w:cs="Times New Roman"/>
-              </w:rPr>
-              <m:t>2</m:t>
-            </m:r>
-          </m:sup>
-        </m:sSup>
-        <m:r>
-          <w:rPr>
-            <w:rFonts w:ascii="Cambria Math" w:hAnsi="Cambria Math" w:cs="Times New Roman"/>
-          </w:rPr>
-          <m:t>×0.1777</m:t>
+          <m:t>0.01777</m:t>
         </m:r>
         <m:r>
           <w:rPr>
             <w:rFonts w:ascii="Cambria Math" w:hAnsi="Cambria Math" w:cs="Times New Roman"/>
           </w:rPr>
-          <m:t>m</m:t>
-        </m:r>
-        <m:r>
-          <w:rPr>
-            <w:rFonts w:ascii="Cambria Math" w:hAnsi="Cambria Math" w:cs="Times New Roman"/>
-          </w:rPr>
-          <m:t>=</m:t>
-        </m:r>
-        <m:r>
-          <w:rPr>
-            <w:rFonts w:ascii="Cambria Math" w:hAnsi="Cambria Math" w:cs="Times New Roman"/>
-          </w:rPr>
-          <m:t xml:space="preserve"> </m:t>
-        </m:r>
-        <m:r>
-          <m:rPr>
-            <m:sty m:val="p"/>
-          </m:rPr>
-          <w:rPr>
-            <w:rFonts w:ascii="Cambria Math" w:eastAsia="Times New Roman" w:hAnsi="Cambria Math" w:cs="Times New Roman"/>
-            <w:color w:val="000000"/>
-            <w:kern w:val="0"/>
-            <w:sz w:val="22"/>
-            <w:szCs w:val="22"/>
-            <w14:ligatures w14:val="none"/>
-          </w:rPr>
-          <m:t>0.0008</m:t>
+          <m:t xml:space="preserve">m= </m:t>
         </m:r>
       </m:oMath>
+      <w:r>
+        <w:rPr>
+          <w:rFonts w:ascii="Aptos Narrow" w:hAnsi="Aptos Narrow"/>
+          <w:color w:val="000000"/>
+          <w:sz w:val="22"/>
+          <w:szCs w:val="22"/>
+        </w:rPr>
+        <w:t>0.000078</w:t>
+      </w:r>
       <w:r>
         <w:rPr>
           <w:rFonts w:ascii="Cambria Math" w:eastAsiaTheme="minorEastAsia" w:hAnsi="Cambria Math" w:cs="Times New Roman"/>
@@ -6853,19 +6630,7 @@
           <w:rPr>
             <w:rFonts w:ascii="Cambria Math" w:hAnsi="Cambria Math" w:cs="Times New Roman"/>
           </w:rPr>
-          <m:t>=</m:t>
-        </m:r>
-        <m:r>
-          <w:rPr>
-            <w:rFonts w:ascii="Cambria Math" w:hAnsi="Cambria Math" w:cs="Times New Roman"/>
-          </w:rPr>
-          <m:t>π</m:t>
-        </m:r>
-        <m:r>
-          <w:rPr>
-            <w:rFonts w:ascii="Cambria Math" w:hAnsi="Cambria Math" w:cs="Times New Roman"/>
-          </w:rPr>
-          <m:t>×</m:t>
+          <m:t>=π×</m:t>
         </m:r>
         <m:r>
           <w:rPr>
@@ -6917,19 +6682,7 @@
           <w:rPr>
             <w:rFonts w:ascii="Cambria Math" w:hAnsi="Cambria Math" w:cs="Times New Roman"/>
           </w:rPr>
-          <m:t>×0.1777</m:t>
-        </m:r>
-        <m:r>
-          <w:rPr>
-            <w:rFonts w:ascii="Cambria Math" w:hAnsi="Cambria Math" w:cs="Times New Roman"/>
-          </w:rPr>
-          <m:t>m</m:t>
-        </m:r>
-        <m:r>
-          <w:rPr>
-            <w:rFonts w:ascii="Cambria Math" w:hAnsi="Cambria Math" w:cs="Times New Roman"/>
-          </w:rPr>
-          <m:t>=</m:t>
+          <m:t>×</m:t>
         </m:r>
         <m:r>
           <m:rPr>
@@ -6943,7 +6696,179 @@
             <w:szCs w:val="22"/>
             <w14:ligatures w14:val="none"/>
           </w:rPr>
-          <m:t>0.0016</m:t>
+          <m:t>0.01777</m:t>
+        </m:r>
+        <m:r>
+          <w:rPr>
+            <w:rFonts w:ascii="Cambria Math" w:hAnsi="Cambria Math" w:cs="Times New Roman"/>
+          </w:rPr>
+          <m:t>m=</m:t>
+        </m:r>
+        <m:r>
+          <m:rPr>
+            <m:sty m:val="p"/>
+          </m:rPr>
+          <w:rPr>
+            <w:rFonts w:ascii="Cambria Math" w:hAnsi="Cambria Math"/>
+            <w:color w:val="000000"/>
+            <w:sz w:val="22"/>
+            <w:szCs w:val="22"/>
+          </w:rPr>
+          <m:t>0.000165</m:t>
+        </m:r>
+        <m:sSup>
+          <m:sSupPr>
+            <m:ctrlPr>
+              <w:rPr>
+                <w:rFonts w:ascii="Cambria Math" w:hAnsi="Cambria Math" w:cs="Times New Roman"/>
+                <w:i/>
+              </w:rPr>
+            </m:ctrlPr>
+          </m:sSupPr>
+          <m:e>
+            <m:r>
+              <w:rPr>
+                <w:rFonts w:ascii="Cambria Math" w:hAnsi="Cambria Math" w:cs="Times New Roman"/>
+              </w:rPr>
+              <m:t>m</m:t>
+            </m:r>
+          </m:e>
+          <m:sup>
+            <m:r>
+              <w:rPr>
+                <w:rFonts w:ascii="Cambria Math" w:hAnsi="Cambria Math" w:cs="Times New Roman"/>
+              </w:rPr>
+              <m:t>3</m:t>
+            </m:r>
+          </m:sup>
+        </m:sSup>
+      </m:oMath>
+      <w:r>
+        <w:rPr>
+          <w:rFonts w:ascii="Times New Roman" w:hAnsi="Times New Roman" w:cs="Times New Roman"/>
+        </w:rPr>
+        <w:br/>
+        <w:t>4.</w:t>
+      </w:r>
+      <w:r>
+        <w:rPr>
+          <w:rFonts w:ascii="Cambria Math" w:hAnsi="Cambria Math" w:cs="Times New Roman"/>
+          <w:i/>
+        </w:rPr>
+        <w:t xml:space="preserve"> </w:t>
+      </w:r>
+      <m:oMath>
+        <m:sSub>
+          <m:sSubPr>
+            <m:ctrlPr>
+              <w:rPr>
+                <w:rFonts w:ascii="Cambria Math" w:hAnsi="Cambria Math" w:cs="Times New Roman"/>
+                <w:i/>
+              </w:rPr>
+            </m:ctrlPr>
+          </m:sSubPr>
+          <m:e>
+            <m:r>
+              <w:rPr>
+                <w:rFonts w:ascii="Cambria Math" w:hAnsi="Cambria Math" w:cs="Times New Roman"/>
+              </w:rPr>
+              <m:t>V</m:t>
+            </m:r>
+          </m:e>
+          <m:sub>
+            <m:r>
+              <w:rPr>
+                <w:rFonts w:ascii="Cambria Math" w:hAnsi="Cambria Math" w:cs="Times New Roman"/>
+              </w:rPr>
+              <m:t>4</m:t>
+            </m:r>
+          </m:sub>
+        </m:sSub>
+        <m:r>
+          <w:rPr>
+            <w:rFonts w:ascii="Cambria Math" w:hAnsi="Cambria Math" w:cs="Times New Roman"/>
+          </w:rPr>
+          <m:t>=π×</m:t>
+        </m:r>
+        <m:r>
+          <m:rPr>
+            <m:sty m:val="p"/>
+          </m:rPr>
+          <w:rPr>
+            <w:rFonts w:ascii="Cambria Math" w:eastAsia="Times New Roman" w:hAnsi="Cambria Math" w:cs="Times New Roman"/>
+            <w:color w:val="000000"/>
+            <w:kern w:val="0"/>
+            <w:sz w:val="22"/>
+            <w:szCs w:val="22"/>
+            <w14:ligatures w14:val="none"/>
+          </w:rPr>
+          <m:t>0.00680625</m:t>
+        </m:r>
+        <m:sSup>
+          <m:sSupPr>
+            <m:ctrlPr>
+              <w:rPr>
+                <w:rFonts w:ascii="Cambria Math" w:hAnsi="Cambria Math" w:cs="Times New Roman"/>
+                <w:i/>
+              </w:rPr>
+            </m:ctrlPr>
+          </m:sSupPr>
+          <m:e>
+            <m:r>
+              <w:rPr>
+                <w:rFonts w:ascii="Cambria Math" w:hAnsi="Cambria Math" w:cs="Times New Roman"/>
+              </w:rPr>
+              <m:t>m</m:t>
+            </m:r>
+          </m:e>
+          <m:sup>
+            <m:r>
+              <w:rPr>
+                <w:rFonts w:ascii="Cambria Math" w:hAnsi="Cambria Math" w:cs="Times New Roman"/>
+              </w:rPr>
+              <m:t>2</m:t>
+            </m:r>
+          </m:sup>
+        </m:sSup>
+        <m:r>
+          <w:rPr>
+            <w:rFonts w:ascii="Cambria Math" w:hAnsi="Cambria Math" w:cs="Times New Roman"/>
+          </w:rPr>
+          <m:t>×</m:t>
+        </m:r>
+        <m:r>
+          <m:rPr>
+            <m:sty m:val="p"/>
+          </m:rPr>
+          <w:rPr>
+            <w:rFonts w:ascii="Cambria Math" w:eastAsia="Times New Roman" w:hAnsi="Cambria Math" w:cs="Times New Roman"/>
+            <w:color w:val="000000"/>
+            <w:kern w:val="0"/>
+            <w:sz w:val="22"/>
+            <w:szCs w:val="22"/>
+            <w14:ligatures w14:val="none"/>
+          </w:rPr>
+          <m:t>0.01777</m:t>
+        </m:r>
+        <m:r>
+          <w:rPr>
+            <w:rFonts w:ascii="Cambria Math" w:hAnsi="Cambria Math" w:cs="Times New Roman"/>
+          </w:rPr>
+          <m:t>m=</m:t>
+        </m:r>
+        <m:r>
+          <m:rPr>
+            <m:sty m:val="p"/>
+          </m:rPr>
+          <w:rPr>
+            <w:rFonts w:ascii="Cambria Math" w:eastAsia="Times New Roman" w:hAnsi="Cambria Math" w:cs="Times New Roman"/>
+            <w:color w:val="000000"/>
+            <w:kern w:val="0"/>
+            <w:sz w:val="22"/>
+            <w:szCs w:val="22"/>
+            <w14:ligatures w14:val="none"/>
+          </w:rPr>
+          <m:t>0.00038</m:t>
         </m:r>
         <m:r>
           <m:rPr>
@@ -6991,7 +6916,7 @@
           <w:rFonts w:ascii="Times New Roman" w:hAnsi="Times New Roman" w:cs="Times New Roman"/>
         </w:rPr>
         <w:br/>
-        <w:t>4.</w:t>
+        <w:t>5.</w:t>
       </w:r>
       <w:r>
         <w:rPr>
@@ -7023,7 +6948,7 @@
               <w:rPr>
                 <w:rFonts w:ascii="Cambria Math" w:hAnsi="Cambria Math" w:cs="Times New Roman"/>
               </w:rPr>
-              <m:t>4</m:t>
+              <m:t>5</m:t>
             </m:r>
           </m:sub>
         </m:sSub>
@@ -7031,14 +6956,48 @@
           <w:rPr>
             <w:rFonts w:ascii="Cambria Math" w:hAnsi="Cambria Math" w:cs="Times New Roman"/>
           </w:rPr>
-          <m:t>=</m:t>
+          <m:t>=π×</m:t>
         </m:r>
         <m:r>
+          <m:rPr>
+            <m:sty m:val="p"/>
+          </m:rPr>
           <w:rPr>
-            <w:rFonts w:ascii="Cambria Math" w:hAnsi="Cambria Math" w:cs="Times New Roman"/>
+            <w:rFonts w:ascii="Cambria Math" w:eastAsia="Times New Roman" w:hAnsi="Cambria Math" w:cs="Times New Roman"/>
+            <w:color w:val="000000"/>
+            <w:kern w:val="0"/>
+            <w:sz w:val="22"/>
+            <w:szCs w:val="22"/>
+            <w14:ligatures w14:val="none"/>
           </w:rPr>
-          <m:t>π</m:t>
+          <m:t>0.011025</m:t>
         </m:r>
+        <m:sSup>
+          <m:sSupPr>
+            <m:ctrlPr>
+              <w:rPr>
+                <w:rFonts w:ascii="Cambria Math" w:hAnsi="Cambria Math" w:cs="Times New Roman"/>
+                <w:i/>
+              </w:rPr>
+            </m:ctrlPr>
+          </m:sSupPr>
+          <m:e>
+            <m:r>
+              <w:rPr>
+                <w:rFonts w:ascii="Cambria Math" w:hAnsi="Cambria Math" w:cs="Times New Roman"/>
+              </w:rPr>
+              <m:t>m</m:t>
+            </m:r>
+          </m:e>
+          <m:sup>
+            <m:r>
+              <w:rPr>
+                <w:rFonts w:ascii="Cambria Math" w:hAnsi="Cambria Math" w:cs="Times New Roman"/>
+              </w:rPr>
+              <m:t>2</m:t>
+            </m:r>
+          </m:sup>
+        </m:sSup>
         <m:r>
           <w:rPr>
             <w:rFonts w:ascii="Cambria Math" w:hAnsi="Cambria Math" w:cs="Times New Roman"/>
@@ -7057,51 +7016,13 @@
             <w:szCs w:val="22"/>
             <w14:ligatures w14:val="none"/>
           </w:rPr>
-          <m:t>0.00680625</m:t>
-        </m:r>
-        <m:sSup>
-          <m:sSupPr>
-            <m:ctrlPr>
-              <w:rPr>
-                <w:rFonts w:ascii="Cambria Math" w:hAnsi="Cambria Math" w:cs="Times New Roman"/>
-                <w:i/>
-              </w:rPr>
-            </m:ctrlPr>
-          </m:sSupPr>
-          <m:e>
-            <m:r>
-              <w:rPr>
-                <w:rFonts w:ascii="Cambria Math" w:hAnsi="Cambria Math" w:cs="Times New Roman"/>
-              </w:rPr>
-              <m:t>m</m:t>
-            </m:r>
-          </m:e>
-          <m:sup>
-            <m:r>
-              <w:rPr>
-                <w:rFonts w:ascii="Cambria Math" w:hAnsi="Cambria Math" w:cs="Times New Roman"/>
-              </w:rPr>
-              <m:t>2</m:t>
-            </m:r>
-          </m:sup>
-        </m:sSup>
-        <m:r>
-          <w:rPr>
-            <w:rFonts w:ascii="Cambria Math" w:hAnsi="Cambria Math" w:cs="Times New Roman"/>
-          </w:rPr>
-          <m:t>×0.1777</m:t>
+          <m:t>0.01777</m:t>
         </m:r>
         <m:r>
           <w:rPr>
             <w:rFonts w:ascii="Cambria Math" w:hAnsi="Cambria Math" w:cs="Times New Roman"/>
           </w:rPr>
-          <m:t>m</m:t>
-        </m:r>
-        <m:r>
-          <w:rPr>
-            <w:rFonts w:ascii="Cambria Math" w:hAnsi="Cambria Math" w:cs="Times New Roman"/>
-          </w:rPr>
-          <m:t>=</m:t>
+          <m:t>m=</m:t>
         </m:r>
         <m:r>
           <m:rPr>
@@ -7115,179 +7036,7 @@
             <w:szCs w:val="22"/>
             <w14:ligatures w14:val="none"/>
           </w:rPr>
-          <m:t>0.0038</m:t>
-        </m:r>
-        <m:r>
-          <m:rPr>
-            <m:sty m:val="p"/>
-          </m:rPr>
-          <w:rPr>
-            <w:rFonts w:ascii="Cambria Math" w:eastAsia="Times New Roman" w:hAnsi="Aptos Narrow" w:cs="Times New Roman"/>
-            <w:color w:val="000000"/>
-            <w:kern w:val="0"/>
-            <w:sz w:val="22"/>
-            <w:szCs w:val="22"/>
-            <w14:ligatures w14:val="none"/>
-          </w:rPr>
-          <m:t xml:space="preserve"> </m:t>
-        </m:r>
-        <m:sSup>
-          <m:sSupPr>
-            <m:ctrlPr>
-              <w:rPr>
-                <w:rFonts w:ascii="Cambria Math" w:hAnsi="Cambria Math" w:cs="Times New Roman"/>
-                <w:i/>
-              </w:rPr>
-            </m:ctrlPr>
-          </m:sSupPr>
-          <m:e>
-            <m:r>
-              <w:rPr>
-                <w:rFonts w:ascii="Cambria Math" w:hAnsi="Cambria Math" w:cs="Times New Roman"/>
-              </w:rPr>
-              <m:t>m</m:t>
-            </m:r>
-          </m:e>
-          <m:sup>
-            <m:r>
-              <w:rPr>
-                <w:rFonts w:ascii="Cambria Math" w:hAnsi="Cambria Math" w:cs="Times New Roman"/>
-              </w:rPr>
-              <m:t>3</m:t>
-            </m:r>
-          </m:sup>
-        </m:sSup>
-      </m:oMath>
-      <w:r>
-        <w:rPr>
-          <w:rFonts w:ascii="Times New Roman" w:hAnsi="Times New Roman" w:cs="Times New Roman"/>
-        </w:rPr>
-        <w:br/>
-        <w:t>5.</w:t>
-      </w:r>
-      <w:r>
-        <w:rPr>
-          <w:rFonts w:ascii="Cambria Math" w:hAnsi="Cambria Math" w:cs="Times New Roman"/>
-          <w:i/>
-        </w:rPr>
-        <w:t xml:space="preserve"> </w:t>
-      </w:r>
-      <m:oMath>
-        <m:sSub>
-          <m:sSubPr>
-            <m:ctrlPr>
-              <w:rPr>
-                <w:rFonts w:ascii="Cambria Math" w:hAnsi="Cambria Math" w:cs="Times New Roman"/>
-                <w:i/>
-              </w:rPr>
-            </m:ctrlPr>
-          </m:sSubPr>
-          <m:e>
-            <m:r>
-              <w:rPr>
-                <w:rFonts w:ascii="Cambria Math" w:hAnsi="Cambria Math" w:cs="Times New Roman"/>
-              </w:rPr>
-              <m:t>V</m:t>
-            </m:r>
-          </m:e>
-          <m:sub>
-            <m:r>
-              <w:rPr>
-                <w:rFonts w:ascii="Cambria Math" w:hAnsi="Cambria Math" w:cs="Times New Roman"/>
-              </w:rPr>
-              <m:t>5</m:t>
-            </m:r>
-          </m:sub>
-        </m:sSub>
-        <m:r>
-          <w:rPr>
-            <w:rFonts w:ascii="Cambria Math" w:hAnsi="Cambria Math" w:cs="Times New Roman"/>
-          </w:rPr>
-          <m:t>=</m:t>
-        </m:r>
-        <m:r>
-          <w:rPr>
-            <w:rFonts w:ascii="Cambria Math" w:hAnsi="Cambria Math" w:cs="Times New Roman"/>
-          </w:rPr>
-          <m:t>π</m:t>
-        </m:r>
-        <m:r>
-          <w:rPr>
-            <w:rFonts w:ascii="Cambria Math" w:hAnsi="Cambria Math" w:cs="Times New Roman"/>
-          </w:rPr>
-          <m:t>×</m:t>
-        </m:r>
-        <m:r>
-          <m:rPr>
-            <m:sty m:val="p"/>
-          </m:rPr>
-          <w:rPr>
-            <w:rFonts w:ascii="Cambria Math" w:eastAsia="Times New Roman" w:hAnsi="Cambria Math" w:cs="Times New Roman"/>
-            <w:color w:val="000000"/>
-            <w:kern w:val="0"/>
-            <w:sz w:val="22"/>
-            <w:szCs w:val="22"/>
-            <w14:ligatures w14:val="none"/>
-          </w:rPr>
-          <m:t>0.011025</m:t>
-        </m:r>
-        <m:sSup>
-          <m:sSupPr>
-            <m:ctrlPr>
-              <w:rPr>
-                <w:rFonts w:ascii="Cambria Math" w:hAnsi="Cambria Math" w:cs="Times New Roman"/>
-                <w:i/>
-              </w:rPr>
-            </m:ctrlPr>
-          </m:sSupPr>
-          <m:e>
-            <m:r>
-              <w:rPr>
-                <w:rFonts w:ascii="Cambria Math" w:hAnsi="Cambria Math" w:cs="Times New Roman"/>
-              </w:rPr>
-              <m:t>m</m:t>
-            </m:r>
-          </m:e>
-          <m:sup>
-            <m:r>
-              <w:rPr>
-                <w:rFonts w:ascii="Cambria Math" w:hAnsi="Cambria Math" w:cs="Times New Roman"/>
-              </w:rPr>
-              <m:t>2</m:t>
-            </m:r>
-          </m:sup>
-        </m:sSup>
-        <m:r>
-          <w:rPr>
-            <w:rFonts w:ascii="Cambria Math" w:hAnsi="Cambria Math" w:cs="Times New Roman"/>
-          </w:rPr>
-          <m:t>×0.1777</m:t>
-        </m:r>
-        <m:r>
-          <w:rPr>
-            <w:rFonts w:ascii="Cambria Math" w:hAnsi="Cambria Math" w:cs="Times New Roman"/>
-          </w:rPr>
-          <m:t>m</m:t>
-        </m:r>
-        <m:r>
-          <w:rPr>
-            <w:rFonts w:ascii="Cambria Math" w:hAnsi="Cambria Math" w:cs="Times New Roman"/>
-          </w:rPr>
-          <m:t>=</m:t>
-        </m:r>
-        <m:r>
-          <m:rPr>
-            <m:sty m:val="p"/>
-          </m:rPr>
-          <w:rPr>
-            <w:rFonts w:ascii="Cambria Math" w:eastAsia="Times New Roman" w:hAnsi="Cambria Math" w:cs="Times New Roman"/>
-            <w:color w:val="000000"/>
-            <w:kern w:val="0"/>
-            <w:sz w:val="22"/>
-            <w:szCs w:val="22"/>
-            <w14:ligatures w14:val="none"/>
-          </w:rPr>
-          <m:t>0.0062</m:t>
+          <m:t>0.000615</m:t>
         </m:r>
         <m:sSup>
           <m:sSupPr>
@@ -7488,21 +7237,7 @@
                 <w:szCs w:val="22"/>
                 <w14:ligatures w14:val="none"/>
               </w:rPr>
-              <m:t>0.000</m:t>
-            </m:r>
-            <m:r>
-              <m:rPr>
-                <m:sty m:val="p"/>
-              </m:rPr>
-              <w:rPr>
-                <w:rFonts w:ascii="Cambria Math" w:eastAsia="Times New Roman" w:hAnsi="Cambria Math" w:cs="Times New Roman"/>
-                <w:color w:val="000000"/>
-                <w:kern w:val="0"/>
-                <w:sz w:val="22"/>
-                <w:szCs w:val="22"/>
-                <w14:ligatures w14:val="none"/>
-              </w:rPr>
-              <m:t>3</m:t>
+              <m:t>0.000029</m:t>
             </m:r>
             <m:r>
               <w:rPr>
@@ -7554,7 +7289,40 @@
           <w:szCs w:val="22"/>
           <w14:ligatures w14:val="none"/>
         </w:rPr>
-        <w:t>50.33</w:t>
+        <w:t>5</w:t>
+      </w:r>
+      <w:r>
+        <w:rPr>
+          <w:rFonts w:ascii="Aptos Narrow" w:eastAsia="Times New Roman" w:hAnsi="Aptos Narrow" w:cs="Times New Roman"/>
+          <w:color w:val="000000"/>
+          <w:kern w:val="0"/>
+          <w:sz w:val="22"/>
+          <w:szCs w:val="22"/>
+          <w14:ligatures w14:val="none"/>
+        </w:rPr>
+        <w:t>20</w:t>
+      </w:r>
+      <w:r>
+        <w:rPr>
+          <w:rFonts w:ascii="Aptos Narrow" w:eastAsia="Times New Roman" w:hAnsi="Aptos Narrow" w:cs="Times New Roman"/>
+          <w:color w:val="000000"/>
+          <w:kern w:val="0"/>
+          <w:sz w:val="22"/>
+          <w:szCs w:val="22"/>
+          <w14:ligatures w14:val="none"/>
+        </w:rPr>
+        <w:t>.</w:t>
+      </w:r>
+      <w:r>
+        <w:rPr>
+          <w:rFonts w:ascii="Aptos Narrow" w:eastAsia="Times New Roman" w:hAnsi="Aptos Narrow" w:cs="Times New Roman"/>
+          <w:color w:val="000000"/>
+          <w:kern w:val="0"/>
+          <w:sz w:val="22"/>
+          <w:szCs w:val="22"/>
+          <w14:ligatures w14:val="none"/>
+        </w:rPr>
+        <w:t>69</w:t>
       </w:r>
       <m:oMath>
         <m:f>
@@ -7728,14 +7496,12 @@
                 <m:sty m:val="p"/>
               </m:rPr>
               <w:rPr>
-                <w:rFonts w:ascii="Cambria Math" w:eastAsia="Times New Roman" w:hAnsi="Cambria Math" w:cs="Times New Roman"/>
-                <w:color w:val="000000"/>
-                <w:kern w:val="0"/>
-                <w:sz w:val="22"/>
-                <w:szCs w:val="22"/>
-                <w14:ligatures w14:val="none"/>
-              </w:rPr>
-              <m:t>0.00</m:t>
+                <w:rFonts w:ascii="Cambria Math" w:hAnsi="Cambria Math"/>
+                <w:color w:val="000000"/>
+                <w:sz w:val="22"/>
+                <w:szCs w:val="22"/>
+              </w:rPr>
+              <m:t>0.000078</m:t>
             </m:r>
             <m:r>
               <m:rPr>
@@ -7749,7 +7515,7 @@
                 <w:szCs w:val="22"/>
                 <w14:ligatures w14:val="none"/>
               </w:rPr>
-              <m:t xml:space="preserve">08 </m:t>
+              <m:t xml:space="preserve"> </m:t>
             </m:r>
             <m:sSup>
               <m:sSupPr>
@@ -7789,7 +7555,7 @@
           <w:rPr>
             <w:rFonts w:ascii="Cambria Math" w:eastAsiaTheme="minorEastAsia" w:hAnsi="Cambria Math" w:cs="Times New Roman"/>
           </w:rPr>
-          <m:t>50.25</m:t>
+          <m:t>515.38</m:t>
         </m:r>
         <m:f>
           <m:fPr>
@@ -7869,12 +7635,6 @@
           <w:rFonts w:ascii="Times New Roman" w:hAnsi="Times New Roman" w:cs="Times New Roman"/>
         </w:rPr>
         <w:br/>
-      </w:r>
-      <w:r>
-        <w:rPr>
-          <w:rFonts w:ascii="Times New Roman" w:hAnsi="Times New Roman" w:cs="Times New Roman"/>
-        </w:rPr>
-        <w:lastRenderedPageBreak/>
         <w:t>3.</w:t>
       </w:r>
       <w:r>
@@ -7964,16 +7724,16 @@
           </m:num>
           <m:den>
             <m:r>
-              <w:rPr>
-                <w:rFonts w:ascii="Cambria Math" w:hAnsi="Cambria Math" w:cs="Times New Roman"/>
-              </w:rPr>
-              <m:t>0.00</m:t>
-            </m:r>
-            <m:r>
-              <w:rPr>
-                <w:rFonts w:ascii="Cambria Math" w:hAnsi="Cambria Math" w:cs="Times New Roman"/>
-              </w:rPr>
-              <m:t>16</m:t>
+              <m:rPr>
+                <m:sty m:val="p"/>
+              </m:rPr>
+              <w:rPr>
+                <w:rFonts w:ascii="Cambria Math" w:hAnsi="Cambria Math"/>
+                <w:color w:val="000000"/>
+                <w:sz w:val="22"/>
+                <w:szCs w:val="22"/>
+              </w:rPr>
+              <m:t>0.000165</m:t>
             </m:r>
             <m:sSup>
               <m:sSupPr>
@@ -8020,7 +7780,7 @@
           <w:szCs w:val="22"/>
           <w14:ligatures w14:val="none"/>
         </w:rPr>
-        <w:t>65.56</w:t>
+        <w:t>635.76</w:t>
       </w:r>
       <m:oMath>
         <m:f>
@@ -8179,13 +7939,7 @@
               <w:rPr>
                 <w:rFonts w:ascii="Cambria Math" w:hAnsi="Cambria Math" w:cs="Times New Roman"/>
               </w:rPr>
-              <m:t>0.00</m:t>
-            </m:r>
-            <m:r>
-              <w:rPr>
-                <w:rFonts w:ascii="Cambria Math" w:hAnsi="Cambria Math" w:cs="Times New Roman"/>
-              </w:rPr>
-              <m:t>38</m:t>
+              <m:t>0.00038</m:t>
             </m:r>
             <m:sSup>
               <m:sSupPr>
@@ -8239,7 +7993,7 @@
             <w:szCs w:val="22"/>
             <w14:ligatures w14:val="none"/>
           </w:rPr>
-          <m:t>49.39</m:t>
+          <m:t>493.95</m:t>
         </m:r>
         <m:f>
           <m:fPr>
@@ -8394,16 +8148,18 @@
           </m:num>
           <m:den>
             <m:r>
-              <w:rPr>
-                <w:rFonts w:ascii="Cambria Math" w:hAnsi="Cambria Math" w:cs="Times New Roman"/>
-              </w:rPr>
-              <m:t>0.00</m:t>
-            </m:r>
-            <m:r>
-              <w:rPr>
-                <w:rFonts w:ascii="Cambria Math" w:hAnsi="Cambria Math" w:cs="Times New Roman"/>
-              </w:rPr>
-              <m:t>62</m:t>
+              <m:rPr>
+                <m:sty m:val="p"/>
+              </m:rPr>
+              <w:rPr>
+                <w:rFonts w:ascii="Cambria Math" w:eastAsia="Times New Roman" w:hAnsi="Cambria Math" w:cs="Times New Roman"/>
+                <w:color w:val="000000"/>
+                <w:kern w:val="0"/>
+                <w:sz w:val="22"/>
+                <w:szCs w:val="22"/>
+                <w14:ligatures w14:val="none"/>
+              </w:rPr>
+              <m:t>0.000615</m:t>
             </m:r>
             <m:sSup>
               <m:sSupPr>
@@ -8451,7 +8207,7 @@
             <w:szCs w:val="22"/>
             <w14:ligatures w14:val="none"/>
           </w:rPr>
-          <m:t>52.29</m:t>
+          <m:t>527.15</m:t>
         </m:r>
         <m:f>
           <m:fPr>
@@ -8554,7 +8310,7 @@
               <w:rPr>
                 <w:rFonts w:ascii="Cambria Math" w:hAnsi="Cambria Math" w:cs="Times New Roman"/>
               </w:rPr>
-              <m:t>50.33+50.25+65.56+49.39+52.29</m:t>
+              <m:t>520.69+515.38+635.76+493.95+527.15</m:t>
             </m:r>
           </m:num>
           <m:den>
@@ -8570,7 +8326,7 @@
           <w:rPr>
             <w:rFonts w:ascii="Cambria Math" w:hAnsi="Cambria Math" w:cs="Times New Roman"/>
           </w:rPr>
-          <m:t>=53.564 kg/</m:t>
+          <m:t>=538.586 kg/</m:t>
         </m:r>
         <m:sSup>
           <m:sSupPr>
@@ -8647,6 +8403,7 @@
         <w:rPr>
           <w:noProof/>
         </w:rPr>
+        <w:lastRenderedPageBreak/>
         <w:drawing>
           <wp:inline distT="0" distB="0" distL="0" distR="0" wp14:anchorId="54882EE6" wp14:editId="077C0B98">
             <wp:extent cx="4571573" cy="2683435"/>
@@ -8775,7 +8532,6 @@
         <w:rPr>
           <w:noProof/>
         </w:rPr>
-        <w:lastRenderedPageBreak/>
         <w:drawing>
           <wp:inline distT="0" distB="0" distL="0" distR="0" wp14:anchorId="6C842EB8" wp14:editId="26013BB6">
             <wp:extent cx="4588221" cy="2679167"/>
@@ -8907,7 +8663,7 @@
               <w:rPr>
                 <w:rFonts w:ascii="Cambria Math" w:hAnsi="Cambria Math" w:cs="Times New Roman"/>
               </w:rPr>
-              <m:t>3.1416×0.1777</m:t>
+              <m:t>3.1416×0.01777</m:t>
             </m:r>
           </m:den>
         </m:f>
@@ -8915,7 +8671,7 @@
           <w:rPr>
             <w:rFonts w:ascii="Cambria Math" w:hAnsi="Cambria Math" w:cs="Times New Roman"/>
           </w:rPr>
-          <m:t>≈51.42 kg/</m:t>
+          <m:t>≈514.256 kg/</m:t>
         </m:r>
         <m:sSup>
           <m:sSupPr>
@@ -8980,7 +8736,7 @@
       <w:tblGrid>
         <w:gridCol w:w="1475"/>
         <w:gridCol w:w="831"/>
-        <w:gridCol w:w="885"/>
+        <w:gridCol w:w="1063"/>
       </w:tblGrid>
       <w:tr>
         <w:trPr>
@@ -9025,6 +8781,7 @@
                 <w:szCs w:val="22"/>
                 <w14:ligatures w14:val="none"/>
               </w:rPr>
+              <w:lastRenderedPageBreak/>
               <w:t>Method</w:t>
             </w:r>
           </w:p>
@@ -9226,17 +8983,16 @@
                 <w14:ligatures w14:val="none"/>
               </w:rPr>
             </w:pPr>
-            <w:r>
-              <w:rPr>
-                <w:rFonts w:ascii="Aptos Narrow" w:eastAsia="Times New Roman" w:hAnsi="Aptos Narrow" w:cs="Times New Roman"/>
-                <w:color w:val="000000"/>
-                <w:kern w:val="0"/>
-                <w:sz w:val="22"/>
-                <w:szCs w:val="22"/>
-                <w14:ligatures w14:val="none"/>
-              </w:rPr>
-              <w:t>53.564</w:t>
-            </w:r>
+            <m:oMathPara>
+              <m:oMath>
+                <m:r>
+                  <w:rPr>
+                    <w:rFonts w:ascii="Cambria Math" w:hAnsi="Cambria Math" w:cs="Times New Roman"/>
+                  </w:rPr>
+                  <m:t>538.586</m:t>
+                </m:r>
+              </m:oMath>
+            </m:oMathPara>
           </w:p>
         </w:tc>
       </w:tr>
@@ -9351,17 +9107,16 @@
                 <w14:ligatures w14:val="none"/>
               </w:rPr>
             </w:pPr>
-            <w:r>
-              <w:rPr>
-                <w:rFonts w:ascii="Aptos Narrow" w:eastAsia="Times New Roman" w:hAnsi="Aptos Narrow" w:cs="Times New Roman"/>
-                <w:color w:val="000000"/>
-                <w:kern w:val="0"/>
-                <w:sz w:val="22"/>
-                <w:szCs w:val="22"/>
-                <w14:ligatures w14:val="none"/>
-              </w:rPr>
-              <w:t>51.42</w:t>
-            </w:r>
+            <m:oMathPara>
+              <m:oMath>
+                <m:r>
+                  <w:rPr>
+                    <w:rFonts w:ascii="Cambria Math" w:hAnsi="Cambria Math" w:cs="Times New Roman"/>
+                  </w:rPr>
+                  <m:t>514.256</m:t>
+                </m:r>
+              </m:oMath>
+            </m:oMathPara>
           </w:p>
         </w:tc>
       </w:tr>
@@ -9399,8 +9154,6 @@
         <w:spacing w:line="480" w:lineRule="auto"/>
         <w:rPr>
           <w:rFonts w:ascii="Times New Roman" w:hAnsi="Times New Roman" w:cs="Times New Roman"/>
-          <w:b/>
-          <w:bCs/>
         </w:rPr>
       </w:pPr>
       <w:r>
@@ -9408,8 +9161,15 @@
           <w:rFonts w:ascii="Times New Roman" w:hAnsi="Times New Roman" w:cs="Times New Roman"/>
           <w:b/>
           <w:bCs/>
-        </w:rPr>
-        <w:t>3.</w:t>
+          <w:u w:val="single"/>
+        </w:rPr>
+        <w:t>3</w:t>
+      </w:r>
+      <w:r>
+        <w:rPr>
+          <w:rFonts w:ascii="Times New Roman" w:hAnsi="Times New Roman" w:cs="Times New Roman"/>
+        </w:rPr>
+        <w:t xml:space="preserve"> One random error is the pi calculations, slight human errors in our measurements of the circumference and the diameter of the disk give us pi values that are slightly off from the real value of pi. One systematic error is the thickness, we used one disk’s thickness and based the others from it, giving us consistent errors in true thickness.</w:t>
       </w:r>
     </w:p>
     <w:p>
@@ -9417,8 +9177,6 @@
         <w:spacing w:line="480" w:lineRule="auto"/>
         <w:rPr>
           <w:rFonts w:ascii="Times New Roman" w:hAnsi="Times New Roman" w:cs="Times New Roman"/>
-          <w:b/>
-          <w:bCs/>
         </w:rPr>
       </w:pPr>
       <w:r>
@@ -9426,8 +9184,15 @@
           <w:rFonts w:ascii="Times New Roman" w:hAnsi="Times New Roman" w:cs="Times New Roman"/>
           <w:b/>
           <w:bCs/>
-        </w:rPr>
-        <w:t>4.</w:t>
+          <w:u w:val="single"/>
+        </w:rPr>
+        <w:t>4</w:t>
+      </w:r>
+      <w:r>
+        <w:rPr>
+          <w:rFonts w:ascii="Times New Roman" w:hAnsi="Times New Roman" w:cs="Times New Roman"/>
+        </w:rPr>
+        <w:t xml:space="preserve"> Our plots are linear because they follow a consistent increasing change in their circumference and diameter. The computed intercepts of 0.0127 for our circumference vs. diameter and 0.004 for our mass vs radius^2 tells us there is a slight systematic error in our measurements since the y-intercepts should be starting at (0,0). </w:t>
       </w:r>
     </w:p>
     <w:p>
@@ -9435,8 +9200,6 @@
         <w:spacing w:line="480" w:lineRule="auto"/>
         <w:rPr>
           <w:rFonts w:ascii="Times New Roman" w:hAnsi="Times New Roman" w:cs="Times New Roman"/>
-          <w:b/>
-          <w:bCs/>
         </w:rPr>
       </w:pPr>
       <w:r>
@@ -9444,8 +9207,82 @@
           <w:rFonts w:ascii="Times New Roman" w:hAnsi="Times New Roman" w:cs="Times New Roman"/>
           <w:b/>
           <w:bCs/>
-        </w:rPr>
-        <w:t>5.</w:t>
+          <w:u w:val="single"/>
+        </w:rPr>
+        <w:t xml:space="preserve">5 </w:t>
+      </w:r>
+      <w:r>
+        <w:rPr>
+          <w:rFonts w:ascii="Times New Roman" w:hAnsi="Times New Roman" w:cs="Times New Roman"/>
+        </w:rPr>
+        <w:t>Our pi values are close to the accepted value of 3.1416, off by 0.1 to 0.3. The Percent discrepancy of our pi values to the accepted value is approximately 0.026% off, and our percent difference is approximately 0.12%.</w:t>
+      </w:r>
+    </w:p>
+    <w:p>
+      <w:pPr>
+        <w:spacing w:after="0" w:line="480" w:lineRule="auto"/>
+        <w:rPr>
+          <w:rFonts w:ascii="Aptos Narrow" w:eastAsia="Times New Roman" w:hAnsi="Aptos Narrow" w:cs="Times New Roman"/>
+          <w:color w:val="000000"/>
+          <w:kern w:val="0"/>
+          <w:sz w:val="22"/>
+          <w:szCs w:val="22"/>
+          <w14:ligatures w14:val="none"/>
+        </w:rPr>
+      </w:pPr>
+      <w:r>
+        <w:rPr>
+          <w:rFonts w:ascii="Times New Roman" w:hAnsi="Times New Roman" w:cs="Times New Roman"/>
+          <w:b/>
+          <w:bCs/>
+          <w:u w:val="single"/>
+        </w:rPr>
+        <w:t>6</w:t>
+      </w:r>
+      <w:r>
+        <w:rPr>
+          <w:rFonts w:ascii="Times New Roman" w:hAnsi="Times New Roman" w:cs="Times New Roman"/>
+        </w:rPr>
+        <w:t xml:space="preserve"> For our pi values, we got a tabular value of 3.222 and a graphical value of 3.0892. Between these values our graphical pi is better because it is only off by 0.6, while the tabular value is off by 1.2. For our density values our tabular value is </w:t>
+      </w:r>
+      <m:oMath>
+        <m:r>
+          <w:rPr>
+            <w:rFonts w:ascii="Cambria Math" w:hAnsi="Cambria Math" w:cs="Times New Roman"/>
+          </w:rPr>
+          <m:t>538.586</m:t>
+        </m:r>
+      </m:oMath>
+      <w:r>
+        <w:rPr>
+          <w:rFonts w:ascii="Aptos Narrow" w:eastAsia="Times New Roman" w:hAnsi="Aptos Narrow" w:cs="Times New Roman"/>
+          <w:color w:val="000000"/>
+          <w:kern w:val="0"/>
+          <w:sz w:val="22"/>
+          <w:szCs w:val="22"/>
+          <w14:ligatures w14:val="none"/>
+        </w:rPr>
+        <w:t xml:space="preserve"> </w:t>
+      </w:r>
+      <w:r>
+        <w:rPr>
+          <w:rFonts w:ascii="Times New Roman" w:hAnsi="Times New Roman" w:cs="Times New Roman"/>
+        </w:rPr>
+        <w:t xml:space="preserve">kg/m^3 and our graphical value is </w:t>
+      </w:r>
+      <m:oMath>
+        <m:r>
+          <w:rPr>
+            <w:rFonts w:ascii="Cambria Math" w:hAnsi="Cambria Math" w:cs="Times New Roman"/>
+          </w:rPr>
+          <m:t xml:space="preserve">514.256 </m:t>
+        </m:r>
+      </m:oMath>
+      <w:r>
+        <w:rPr>
+          <w:rFonts w:ascii="Times New Roman" w:hAnsi="Times New Roman" w:cs="Times New Roman"/>
+        </w:rPr>
+        <w:t xml:space="preserve"> kg/m^3, we estimate that this wood is a type of Cypress wood which has a density of 510 kg/m^3, so our graphical value is better because it is more accurate to the accepted value of this type of wood. </w:t>
       </w:r>
     </w:p>
     <w:p>
@@ -9453,8 +9290,6 @@
         <w:spacing w:line="480" w:lineRule="auto"/>
         <w:rPr>
           <w:rFonts w:ascii="Times New Roman" w:hAnsi="Times New Roman" w:cs="Times New Roman"/>
-          <w:b/>
-          <w:bCs/>
         </w:rPr>
       </w:pPr>
       <w:r>
@@ -9462,8 +9297,16 @@
           <w:rFonts w:ascii="Times New Roman" w:hAnsi="Times New Roman" w:cs="Times New Roman"/>
           <w:b/>
           <w:bCs/>
-        </w:rPr>
-        <w:t>6.</w:t>
+          <w:u w:val="single"/>
+        </w:rPr>
+        <w:lastRenderedPageBreak/>
+        <w:t>7</w:t>
+      </w:r>
+      <w:r>
+        <w:rPr>
+          <w:rFonts w:ascii="Times New Roman" w:hAnsi="Times New Roman" w:cs="Times New Roman"/>
+        </w:rPr>
+        <w:t xml:space="preserve"> Our results on the larger disks are better than the smaller disks, our measurements of circumference and diameter gives us a more accurate value of pi to the expected value of pi. The smaller disks have smaller margins to measure than the larger disks, which makes our values of pi less accurate.</w:t>
       </w:r>
     </w:p>
     <w:p>
@@ -9471,8 +9314,6 @@
         <w:spacing w:line="480" w:lineRule="auto"/>
         <w:rPr>
           <w:rFonts w:ascii="Times New Roman" w:hAnsi="Times New Roman" w:cs="Times New Roman"/>
-          <w:b/>
-          <w:bCs/>
         </w:rPr>
       </w:pPr>
       <w:r>
@@ -9480,9 +9321,29 @@
           <w:rFonts w:ascii="Times New Roman" w:hAnsi="Times New Roman" w:cs="Times New Roman"/>
           <w:b/>
           <w:bCs/>
-        </w:rPr>
-        <w:lastRenderedPageBreak/>
-        <w:t>7.</w:t>
+          <w:u w:val="single"/>
+        </w:rPr>
+        <w:t>8</w:t>
+      </w:r>
+      <w:r>
+        <w:rPr>
+          <w:rFonts w:ascii="Times New Roman" w:hAnsi="Times New Roman" w:cs="Times New Roman"/>
+        </w:rPr>
+        <w:t xml:space="preserve"> From our density calculations, it is reasonable to believe that disks 1, 2, 4, and 5 are likely made out of the same material because the densities are only off by approximately 0.2 kg/m^3. </w:t>
+      </w:r>
+      <w:proofErr w:type="gramStart"/>
+      <w:r>
+        <w:rPr>
+          <w:rFonts w:ascii="Times New Roman" w:hAnsi="Times New Roman" w:cs="Times New Roman"/>
+        </w:rPr>
+        <w:t>However</w:t>
+      </w:r>
+      <w:proofErr w:type="gramEnd"/>
+      <w:r>
+        <w:rPr>
+          <w:rFonts w:ascii="Times New Roman" w:hAnsi="Times New Roman" w:cs="Times New Roman"/>
+        </w:rPr>
+        <w:t xml:space="preserve"> disk 3 has a difference in its density of approximately 15 kg/m^3 compared to the other disks, so from the density value alone disk 3 could be made out of a different material from the rest.</w:t>
       </w:r>
     </w:p>
     <w:p>
@@ -9490,26 +9351,6 @@
         <w:spacing w:line="480" w:lineRule="auto"/>
         <w:rPr>
           <w:rFonts w:ascii="Times New Roman" w:hAnsi="Times New Roman" w:cs="Times New Roman"/>
-          <w:b/>
-          <w:bCs/>
-        </w:rPr>
-      </w:pPr>
-      <w:r>
-        <w:rPr>
-          <w:rFonts w:ascii="Times New Roman" w:hAnsi="Times New Roman" w:cs="Times New Roman"/>
-          <w:b/>
-          <w:bCs/>
-        </w:rPr>
-        <w:t>8.</w:t>
-      </w:r>
-    </w:p>
-    <w:p>
-      <w:pPr>
-        <w:spacing w:line="480" w:lineRule="auto"/>
-        <w:rPr>
-          <w:rFonts w:ascii="Times New Roman" w:hAnsi="Times New Roman" w:cs="Times New Roman"/>
-          <w:b/>
-          <w:bCs/>
         </w:rPr>
       </w:pPr>
     </w:p>
@@ -9924,6 +9765,7 @@
   <w:style w:type="paragraph" w:default="1" w:styleId="Normal">
     <w:name w:val="Normal"/>
     <w:qFormat/>
+    <w:rsid w:val="00BE1A3B"/>
   </w:style>
   <w:style w:type="paragraph" w:styleId="Heading1">
     <w:name w:val="heading 1"/>

</xml_diff>